<commit_message>
finished creating the proper tables and got all the other type of crimes
</commit_message>
<xml_diff>
--- a/doc/written_part.docx
+++ b/doc/written_part.docx
@@ -3271,6 +3271,7 @@
       <w:pPr>
         <w:spacing w:line="360" w:lineRule="auto"/>
         <w:ind w:firstLine="720"/>
+        <w:jc w:val="both"/>
       </w:pPr>
       <w:r>
         <w:rPr>
@@ -3320,6 +3321,7 @@
     <w:p>
       <w:pPr>
         <w:spacing w:line="360" w:lineRule="auto"/>
+        <w:jc w:val="both"/>
       </w:pPr>
       <w:r>
         <w:t xml:space="preserve">Meanwhile, the results of this study employ </w:t>
@@ -3559,9 +3561,6 @@
       <w:pPr>
         <w:spacing w:line="360" w:lineRule="auto"/>
         <w:ind w:firstLine="720"/>
-        <w:rPr>
-          <w:lang w:val="en-US"/>
-        </w:rPr>
       </w:pPr>
       <w:r>
         <w:t xml:space="preserve">The period </w:t>
@@ -3578,11 +3577,51 @@
         </w:rPr>
         <w:t xml:space="preserve"> is adequate for the analysis as they englobe the years in which OXXO had its explosive expansion across Bogota</w:t>
       </w:r>
+      <w:r>
+        <w:rPr>
+          <w:lang w:val="en-US"/>
+        </w:rPr>
+        <w:t xml:space="preserve">. </w:t>
+      </w:r>
+      <w:r>
+        <w:t>This timeframe ensures sufficient temporal and spatial variability, meaing it allows for a higher proportion of UPZs to enter treatment</w:t>
+      </w:r>
+      <w:r>
+        <w:t xml:space="preserve"> </w:t>
+      </w:r>
+      <w:r>
+        <w:t>during the study period compared to those always treated (before 2018).</w:t>
+      </w:r>
+      <w:r>
+        <w:rPr>
+          <w:lang w:val="en-US"/>
+        </w:rPr>
+        <w:t xml:space="preserve"> </w:t>
+      </w:r>
+      <w:r>
+        <w:t xml:space="preserve">Prior to </w:t>
+      </w:r>
+      <w:r>
+        <w:t>2018</w:t>
+      </w:r>
+      <w:r>
+        <w:t xml:space="preserve">, the lack of new store openings </w:t>
+      </w:r>
+      <w:r>
+        <w:t xml:space="preserve">in other UPZ </w:t>
+      </w:r>
+      <w:r>
+        <w:t>would result in an insufficient number of newly treated units, limiting the identifying variation necessary for</w:t>
+      </w:r>
+      <w:r>
+        <w:t xml:space="preserve"> using TWFE.\\ </w:t>
+      </w:r>
     </w:p>
     <w:p>
       <w:pPr>
         <w:spacing w:line="360" w:lineRule="auto"/>
         <w:ind w:firstLine="720"/>
+        <w:jc w:val="both"/>
       </w:pPr>
       <w:r>
         <w:t xml:space="preserve">Additionally, from the </w:t>
@@ -3603,44 +3642,30 @@
         <w:t xml:space="preserve">system </w:t>
       </w:r>
       <w:r>
-        <w:t>in Colombia that contains all the records of companies and merchants registered by the chambers of commerce in the country, I identified the opening and closing year of each OXXO</w:t>
-      </w:r>
-      <w:r>
-        <w:t xml:space="preserve">. Additionally, with Google Maps API I obtained the precise georeferenced location of each store. Concerns may arise on how precise was this match of each store with its correct location, specially for the ones that no </w:t>
+        <w:t xml:space="preserve">in Colombia that contains all the records of companies and merchants registered by the chambers of commerce in the country, </w:t>
       </w:r>
       <w:r>
         <w:lastRenderedPageBreak/>
-        <w:t xml:space="preserve">lorgers exist. I manually checked the validity of each match with official OXXO publications, and as a result XX\% of establishments were properly matched.\\ </w:t>
+        <w:t>I identified the opening and closing year of each OXXO</w:t>
+      </w:r>
+      <w:r>
+        <w:t xml:space="preserve">. Additionally, with Google Maps API I obtained the precise georeferenced location of each store. Concerns may arise on how precise was this match of each store with its correct location, specially for the ones that no lorgers exist. I manually checked the validity of each match with official OXXO publications, and as a result XX\% of establishments were properly matched.\\ </w:t>
       </w:r>
     </w:p>
     <w:p>
       <w:pPr>
         <w:spacing w:line="360" w:lineRule="auto"/>
         <w:ind w:firstLine="720"/>
-      </w:pPr>
-      <w:r>
-        <w:rPr>
-          <w:highlight w:val="red"/>
-        </w:rPr>
+        <w:jc w:val="both"/>
+      </w:pPr>
+      <w:r>
         <w:t xml:space="preserve">I also did this same process with </w:t>
       </w:r>
       <w:r>
-        <w:rPr>
-          <w:highlight w:val="red"/>
-        </w:rPr>
         <w:t>D1, Justo\&amp;Bueno and ARA</w:t>
       </w:r>
       <w:r>
-        <w:rPr>
-          <w:highlight w:val="red"/>
-        </w:rPr>
-        <w:t xml:space="preserve"> hard discount chains. The reason why I also took into account these brands is </w:t>
-      </w:r>
-      <w:r>
-        <w:rPr>
-          <w:highlight w:val="red"/>
-        </w:rPr>
-        <w:t xml:space="preserve">because they </w:t>
+        <w:t xml:space="preserve"> hard discount chains. The reason why I also took into account these brands is because they </w:t>
       </w:r>
       <w:r>
         <w:t>often share similar spatial locations with OXXO outlets</w:t>
@@ -3649,13 +3674,13 @@
         <w:t xml:space="preserve">; in fact, </w:t>
       </w:r>
       <w:r>
-        <w:t>retailers tend to cluster in certain areas to take advantage of agglomeration benefits \parencite{Konishi2005, Seong2022}</w:t>
-      </w:r>
-      <w:r>
-        <w:t>.</w:t>
-      </w:r>
-      <w:r>
-        <w:t xml:space="preserve"> Knowing this and recalling that other investigations have shown that they may influence crime and commercial activity </w:t>
+        <w:t>retailers tend to cluster in certain areas to take advantage of agglomeration benefits \parencite{Konishi2005, Seong2022}.</w:t>
+      </w:r>
+      <w:r>
+        <w:t xml:space="preserve"> </w:t>
+      </w:r>
+      <w:r>
+        <w:t>Given that prior research suggests these establishments may influence both crime and commercial activity </w:t>
       </w:r>
       <w:r>
         <w:t>\parencite{</w:t>
@@ -3664,22 +3689,52 @@
         <w:t>delgado2024</w:t>
       </w:r>
       <w:r>
-        <w:t xml:space="preserve">, </w:t>
-      </w:r>
-      <w:r>
-        <w:t>jaramillo2021low</w:t>
-      </w:r>
-      <w:r>
-        <w:t>}</w:t>
-      </w:r>
-      <w:r>
-        <w:t xml:space="preserve">, is a sufficient reason for including them as possible controls. </w:t>
+        <w:t>, jaramillo2021low</w:t>
+      </w:r>
+      <w:r>
+        <w:rPr>
+          <w:lang w:val="en-US"/>
+        </w:rPr>
+        <w:t>},</w:t>
+      </w:r>
+      <w:r>
+        <w:rPr>
+          <w:b/>
+          <w:bCs/>
+          <w:color w:val="000000"/>
+        </w:rPr>
+        <w:t xml:space="preserve"> </w:t>
+      </w:r>
+      <w:r>
+        <w:t>their inclusion as control variables </w:t>
+      </w:r>
+      <w:r>
+        <w:t>is</w:t>
+      </w:r>
+      <w:r>
+        <w:t xml:space="preserve"> </w:t>
+      </w:r>
+      <w:r>
+        <w:t xml:space="preserve">important </w:t>
+      </w:r>
+      <w:r>
+        <w:t xml:space="preserve">to </w:t>
+      </w:r>
+      <w:r>
+        <w:t>evaluate</w:t>
+      </w:r>
+      <w:r>
+        <w:t xml:space="preserve"> the validity of the results</w:t>
+      </w:r>
+      <w:r>
+        <w:t>.\\</w:t>
       </w:r>
     </w:p>
     <w:p>
       <w:pPr>
         <w:spacing w:line="360" w:lineRule="auto"/>
         <w:ind w:firstLine="720"/>
+        <w:jc w:val="both"/>
       </w:pPr>
       <w:r>
         <w:t xml:space="preserve">\hl{Finally, I used the </w:t>
@@ -3769,55 +3824,6 @@
     <w:p>
       <w:pPr>
         <w:spacing w:line="360" w:lineRule="auto"/>
-        <w:ind w:firstLine="720"/>
-      </w:pPr>
-    </w:p>
-    <w:p>
-      <w:pPr>
-        <w:spacing w:line="360" w:lineRule="auto"/>
-        <w:ind w:firstLine="720"/>
-      </w:pPr>
-    </w:p>
-    <w:p>
-      <w:pPr>
-        <w:spacing w:line="360" w:lineRule="auto"/>
-        <w:ind w:firstLine="720"/>
-      </w:pPr>
-    </w:p>
-    <w:p>
-      <w:pPr>
-        <w:spacing w:line="360" w:lineRule="auto"/>
-        <w:ind w:firstLine="720"/>
-      </w:pPr>
-    </w:p>
-    <w:p>
-      <w:pPr>
-        <w:spacing w:line="360" w:lineRule="auto"/>
-        <w:ind w:firstLine="720"/>
-      </w:pPr>
-    </w:p>
-    <w:p>
-      <w:pPr>
-        <w:spacing w:line="360" w:lineRule="auto"/>
-        <w:ind w:firstLine="720"/>
-      </w:pPr>
-    </w:p>
-    <w:p>
-      <w:pPr>
-        <w:spacing w:line="360" w:lineRule="auto"/>
-        <w:ind w:firstLine="720"/>
-      </w:pPr>
-    </w:p>
-    <w:p>
-      <w:pPr>
-        <w:spacing w:line="360" w:lineRule="auto"/>
-        <w:ind w:firstLine="720"/>
-      </w:pPr>
-    </w:p>
-    <w:p>
-      <w:pPr>
-        <w:spacing w:line="360" w:lineRule="auto"/>
-        <w:ind w:firstLine="720"/>
       </w:pPr>
     </w:p>
     <w:p>
@@ -3842,6 +3848,7 @@
           <w:bCs/>
           <w:lang w:val="en-US"/>
         </w:rPr>
+        <w:lastRenderedPageBreak/>
         <w:t>STATISTICS  5 hours</w:t>
       </w:r>
     </w:p>
@@ -4078,6 +4085,515 @@
       </w:r>
     </w:p>
     <w:p/>
+    <w:p>
+      <w:pPr>
+        <w:rPr>
+          <w:b/>
+          <w:bCs/>
+        </w:rPr>
+      </w:pPr>
+    </w:p>
+    <w:p>
+      <w:pPr>
+        <w:rPr>
+          <w:b/>
+          <w:bCs/>
+        </w:rPr>
+      </w:pPr>
+    </w:p>
+    <w:p>
+      <w:pPr>
+        <w:rPr>
+          <w:b/>
+          <w:bCs/>
+        </w:rPr>
+      </w:pPr>
+    </w:p>
+    <w:p>
+      <w:pPr>
+        <w:rPr>
+          <w:b/>
+          <w:bCs/>
+        </w:rPr>
+      </w:pPr>
+    </w:p>
+    <w:p>
+      <w:pPr>
+        <w:rPr>
+          <w:b/>
+          <w:bCs/>
+        </w:rPr>
+      </w:pPr>
+    </w:p>
+    <w:p>
+      <w:pPr>
+        <w:rPr>
+          <w:b/>
+          <w:bCs/>
+        </w:rPr>
+      </w:pPr>
+    </w:p>
+    <w:p>
+      <w:pPr>
+        <w:rPr>
+          <w:b/>
+          <w:bCs/>
+        </w:rPr>
+      </w:pPr>
+    </w:p>
+    <w:p>
+      <w:pPr>
+        <w:rPr>
+          <w:b/>
+          <w:bCs/>
+        </w:rPr>
+      </w:pPr>
+    </w:p>
+    <w:p>
+      <w:pPr>
+        <w:rPr>
+          <w:b/>
+          <w:bCs/>
+        </w:rPr>
+      </w:pPr>
+    </w:p>
+    <w:p>
+      <w:pPr>
+        <w:rPr>
+          <w:b/>
+          <w:bCs/>
+        </w:rPr>
+      </w:pPr>
+    </w:p>
+    <w:p>
+      <w:pPr>
+        <w:rPr>
+          <w:b/>
+          <w:bCs/>
+        </w:rPr>
+      </w:pPr>
+    </w:p>
+    <w:p>
+      <w:pPr>
+        <w:rPr>
+          <w:b/>
+          <w:bCs/>
+        </w:rPr>
+      </w:pPr>
+    </w:p>
+    <w:p>
+      <w:pPr>
+        <w:rPr>
+          <w:b/>
+          <w:bCs/>
+        </w:rPr>
+      </w:pPr>
+    </w:p>
+    <w:p>
+      <w:pPr>
+        <w:rPr>
+          <w:b/>
+          <w:bCs/>
+        </w:rPr>
+      </w:pPr>
+    </w:p>
+    <w:p>
+      <w:pPr>
+        <w:rPr>
+          <w:b/>
+          <w:bCs/>
+        </w:rPr>
+      </w:pPr>
+    </w:p>
+    <w:p>
+      <w:pPr>
+        <w:rPr>
+          <w:b/>
+          <w:bCs/>
+        </w:rPr>
+      </w:pPr>
+    </w:p>
+    <w:p>
+      <w:pPr>
+        <w:rPr>
+          <w:b/>
+          <w:bCs/>
+        </w:rPr>
+      </w:pPr>
+    </w:p>
+    <w:p>
+      <w:pPr>
+        <w:rPr>
+          <w:b/>
+          <w:bCs/>
+        </w:rPr>
+      </w:pPr>
+    </w:p>
+    <w:p>
+      <w:pPr>
+        <w:rPr>
+          <w:b/>
+          <w:bCs/>
+        </w:rPr>
+      </w:pPr>
+    </w:p>
+    <w:p>
+      <w:pPr>
+        <w:rPr>
+          <w:b/>
+          <w:bCs/>
+        </w:rPr>
+      </w:pPr>
+    </w:p>
+    <w:p>
+      <w:pPr>
+        <w:rPr>
+          <w:b/>
+          <w:bCs/>
+        </w:rPr>
+      </w:pPr>
+    </w:p>
+    <w:p>
+      <w:pPr>
+        <w:rPr>
+          <w:b/>
+          <w:bCs/>
+        </w:rPr>
+      </w:pPr>
+    </w:p>
+    <w:p>
+      <w:pPr>
+        <w:rPr>
+          <w:b/>
+          <w:bCs/>
+        </w:rPr>
+      </w:pPr>
+    </w:p>
+    <w:p>
+      <w:pPr>
+        <w:rPr>
+          <w:b/>
+          <w:bCs/>
+        </w:rPr>
+      </w:pPr>
+    </w:p>
+    <w:p>
+      <w:pPr>
+        <w:rPr>
+          <w:b/>
+          <w:bCs/>
+        </w:rPr>
+      </w:pPr>
+    </w:p>
+    <w:p>
+      <w:pPr>
+        <w:rPr>
+          <w:b/>
+          <w:bCs/>
+        </w:rPr>
+      </w:pPr>
+    </w:p>
+    <w:p>
+      <w:pPr>
+        <w:rPr>
+          <w:b/>
+          <w:bCs/>
+        </w:rPr>
+      </w:pPr>
+      <w:r>
+        <w:rPr>
+          <w:b/>
+          <w:bCs/>
+        </w:rPr>
+        <w:lastRenderedPageBreak/>
+        <w:t>EMPIRICAL STRATEGY</w:t>
+      </w:r>
+    </w:p>
+    <w:p/>
+    <w:p>
+      <w:pPr>
+        <w:spacing w:line="360" w:lineRule="auto"/>
+      </w:pPr>
+      <w:r>
+        <w:t xml:space="preserve">This research the causal effect of the of OXXO </w:t>
+      </w:r>
+      <w:r>
+        <w:t xml:space="preserve">opening </w:t>
+      </w:r>
+      <w:r>
+        <w:t xml:space="preserve">on local crime activity </w:t>
+      </w:r>
+      <w:r>
+        <w:t xml:space="preserve">in </w:t>
+      </w:r>
+      <w:r>
+        <w:t xml:space="preserve">Bogotá </w:t>
+      </w:r>
+      <w:r>
+        <w:t>with two main econometric models.</w:t>
+      </w:r>
+      <w:r>
+        <w:t>\\</w:t>
+      </w:r>
+    </w:p>
+    <w:p>
+      <w:pPr>
+        <w:spacing w:line="360" w:lineRule="auto"/>
+      </w:pPr>
+    </w:p>
+    <w:p>
+      <w:pPr>
+        <w:spacing w:line="360" w:lineRule="auto"/>
+      </w:pPr>
+      <w:r>
+        <w:t>The first is OLS. This compares treated ZATs with control ones. Its estimation would be:\\</w:t>
+      </w:r>
+    </w:p>
+    <w:p>
+      <w:pPr>
+        <w:spacing w:line="360" w:lineRule="auto"/>
+      </w:pPr>
+    </w:p>
+    <w:p>
+      <w:pPr>
+        <w:spacing w:line="360" w:lineRule="auto"/>
+      </w:pPr>
+      <w:r>
+        <w:t>\begin{equation}</w:t>
+      </w:r>
+    </w:p>
+    <w:p>
+      <w:pPr>
+        <w:spacing w:line="360" w:lineRule="auto"/>
+      </w:pPr>
+      <w:r>
+        <w:t>Y_{i} = \alpha + \beta D_{i} + \varepsilon_{i}</w:t>
+      </w:r>
+    </w:p>
+    <w:p>
+      <w:pPr>
+        <w:spacing w:line="360" w:lineRule="auto"/>
+      </w:pPr>
+      <w:r>
+        <w:t>\label{eq:mco}</w:t>
+      </w:r>
+    </w:p>
+    <w:p>
+      <w:pPr>
+        <w:spacing w:line="360" w:lineRule="auto"/>
+      </w:pPr>
+      <w:r>
+        <w:t>\end{equation}\\</w:t>
+      </w:r>
+    </w:p>
+    <w:p>
+      <w:pPr>
+        <w:spacing w:line="360" w:lineRule="auto"/>
+      </w:pPr>
+    </w:p>
+    <w:p>
+      <w:pPr>
+        <w:spacing w:line="360" w:lineRule="auto"/>
+      </w:pPr>
+      <w:r>
+        <w:t>Where $Y_{i}$ is the proportion of workers and $D_{i}$ indicates if the $ZAT_i$ has or not OXXO. This model does not consider the fact that the arrival of these stores occurs in a staggered manner. Additionally, it assumes exogeneity of the treatment, but the location of OXXO is not random. Therefore, it not only ignores selection bias but also $\beta$ may be underestimated due to not accounting for temporal trends.\\</w:t>
+      </w:r>
+    </w:p>
+    <w:p>
+      <w:pPr>
+        <w:spacing w:line="360" w:lineRule="auto"/>
+      </w:pPr>
+    </w:p>
+    <w:p>
+      <w:pPr>
+        <w:spacing w:line="360" w:lineRule="auto"/>
+      </w:pPr>
+      <w:r>
+        <w:t>The first is TWFE will correct the bias by estimating:\\</w:t>
+      </w:r>
+    </w:p>
+    <w:p>
+      <w:pPr>
+        <w:spacing w:line="360" w:lineRule="auto"/>
+      </w:pPr>
+    </w:p>
+    <w:p>
+      <w:pPr>
+        <w:spacing w:line="360" w:lineRule="auto"/>
+      </w:pPr>
+      <w:r>
+        <w:t>\begin{equation}</w:t>
+      </w:r>
+    </w:p>
+    <w:p>
+      <w:pPr>
+        <w:spacing w:line="360" w:lineRule="auto"/>
+      </w:pPr>
+      <w:r>
+        <w:t>Y_{i,t} = \alpha_i + \alpha_t  +\beta^{twfe} D_{i,t} + \delta X_{i,t-1} + \mu M_{i,t}+\varepsilon_{i}</w:t>
+      </w:r>
+    </w:p>
+    <w:p>
+      <w:pPr>
+        <w:spacing w:line="360" w:lineRule="auto"/>
+      </w:pPr>
+      <w:r>
+        <w:t>\label{eq:twfe}</w:t>
+      </w:r>
+    </w:p>
+    <w:p>
+      <w:pPr>
+        <w:spacing w:line="360" w:lineRule="auto"/>
+      </w:pPr>
+      <w:r>
+        <w:t>\end{equation}\\</w:t>
+      </w:r>
+    </w:p>
+    <w:p>
+      <w:pPr>
+        <w:spacing w:line="360" w:lineRule="auto"/>
+      </w:pPr>
+    </w:p>
+    <w:p>
+      <w:pPr>
+        <w:spacing w:line="360" w:lineRule="auto"/>
+      </w:pPr>
+      <w:r>
+        <w:t>This regression considers the staggered treatment and controls for the differences by unit and time. Additionally, the baseline covariates $X_{i,t-1}$ and variables $ M_{i,t}$ correct the selection bias that persists due to characteristics that change over the course of the analysis.\\</w:t>
+      </w:r>
+    </w:p>
+    <w:p>
+      <w:pPr>
+        <w:spacing w:line="360" w:lineRule="auto"/>
+      </w:pPr>
+    </w:p>
+    <w:p>
+      <w:pPr>
+        <w:spacing w:line="360" w:lineRule="auto"/>
+      </w:pPr>
+      <w:r>
+        <w:lastRenderedPageBreak/>
+        <w:t>Assuming that the identification assumption of no heterogeneous effects holds, $\beta^{twfe}$ is the ATT. The estimator indicates the average difference in percentage points in the proportion of independent workers between ZATs that have OXXO and those that do not.\\</w:t>
+      </w:r>
+    </w:p>
+    <w:p>
+      <w:pPr>
+        <w:spacing w:line="360" w:lineRule="auto"/>
+      </w:pPr>
+    </w:p>
+    <w:p>
+      <w:pPr>
+        <w:spacing w:line="360" w:lineRule="auto"/>
+      </w:pPr>
+      <w:r>
+        <w:t>TWFE is complemented with an events study to evaluate the causal validity of $\beta^{twfe}$. Assuming that there is no anticipation to the treatment, its estimation:\\</w:t>
+      </w:r>
+    </w:p>
+    <w:p>
+      <w:pPr>
+        <w:spacing w:line="360" w:lineRule="auto"/>
+      </w:pPr>
+    </w:p>
+    <w:p>
+      <w:pPr>
+        <w:spacing w:line="360" w:lineRule="auto"/>
+      </w:pPr>
+      <w:r>
+        <w:t>\begin{equation}</w:t>
+      </w:r>
+    </w:p>
+    <w:p>
+      <w:pPr>
+        <w:spacing w:line="360" w:lineRule="auto"/>
+      </w:pPr>
+      <w:r>
+        <w:t xml:space="preserve">Y_{i,t} = \alpha_i + \alpha_t </w:t>
+      </w:r>
+    </w:p>
+    <w:p>
+      <w:pPr>
+        <w:spacing w:line="360" w:lineRule="auto"/>
+      </w:pPr>
+      <w:r>
+        <w:t xml:space="preserve">+ \sum_{k=-K}^{-2} \gamma^{lead}_k D^k_{i,t} </w:t>
+      </w:r>
+    </w:p>
+    <w:p>
+      <w:pPr>
+        <w:spacing w:line="360" w:lineRule="auto"/>
+      </w:pPr>
+      <w:r>
+        <w:t xml:space="preserve">+ \sum_{k=0}^{L} \gamma^{lag}_k D^k_{i,t} </w:t>
+      </w:r>
+    </w:p>
+    <w:p>
+      <w:pPr>
+        <w:spacing w:line="360" w:lineRule="auto"/>
+      </w:pPr>
+      <w:r>
+        <w:t>+ \varepsilon_{i,t}</w:t>
+      </w:r>
+    </w:p>
+    <w:p>
+      <w:pPr>
+        <w:spacing w:line="360" w:lineRule="auto"/>
+      </w:pPr>
+      <w:r>
+        <w:t>\label{eq:eventstudy}</w:t>
+      </w:r>
+    </w:p>
+    <w:p>
+      <w:pPr>
+        <w:spacing w:line="360" w:lineRule="auto"/>
+      </w:pPr>
+      <w:r>
+        <w:t>\end{equation}\\</w:t>
+      </w:r>
+    </w:p>
+    <w:p>
+      <w:pPr>
+        <w:spacing w:line="360" w:lineRule="auto"/>
+      </w:pPr>
+    </w:p>
+    <w:p>
+      <w:pPr>
+        <w:spacing w:line="360" w:lineRule="auto"/>
+      </w:pPr>
+      <w:r>
+        <w:t>allows to analyze the significance of the coeficients  $\gamma^{lead}_k$  and suggests the existence of parallel trends before the arrival of OXXO. Additionally, the coefficients $\gamma^{lag}_k$ reflect the dynamics of the impact after the treatment.\\</w:t>
+      </w:r>
+    </w:p>
+    <w:p>
+      <w:pPr>
+        <w:spacing w:line="360" w:lineRule="auto"/>
+      </w:pPr>
+    </w:p>
+    <w:p>
+      <w:pPr>
+        <w:spacing w:line="360" w:lineRule="auto"/>
+      </w:pPr>
+      <w:r>
+        <w:t xml:space="preserve">Finally, for robustness purposes, the Callaway \&amp; Sant’Anna (CS) model will be estimated. This allows for heterogeneity in treatment by estimating ATTs by cohort and combining the effects in a weighted manner \parencite{RiosAvila_Callaway_SantAnna_2021_csdid_slides,Callaway_SantAnna_2021}. Additionally, its event study does not evaluate parallel trends by averaging all treated units  \parencite{RiosAvila_Callaway_SantAnna_2021_csdid_slides,Callaway_SantAnna_2021}. </w:t>
+      </w:r>
+    </w:p>
+    <w:p>
+      <w:pPr>
+        <w:spacing w:line="360" w:lineRule="auto"/>
+      </w:pPr>
+      <w:r>
+        <w:t>Thus, if CS and TWFE have a similar behavior, this would reinforce the validity of TWFE's results and suggest the absence of bias.</w:t>
+      </w:r>
+    </w:p>
+    <w:p>
+      <w:pPr>
+        <w:spacing w:line="360" w:lineRule="auto"/>
+      </w:pPr>
+    </w:p>
+    <w:p>
+      <w:pPr>
+        <w:spacing w:line="360" w:lineRule="auto"/>
+      </w:pPr>
+    </w:p>
     <w:sectPr>
       <w:pgSz w:w="12240" w:h="15840"/>
       <w:pgMar w:top="1440" w:right="1440" w:bottom="1440" w:left="1440" w:header="708" w:footer="708" w:gutter="0"/>

</xml_diff>

<commit_message>
did all till robustness
</commit_message>
<xml_diff>
--- a/doc/written_part.docx
+++ b/doc/written_part.docx
@@ -467,37 +467,7 @@
         <w:rPr>
           <w:lang w:val="en-US"/>
         </w:rPr>
-        <w:t>in high-traffic area</w:t>
-      </w:r>
-      <w:r>
-        <w:rPr>
-          <w:lang w:val="en-US"/>
-        </w:rPr>
-        <w:t>s</w:t>
-      </w:r>
-      <w:r>
-        <w:rPr>
-          <w:lang w:val="en-US"/>
-        </w:rPr>
-        <w:t xml:space="preserve"> and commercial</w:t>
-      </w:r>
-      <w:r>
-        <w:rPr>
-          <w:lang w:val="en-US"/>
-        </w:rPr>
-        <w:t xml:space="preserve"> </w:t>
-      </w:r>
-      <w:r>
-        <w:rPr>
-          <w:lang w:val="en-US"/>
-        </w:rPr>
-        <w:t>corridors</w:t>
-      </w:r>
-      <w:r>
-        <w:rPr>
-          <w:lang w:val="en-US"/>
-        </w:rPr>
-        <w:t xml:space="preserve"> \</w:t>
+        <w:t>in high-traffic areas and commercial corridors \</w:t>
       </w:r>
       <w:proofErr w:type="spellStart"/>
       <w:r>
@@ -1035,10 +1005,7 @@
         <w:t>satisfy spontaneous consumption needs</w:t>
       </w:r>
       <w:r>
-        <w:t xml:space="preserve"> </w:t>
-      </w:r>
-      <w:r>
-        <w:t>\parencite{</w:t>
+        <w:t xml:space="preserve"> \parencite{</w:t>
       </w:r>
       <w:r>
         <w:t>LaRepublica2026</w:t>
@@ -1085,10 +1052,7 @@
         <w:t xml:space="preserve"> </w:t>
       </w:r>
       <w:r>
-        <w:t>, these being units that group neighborhoods based on socioeconomic stratification, land use, housing characteristics, and the living conditions of their inhabitants \parencite{alcaldia_bogota_upz}.</w:t>
-      </w:r>
-      <w:r>
-        <w:t xml:space="preserve"> Furthermore</w:t>
+        <w:t>, these being units that group neighborhoods based on socioeconomic stratification, land use, housing characteristics, and the living conditions of their inhabitants \parencite{alcaldia_bogota_upz}. Furthermore</w:t>
       </w:r>
       <w:r>
         <w:t>, it can be observed that OXXO presence has</w:t>
@@ -1147,10 +1111,7 @@
         <w:t xml:space="preserve">positively </w:t>
       </w:r>
       <w:r>
-        <w:t>correlates</w:t>
-      </w:r>
-      <w:r>
-        <w:t xml:space="preserve"> </w:t>
+        <w:t xml:space="preserve">correlates </w:t>
       </w:r>
       <w:r>
         <w:t>with the inherent characteristics of northeastern Bogotá, where high traffic, spatial accessibility, and high-income residential clusters provide an ideal environment for the convenience store model \hl{(citation)}. Figure~\ref{fig:oxxo_transmilenio_vias} illustrates th</w:t>
@@ -1441,10 +1402,7 @@
         <w:t xml:space="preserve">crime rates in </w:t>
       </w:r>
       <w:r>
-        <w:t xml:space="preserve">the city </w:t>
-      </w:r>
-      <w:r>
-        <w:t>\parencite{</w:t>
+        <w:t>the city \parencite{</w:t>
       </w:r>
       <w:r>
         <w:t>siedco_portal</w:t>
@@ -1864,7 +1822,7 @@
         <w:ind w:firstLine="720"/>
         <w:jc w:val="both"/>
         <w:rPr>
-          <w:lang w:val="es-ES_tradnl"/>
+          <w:lang w:val="en-US"/>
         </w:rPr>
       </w:pPr>
       <w:r>
@@ -3106,10 +3064,7 @@
         <w:t xml:space="preserve">Additionally, using data from the </w:t>
       </w:r>
       <w:r>
-        <w:t>Unified Business and Social Registry</w:t>
-      </w:r>
-      <w:r>
-        <w:t xml:space="preserve"> </w:t>
+        <w:t xml:space="preserve">Unified Business and Social Registry </w:t>
       </w:r>
       <w:r>
         <w:t>(RUES)\footnote{Access at \url{https://www.rues.org.co}}, Colombia’s central business registry, I identified the opening and closing years of each OXXO store.</w:t>
@@ -3239,548 +3194,541 @@
       <w:pPr>
         <w:spacing w:line="360" w:lineRule="auto"/>
         <w:jc w:val="both"/>
-      </w:pPr>
-    </w:p>
-    <w:p>
-      <w:pPr>
-        <w:spacing w:line="360" w:lineRule="auto"/>
-        <w:jc w:val="both"/>
         <w:rPr>
           <w:b/>
           <w:bCs/>
           <w:lang w:val="en-US"/>
         </w:rPr>
       </w:pPr>
-      <w:r>
+    </w:p>
+    <w:p>
+      <w:pPr>
+        <w:spacing w:line="360" w:lineRule="auto"/>
+        <w:jc w:val="both"/>
         <w:rPr>
           <w:b/>
           <w:bCs/>
           <w:lang w:val="en-US"/>
         </w:rPr>
-        <w:lastRenderedPageBreak/>
-        <w:br/>
-      </w:r>
-    </w:p>
-    <w:p>
-      <w:pPr>
-        <w:spacing w:line="360" w:lineRule="auto"/>
-        <w:jc w:val="both"/>
+      </w:pPr>
+      <w:r>
         <w:rPr>
           <w:b/>
           <w:bCs/>
           <w:lang w:val="en-US"/>
         </w:rPr>
-      </w:pPr>
-    </w:p>
-    <w:p>
-      <w:pPr>
-        <w:spacing w:line="360" w:lineRule="auto"/>
+        <w:lastRenderedPageBreak/>
+        <w:t xml:space="preserve">STATISTICS  </w:t>
+      </w:r>
+    </w:p>
+    <w:p>
+      <w:pPr>
+        <w:spacing w:line="360" w:lineRule="auto"/>
+        <w:jc w:val="both"/>
+      </w:pPr>
+      <w:r>
+        <w:rPr>
+          <w:kern w:val="2"/>
+          <w:lang w:val="en-US"/>
+        </w:rPr>
+        <w:t>First</w:t>
+      </w:r>
+      <w:r>
+        <w:rPr>
+          <w:kern w:val="2"/>
+          <w:lang w:val="en-US"/>
+        </w:rPr>
+        <w:t>, it is important to illustrate the preliminary differences between controlled and treated UPZs</w:t>
+      </w:r>
+      <w:r>
+        <w:rPr>
+          <w:kern w:val="2"/>
+          <w:lang w:val="en-US"/>
+        </w:rPr>
+        <w:t>,</w:t>
+      </w:r>
+      <w:r>
+        <w:rPr>
+          <w:kern w:val="2"/>
+          <w:lang w:val="en-US"/>
+        </w:rPr>
+        <w:t xml:space="preserve"> not only in terms of crime activity, but also </w:t>
+      </w:r>
+      <w:r>
+        <w:rPr>
+          <w:kern w:val="2"/>
+        </w:rPr>
+        <w:t>regarding socioeconomic and accessibility variables</w:t>
+      </w:r>
+      <w:r>
+        <w:rPr>
+          <w:kern w:val="2"/>
+          <w:lang w:val="en-US"/>
+        </w:rPr>
+        <w:t>. Table</w:t>
+      </w:r>
+      <w:r>
+        <w:t>~\ref{</w:t>
+      </w:r>
+      <w:proofErr w:type="gramStart"/>
+      <w:r>
+        <w:t>tab</w:t>
+      </w:r>
+      <w:r>
+        <w:t>:</w:t>
+      </w:r>
+      <w:r>
+        <w:t>treatment</w:t>
+      </w:r>
+      <w:proofErr w:type="gramEnd"/>
+      <w:r>
+        <w:t>_distribution_years</w:t>
+      </w:r>
+      <w:r>
+        <w:t>}</w:t>
+      </w:r>
+      <w:r>
+        <w:t xml:space="preserve"> presents the staggered arrival of OXXO stores across UPZs per year between 2015 to 2022. Although the panel was constructed quarterly, the arrival of locations do not variate drastically among quarters per year. This table shows that </w:t>
+      </w:r>
+      <w:r>
+        <w:rPr>
+          <w:kern w:val="2"/>
+        </w:rPr>
+        <w:t xml:space="preserve">there was an increase </w:t>
+      </w:r>
+      <w:r>
+        <w:rPr>
+          <w:kern w:val="2"/>
+        </w:rPr>
+        <w:t>in treated UPZs starting in 2019, while a substantial number of control units remain</w:t>
+      </w:r>
+      <w:r>
+        <w:rPr>
+          <w:kern w:val="2"/>
+        </w:rPr>
+        <w:t>ed</w:t>
+      </w:r>
+      <w:r>
+        <w:rPr>
+          <w:kern w:val="2"/>
+        </w:rPr>
+        <w:t xml:space="preserve"> available for comparison</w:t>
+      </w:r>
+      <w:r>
+        <w:rPr>
+          <w:kern w:val="2"/>
+        </w:rPr>
+        <w:t xml:space="preserve"> over the years</w:t>
+      </w:r>
+      <w:r>
+        <w:rPr>
+          <w:kern w:val="2"/>
+        </w:rPr>
+        <w:t>.</w:t>
+      </w:r>
+      <w:r>
+        <w:rPr>
+          <w:kern w:val="2"/>
+          <w:lang w:val="en-US"/>
+        </w:rPr>
+        <w:t>\\</w:t>
+      </w:r>
+    </w:p>
+    <w:p>
+      <w:pPr>
+        <w:spacing w:line="360" w:lineRule="auto"/>
+        <w:ind w:firstLine="720"/>
+        <w:jc w:val="both"/>
+      </w:pPr>
+      <w:r>
+        <w:t xml:space="preserve">This variation shown may not be as drastic as OXXO´s stores growth depicted in </w:t>
+      </w:r>
+      <w:r>
+        <w:t>figure</w:t>
+      </w:r>
+      <w:r>
+        <w:t>~\ref{</w:t>
+      </w:r>
+      <w:r>
+        <w:t>fig</w:t>
+      </w:r>
+      <w:r>
+        <w:t>:</w:t>
+      </w:r>
+      <w:r>
+        <w:t>EVOLUTION_OXXO</w:t>
+      </w:r>
+      <w:r>
+        <w:t>}</w:t>
+      </w:r>
+      <w:r>
+        <w:t>. This suggests that some UPZs host a disproportionately higher number of establishments in order to account for the overall increase in OXXO stores across Bogotá. Moreover, this raises the question of whether treatment intensity should be explicitly considered in the analysis.</w:t>
+      </w:r>
+      <w:r>
+        <w:t xml:space="preserve"> </w:t>
+      </w:r>
+      <w:r>
+        <w:t>Although Figure~\ref{fig:Treatment_intensity} does not provide a detailed spatial distribution of OXXO stores at the UPZ level over time, it illustrates the evolution of the average number of stores per cohort.</w:t>
+      </w:r>
+      <w:r>
+        <w:t xml:space="preserve"> </w:t>
+      </w:r>
+      <w:r>
+        <w:t>The figure shows that, in early periods, differences between cohorts were relatively small (less than one store on average), whereas in later periods these differences became more pronounced.</w:t>
+      </w:r>
+      <w:r>
+        <w:t xml:space="preserve"> </w:t>
+      </w:r>
+      <w:r>
+        <w:t>This pattern suggests that variation in treatment intensity may play a role in shaping the estimated relationship between OXXO presence and crime, and therefore warrants further evaluation</w:t>
+      </w:r>
+      <w:r>
+        <w:t>.\\</w:t>
+      </w:r>
+    </w:p>
+    <w:p>
+      <w:pPr>
+        <w:spacing w:line="360" w:lineRule="auto"/>
+        <w:ind w:firstLine="720"/>
+        <w:jc w:val="both"/>
+      </w:pPr>
+      <w:r>
+        <w:t>On the other hand, Figure~\ref{fig:</w:t>
+      </w:r>
+      <w:r>
+        <w:t>Treatment_intensity</w:t>
+      </w:r>
+      <w:r>
+        <w:t>}</w:t>
+      </w:r>
+      <w:r>
+        <w:t xml:space="preserve"> present</w:t>
+      </w:r>
+      <w:r>
+        <w:t>s</w:t>
+      </w:r>
+      <w:r>
+        <w:t xml:space="preserve"> preliminary evidence </w:t>
+      </w:r>
+      <w:r>
+        <w:t>the behavior of</w:t>
+      </w:r>
+      <w:r>
+        <w:t xml:space="preserve"> different types of crime rates </w:t>
+      </w:r>
+      <w:r>
+        <w:t>across</w:t>
+      </w:r>
+      <w:r>
+        <w:t xml:space="preserve"> the periods</w:t>
+      </w:r>
+      <w:r>
+        <w:t>.</w:t>
+      </w:r>
+      <w:r>
+        <w:t xml:space="preserve"> Specifically, they report the difference in mean crime rates between treated and not-yet-treated UPZs for each quarter, along with an indication of whether these differences are statistically significant at the 5</w:t>
+      </w:r>
+      <w:r>
+        <w:t>\</w:t>
+      </w:r>
+      <w:r>
+        <w:t>% level.</w:t>
+      </w:r>
+      <w:r>
+        <w:t xml:space="preserve"> </w:t>
+      </w:r>
+      <w:r>
+        <w:t>For instance, Panel~\ref{fig:diff_people} shows that, for personal theft, there was a statistically significant difference between groups during the quarters from 2015-Q1 to 2019-Q1. This indicates that, on average, treated UPZs exhibited higher crime rates than those not yet treated.</w:t>
+      </w:r>
+      <w:r>
+        <w:t>\\</w:t>
+      </w:r>
+    </w:p>
+    <w:p>
+      <w:pPr>
+        <w:spacing w:line="360" w:lineRule="auto"/>
+        <w:ind w:firstLine="720"/>
+        <w:jc w:val="both"/>
+      </w:pPr>
+      <w:commentRangeStart w:id="0"/>
+      <w:r>
+        <w:t>These results are consistent with expectations, as theft is the crime category most likely to be positively associated with the presence of OXXO stores. This finding aligns with the hypothesis that such establishments may function as crime attractors by increasing the flow of suitable targets. However, this pattern may also reflect the possibility that OXXO stores are disproportionately located in UPZs with inherently higher theft rates.</w:t>
+      </w:r>
+      <w:r>
+        <w:t xml:space="preserve"> Moreover, </w:t>
+      </w:r>
+      <w:r>
+        <w:t>t</w:t>
+      </w:r>
+      <w:r>
+        <w:t xml:space="preserve">he </w:t>
+      </w:r>
+      <w:r>
+        <w:t>graphs</w:t>
+      </w:r>
+      <w:r>
+        <w:t xml:space="preserve"> indicate that differences </w:t>
+      </w:r>
+      <w:r>
+        <w:lastRenderedPageBreak/>
+        <w:t xml:space="preserve">for other types of crime are not </w:t>
+      </w:r>
+      <w:r>
+        <w:t xml:space="preserve">generally </w:t>
+      </w:r>
+      <w:r>
+        <w:t xml:space="preserve">statistically significant. </w:t>
+      </w:r>
+      <w:r>
+        <w:t>This fits the pattern expected</w:t>
+      </w:r>
+      <w:r>
+        <w:t>,</w:t>
+      </w:r>
+      <w:r>
+        <w:t xml:space="preserve"> as crimes such as sexual violence or vehicle and motorcycle theft are less likely to be influenced by OXXO presence.</w:t>
+      </w:r>
+      <w:r>
+        <w:t xml:space="preserve"> </w:t>
+      </w:r>
+      <w:r>
+        <w:t xml:space="preserve">These </w:t>
+      </w:r>
+      <w:r>
+        <w:t>offenses</w:t>
+      </w:r>
+      <w:r>
+        <w:t xml:space="preserve"> often rely on different spatial and social dynamics, such as secluded areas or long-term parking patterns, which remain largely unaffected </w:t>
+      </w:r>
+      <w:r>
+        <w:t xml:space="preserve">by </w:t>
+      </w:r>
+      <w:r>
+        <w:t>convenience retail expansion</w:t>
+      </w:r>
+      <w:r>
+        <w:t xml:space="preserve">  \hl</w:t>
+      </w:r>
+      <w:r>
+        <w:rPr>
+          <w:lang w:val="en-US"/>
+        </w:rPr>
+        <w:t>{</w:t>
+      </w:r>
+      <w:proofErr w:type="spellStart"/>
+      <w:r>
+        <w:rPr>
+          <w:lang w:val="en-US"/>
+        </w:rPr>
+        <w:t>cita</w:t>
+      </w:r>
+      <w:proofErr w:type="spellEnd"/>
+      <w:r>
+        <w:rPr>
+          <w:lang w:val="en-US"/>
+        </w:rPr>
+        <w:t>}</w:t>
+      </w:r>
+      <w:r>
+        <w:t>.</w:t>
+      </w:r>
+      <w:r>
+        <w:t>\\</w:t>
+      </w:r>
+      <w:commentRangeEnd w:id="0"/>
+      <w:r>
+        <w:rPr>
+          <w:rStyle w:val="CommentReference"/>
+        </w:rPr>
+        <w:commentReference w:id="0"/>
+      </w:r>
+    </w:p>
+    <w:p>
+      <w:pPr>
+        <w:spacing w:line="360" w:lineRule="auto"/>
+        <w:ind w:firstLine="720"/>
+        <w:jc w:val="both"/>
+        <w:rPr>
+          <w:lang w:val="en-US"/>
+        </w:rPr>
+      </w:pPr>
+      <w:r>
+        <w:t>Table</w:t>
+      </w:r>
+      <w:r>
+        <w:t>~\ref{</w:t>
+      </w:r>
+      <w:r>
+        <w:t>tab</w:t>
+      </w:r>
+      <w:r>
+        <w:t>:</w:t>
+      </w:r>
+      <w:r>
+        <w:t>diferencias_medias_controles_fijos</w:t>
+      </w:r>
+      <w:r>
+        <w:t>}</w:t>
+      </w:r>
+      <w:r>
+        <w:t xml:space="preserve"> also shows preliminary differences between treated and never treated groups. </w:t>
+      </w:r>
+      <w:r>
+        <w:t xml:space="preserve">The variables chosen help to visualize that </w:t>
+      </w:r>
+      <w:r>
+        <w:t xml:space="preserve">OXXOs are located in areas where there is higher traffic, accessibility, </w:t>
+      </w:r>
+      <w:r>
+        <w:t>quality of life</w:t>
+      </w:r>
+      <w:r>
+        <w:t>,</w:t>
+      </w:r>
+      <w:r>
+        <w:t xml:space="preserve"> and </w:t>
+      </w:r>
+      <w:r>
+        <w:t>purchasing power</w:t>
+      </w:r>
+      <w:r>
+        <w:t xml:space="preserve">. </w:t>
+      </w:r>
+      <w:r>
+        <w:t>Moreover, these results indicate that potential market size may not be adequately captured by population measures alone</w:t>
+      </w:r>
+      <w:r>
+        <w:t xml:space="preserve"> (</w:t>
+      </w:r>
+      <w:r>
+        <w:t>such as total inhabitants or household size in 2007</w:t>
+      </w:r>
+      <w:r>
+        <w:t xml:space="preserve">), </w:t>
+      </w:r>
+      <w:r>
+        <w:t xml:space="preserve">but rather by indicators of economic activity and consumption capacity. </w:t>
+      </w:r>
+      <w:r>
+        <w:rPr>
+          <w:highlight w:val="yellow"/>
+        </w:rPr>
+        <w:t>Since OXXO's product mix consists primarily of non-essential daily goods and convenience items rather than vital necessities, th</w:t>
+      </w:r>
+      <w:r>
+        <w:rPr>
+          <w:highlight w:val="yellow"/>
+        </w:rPr>
+        <w:t>is retail chain</w:t>
+      </w:r>
+      <w:r>
+        <w:rPr>
+          <w:highlight w:val="yellow"/>
+        </w:rPr>
+        <w:t xml:space="preserve"> </w:t>
+      </w:r>
+      <w:r>
+        <w:rPr>
+          <w:highlight w:val="yellow"/>
+        </w:rPr>
+        <w:t>prioritizes locations with high-income transit rather than just high residential density.</w:t>
+      </w:r>
+      <w:r>
+        <w:t xml:space="preserve"> </w:t>
+      </w:r>
+      <w:r>
+        <w:t>Th</w:t>
+      </w:r>
+      <w:r>
+        <w:t>e</w:t>
+      </w:r>
+      <w:r>
+        <w:t>s</w:t>
+      </w:r>
+      <w:r>
+        <w:t>e</w:t>
+      </w:r>
+      <w:r>
+        <w:t xml:space="preserve"> </w:t>
+      </w:r>
+      <w:r>
+        <w:t>results are consistent</w:t>
+      </w:r>
+      <w:r>
+        <w:t xml:space="preserve"> with what was confirmed by \textcite{marcos2022}, where convenience store chains in Mexico were found to be distributed by similar characteristics.</w:t>
+      </w:r>
+      <w:r>
+        <w:rPr>
+          <w:lang w:val="en-US"/>
+        </w:rPr>
+        <w:t>\\</w:t>
+      </w:r>
+    </w:p>
+    <w:p>
+      <w:pPr>
+        <w:spacing w:line="360" w:lineRule="auto"/>
+        <w:ind w:firstLine="720"/>
+        <w:jc w:val="both"/>
+      </w:pPr>
+      <w:r>
+        <w:t xml:space="preserve">I also evaluated whether there was indeed a tendency for hard discount stores, such as D1, Ara, and Justo </w:t>
+      </w:r>
+      <w:r>
+        <w:t>\</w:t>
+      </w:r>
+      <w:r>
+        <w:t>&amp; Bueno, to locate near OXXO establishments. In Appendix~\ref{sec:controles_cadenas_descuento}, I show some of the results, and in general find that for all years these hard discount stores were significantly more prone to locate in UPZs treated with OXXO than in those without. With this evidence, I will include these chains as regressors mainly due to their probable influence on the dependent variables, as shown by \cite{jaramillo2021low} in their investigation.</w:t>
+      </w:r>
+      <w:r>
+        <w:t xml:space="preserve"> </w:t>
+      </w:r>
+      <w:r>
+        <w:t>However, I considered them in the regression as baseline covariates, meaning that I only took into account their presence in the UPZ in the quarter before the analysis to avoid confounding effects.</w:t>
+      </w:r>
+      <w:r>
+        <w:t>\\</w:t>
+      </w:r>
+    </w:p>
+    <w:p>
+      <w:pPr>
+        <w:spacing w:line="360" w:lineRule="auto"/>
+        <w:ind w:firstLine="720"/>
+        <w:jc w:val="both"/>
+      </w:pPr>
+      <w:r>
+        <w:t>Although I considered hard discount chains as factors that may bias the estimation, other unobserved variables could also affect the results.</w:t>
+      </w:r>
+      <w:r>
+        <w:t xml:space="preserve"> For instance, public works can reduce pedestrian and vehicular traffic for certain periods within the analysis; a new park may attract different demographic flows; and the presence of other commercial establishments, such as bars, nightclubs, or grocery stores, may impact the estimation of the causal effect, especially if they open or close during the period of study. Nonetheless, some of these variables may remain constant from 2015 to 2022. Furthermore, other establishments may be controlled for by unit fixed effects, as they tend </w:t>
+      </w:r>
+      <w:r>
+        <w:lastRenderedPageBreak/>
+        <w:t xml:space="preserve">to be located in areas that maintain their core characteristics; for example, nightclubs often open in </w:t>
+      </w:r>
+      <w:r>
+        <w:t>places</w:t>
+      </w:r>
+      <w:r>
+        <w:t xml:space="preserve"> already recognized as nightlife districts.</w:t>
+      </w:r>
+    </w:p>
+    <w:p>
+      <w:pPr>
         <w:jc w:val="both"/>
         <w:rPr>
           <w:b/>
           <w:bCs/>
-          <w:lang w:val="en-US"/>
-        </w:rPr>
-      </w:pPr>
-      <w:r>
+        </w:rPr>
+      </w:pPr>
+    </w:p>
+    <w:p>
+      <w:pPr>
+        <w:jc w:val="both"/>
         <w:rPr>
           <w:b/>
           <w:bCs/>
-          <w:lang w:val="en-US"/>
-        </w:rPr>
-        <w:t xml:space="preserve">STATISTICS  </w:t>
-      </w:r>
-    </w:p>
-    <w:p>
-      <w:pPr>
-        <w:spacing w:line="360" w:lineRule="auto"/>
-        <w:jc w:val="both"/>
-      </w:pPr>
-      <w:r>
-        <w:rPr>
-          <w:kern w:val="2"/>
-          <w:lang w:val="en-US"/>
-        </w:rPr>
-        <w:t>First</w:t>
-      </w:r>
-      <w:r>
-        <w:rPr>
-          <w:kern w:val="2"/>
-          <w:lang w:val="en-US"/>
-        </w:rPr>
-        <w:t>, it is important to illustrate the preliminary differences between controlled and treated UPZs</w:t>
-      </w:r>
-      <w:r>
-        <w:rPr>
-          <w:kern w:val="2"/>
-          <w:lang w:val="en-US"/>
-        </w:rPr>
-        <w:t>,</w:t>
-      </w:r>
-      <w:r>
-        <w:rPr>
-          <w:kern w:val="2"/>
-          <w:lang w:val="en-US"/>
-        </w:rPr>
-        <w:t xml:space="preserve"> not only in terms of crime activity, but also </w:t>
-      </w:r>
-      <w:r>
-        <w:rPr>
-          <w:kern w:val="2"/>
-        </w:rPr>
-        <w:t>regarding socioeconomic and accessibility variables</w:t>
-      </w:r>
-      <w:r>
-        <w:rPr>
-          <w:kern w:val="2"/>
-          <w:lang w:val="en-US"/>
-        </w:rPr>
-        <w:t>. Table</w:t>
-      </w:r>
-      <w:r>
-        <w:t>~\ref{</w:t>
-      </w:r>
-      <w:proofErr w:type="gramStart"/>
-      <w:r>
-        <w:t>tab</w:t>
-      </w:r>
-      <w:r>
-        <w:t>:</w:t>
-      </w:r>
-      <w:r>
-        <w:t>treatment</w:t>
-      </w:r>
-      <w:proofErr w:type="gramEnd"/>
-      <w:r>
-        <w:t>_distribution_years</w:t>
-      </w:r>
-      <w:r>
-        <w:t>}</w:t>
-      </w:r>
-      <w:r>
-        <w:t xml:space="preserve"> presents the staggered arrival of OXXO stores across UPZs per year between 2015 to 2022. Although the panel was constructed quarterly, the arrival of locations do not variate drastically among quarters per year. This table shows that </w:t>
-      </w:r>
-      <w:r>
-        <w:rPr>
-          <w:kern w:val="2"/>
-        </w:rPr>
-        <w:t xml:space="preserve">there was an increase </w:t>
-      </w:r>
-      <w:r>
-        <w:rPr>
-          <w:kern w:val="2"/>
-        </w:rPr>
-        <w:t>in treated UPZs starting in 2019, while a substantial number of control units remain</w:t>
-      </w:r>
-      <w:r>
-        <w:rPr>
-          <w:kern w:val="2"/>
-        </w:rPr>
-        <w:t>ed</w:t>
-      </w:r>
-      <w:r>
-        <w:rPr>
-          <w:kern w:val="2"/>
-        </w:rPr>
-        <w:t xml:space="preserve"> available for comparison</w:t>
-      </w:r>
-      <w:r>
-        <w:rPr>
-          <w:kern w:val="2"/>
-        </w:rPr>
-        <w:t xml:space="preserve"> over the years</w:t>
-      </w:r>
-      <w:r>
-        <w:rPr>
-          <w:kern w:val="2"/>
-        </w:rPr>
-        <w:t>.</w:t>
-      </w:r>
-      <w:r>
-        <w:rPr>
-          <w:kern w:val="2"/>
-          <w:lang w:val="en-US"/>
-        </w:rPr>
-        <w:t>\\</w:t>
-      </w:r>
-    </w:p>
-    <w:p>
-      <w:pPr>
-        <w:spacing w:line="360" w:lineRule="auto"/>
-        <w:ind w:firstLine="720"/>
-        <w:jc w:val="both"/>
-      </w:pPr>
-      <w:r>
-        <w:t xml:space="preserve">This variation shown may not be as drastic as OXXO´s stores growth depicted in </w:t>
-      </w:r>
-      <w:r>
-        <w:t>figure</w:t>
-      </w:r>
-      <w:r>
-        <w:t>~\ref{</w:t>
-      </w:r>
-      <w:r>
-        <w:t>fig</w:t>
-      </w:r>
-      <w:r>
-        <w:t>:</w:t>
-      </w:r>
-      <w:r>
-        <w:t>EVOLUTION_OXXO</w:t>
-      </w:r>
-      <w:r>
-        <w:t>}</w:t>
-      </w:r>
-      <w:r>
-        <w:t>. This suggests that some UPZs host a disproportionately higher number of establishments in order to account for the overall increase in OXXO stores across Bogotá. Moreover, this raises the question of whether treatment intensity should be explicitly considered in the analysis.</w:t>
-      </w:r>
-      <w:r>
-        <w:t xml:space="preserve"> </w:t>
-      </w:r>
-      <w:r>
-        <w:t>Although Figure~\ref{fig:Treatment_intensity} does not provide a detailed spatial distribution of OXXO stores at the UPZ level over time, it illustrates the evolution of the average number of stores per cohort.</w:t>
-      </w:r>
-      <w:r>
-        <w:t xml:space="preserve"> </w:t>
-      </w:r>
-      <w:r>
-        <w:t>The figure shows that, in early periods, differences between cohorts were relatively small (less than one store on average), whereas in later periods these differences became more pronounced.</w:t>
-      </w:r>
-      <w:r>
-        <w:t xml:space="preserve"> </w:t>
-      </w:r>
-      <w:r>
-        <w:t>This pattern suggests that variation in treatment intensity may play a role in shaping the estimated relationship between OXXO presence and crime, and therefore warrants further evaluation</w:t>
-      </w:r>
-      <w:r>
-        <w:t>.\\</w:t>
-      </w:r>
-    </w:p>
-    <w:p>
-      <w:pPr>
-        <w:spacing w:line="360" w:lineRule="auto"/>
-        <w:ind w:firstLine="720"/>
-        <w:jc w:val="both"/>
-      </w:pPr>
-      <w:r>
-        <w:t>On the other hand, Figure~\ref{fig:</w:t>
-      </w:r>
-      <w:r>
-        <w:t>Treatment_intensity</w:t>
-      </w:r>
-      <w:r>
-        <w:t>}</w:t>
-      </w:r>
-      <w:r>
-        <w:t xml:space="preserve"> present</w:t>
-      </w:r>
-      <w:r>
-        <w:t>s</w:t>
-      </w:r>
-      <w:r>
-        <w:t xml:space="preserve"> preliminary evidence </w:t>
-      </w:r>
-      <w:r>
-        <w:t>the behavior of</w:t>
-      </w:r>
-      <w:r>
-        <w:t xml:space="preserve"> different types of crime rates </w:t>
-      </w:r>
-      <w:r>
-        <w:t>across</w:t>
-      </w:r>
-      <w:r>
-        <w:t xml:space="preserve"> the periods</w:t>
-      </w:r>
-      <w:r>
-        <w:t>.</w:t>
-      </w:r>
-      <w:r>
-        <w:t xml:space="preserve"> Specifically, they report the difference in mean crime rates between treated and not-yet-treated UPZs for each quarter, along with an indication of whether these differences are statistically significant at the 5</w:t>
-      </w:r>
-      <w:r>
-        <w:t>\</w:t>
-      </w:r>
-      <w:r>
-        <w:t>% level.</w:t>
-      </w:r>
-      <w:r>
-        <w:t xml:space="preserve"> </w:t>
-      </w:r>
-      <w:r>
-        <w:t>For instance, Panel~\ref{fig:diff_people} shows that, for personal theft, there was a statistically significant difference between groups during the quarters from 2015-Q1 to 2019-Q1. This indicates that, on average, treated UPZs exhibited higher crime rates than those not yet treated.</w:t>
-      </w:r>
-      <w:r>
-        <w:t>\\</w:t>
-      </w:r>
-    </w:p>
-    <w:p>
-      <w:pPr>
-        <w:spacing w:line="360" w:lineRule="auto"/>
-        <w:ind w:firstLine="720"/>
-        <w:jc w:val="both"/>
-      </w:pPr>
-      <w:commentRangeStart w:id="0"/>
-      <w:r>
-        <w:t xml:space="preserve">These results are consistent with expectations, as theft is the crime category most likely to be positively associated with the presence of OXXO stores. This finding aligns with the hypothesis </w:t>
-      </w:r>
-      <w:r>
-        <w:lastRenderedPageBreak/>
-        <w:t>that such establishments may function as crime attractors by increasing the flow of suitable targets. However, this pattern may also reflect the possibility that OXXO stores are disproportionately located in UPZs with inherently higher theft rates.</w:t>
-      </w:r>
-      <w:r>
-        <w:t xml:space="preserve"> Moreover, </w:t>
-      </w:r>
-      <w:r>
-        <w:t>t</w:t>
-      </w:r>
-      <w:r>
-        <w:t xml:space="preserve">he </w:t>
-      </w:r>
-      <w:r>
-        <w:t>graphs</w:t>
-      </w:r>
-      <w:r>
-        <w:t xml:space="preserve"> indicate that differences for other types of crime are not </w:t>
-      </w:r>
-      <w:r>
-        <w:t xml:space="preserve">generally </w:t>
-      </w:r>
-      <w:r>
-        <w:t xml:space="preserve">statistically significant. </w:t>
-      </w:r>
-      <w:r>
-        <w:t>This fits the pattern expected</w:t>
-      </w:r>
-      <w:r>
-        <w:t>,</w:t>
-      </w:r>
-      <w:r>
-        <w:t xml:space="preserve"> as crimes such as sexual violence or vehicle and motorcycle theft are less likely to be influenced by OXXO presence.</w:t>
-      </w:r>
-      <w:r>
-        <w:t xml:space="preserve"> </w:t>
-      </w:r>
-      <w:r>
-        <w:t xml:space="preserve">These </w:t>
-      </w:r>
-      <w:r>
-        <w:t>offenses</w:t>
-      </w:r>
-      <w:r>
-        <w:t xml:space="preserve"> often rely on different spatial and social dynamics, such as secluded areas or long-term parking patterns, which remain largely unaffected </w:t>
-      </w:r>
-      <w:r>
-        <w:t xml:space="preserve">by </w:t>
-      </w:r>
-      <w:r>
-        <w:t>convenience retail expansion</w:t>
-      </w:r>
-      <w:r>
-        <w:t xml:space="preserve">  \hl</w:t>
-      </w:r>
-      <w:r>
-        <w:rPr>
-          <w:lang w:val="en-US"/>
-        </w:rPr>
-        <w:t>{</w:t>
-      </w:r>
-      <w:proofErr w:type="spellStart"/>
-      <w:r>
-        <w:rPr>
-          <w:lang w:val="en-US"/>
-        </w:rPr>
-        <w:t>cita</w:t>
-      </w:r>
-      <w:proofErr w:type="spellEnd"/>
-      <w:r>
-        <w:rPr>
-          <w:lang w:val="en-US"/>
-        </w:rPr>
-        <w:t>}</w:t>
-      </w:r>
-      <w:r>
-        <w:t>.</w:t>
-      </w:r>
-      <w:r>
-        <w:t>\\</w:t>
-      </w:r>
-      <w:commentRangeEnd w:id="0"/>
-      <w:r>
-        <w:rPr>
-          <w:rStyle w:val="CommentReference"/>
-        </w:rPr>
-        <w:commentReference w:id="0"/>
-      </w:r>
-    </w:p>
-    <w:p>
-      <w:pPr>
-        <w:spacing w:line="360" w:lineRule="auto"/>
-        <w:ind w:firstLine="720"/>
-        <w:jc w:val="both"/>
-        <w:rPr>
-          <w:lang w:val="en-US"/>
-        </w:rPr>
-      </w:pPr>
-      <w:r>
-        <w:t>Table</w:t>
-      </w:r>
-      <w:r>
-        <w:t>~\ref{</w:t>
-      </w:r>
-      <w:r>
-        <w:t>tab</w:t>
-      </w:r>
-      <w:r>
-        <w:t>:</w:t>
-      </w:r>
-      <w:r>
-        <w:t>diferencias_medias_controles_fijos</w:t>
-      </w:r>
-      <w:r>
-        <w:t>}</w:t>
-      </w:r>
-      <w:r>
-        <w:t xml:space="preserve"> also shows preliminary differences between treated and never treated groups with fixed baseline controls. </w:t>
-      </w:r>
-      <w:r>
-        <w:t xml:space="preserve">The variables chosen help to visualize that </w:t>
-      </w:r>
-      <w:r>
-        <w:t xml:space="preserve">OXXOs are located in areas where there is higher traffic, accessibility, </w:t>
-      </w:r>
-      <w:r>
-        <w:t>quality of life</w:t>
-      </w:r>
-      <w:r>
-        <w:t>,</w:t>
-      </w:r>
-      <w:r>
-        <w:t xml:space="preserve"> and </w:t>
-      </w:r>
-      <w:r>
-        <w:t>purchasing power</w:t>
-      </w:r>
-      <w:r>
-        <w:t xml:space="preserve">. </w:t>
-      </w:r>
-      <w:r>
-        <w:t>Moreover, these results indicate that potential market size may not be adequately captured by population measures alone</w:t>
-      </w:r>
-      <w:r>
-        <w:t xml:space="preserve"> (</w:t>
-      </w:r>
-      <w:r>
-        <w:t>such as total inhabitants or household size in 2007</w:t>
-      </w:r>
-      <w:r>
-        <w:t xml:space="preserve">), </w:t>
-      </w:r>
-      <w:r>
-        <w:t xml:space="preserve">but rather by indicators of economic activity and consumption capacity. </w:t>
-      </w:r>
-      <w:r>
-        <w:rPr>
-          <w:highlight w:val="yellow"/>
-        </w:rPr>
-        <w:t>Since OXXO's product mix consists primarily of non-essential daily goods and convenience items rather than vital necessities, th</w:t>
-      </w:r>
-      <w:r>
-        <w:rPr>
-          <w:highlight w:val="yellow"/>
-        </w:rPr>
-        <w:t>is retail chain</w:t>
-      </w:r>
-      <w:r>
-        <w:rPr>
-          <w:highlight w:val="yellow"/>
-        </w:rPr>
-        <w:t xml:space="preserve"> </w:t>
-      </w:r>
-      <w:r>
-        <w:rPr>
-          <w:highlight w:val="yellow"/>
-        </w:rPr>
-        <w:t>prioritizes locations with high-income transit rather than just high residential density.</w:t>
-      </w:r>
-      <w:r>
-        <w:t xml:space="preserve"> </w:t>
-      </w:r>
-      <w:r>
-        <w:t>Th</w:t>
-      </w:r>
-      <w:r>
-        <w:t>e</w:t>
-      </w:r>
-      <w:r>
-        <w:t>s</w:t>
-      </w:r>
-      <w:r>
-        <w:t>e</w:t>
-      </w:r>
-      <w:r>
-        <w:t xml:space="preserve"> </w:t>
-      </w:r>
-      <w:r>
-        <w:t>results are consistent</w:t>
-      </w:r>
-      <w:r>
-        <w:t xml:space="preserve"> with what was confirmed by \textcite{marcos2022}, where convenience store chains in Mexico were found to be distributed by similar characteristics.</w:t>
-      </w:r>
-      <w:r>
-        <w:rPr>
-          <w:lang w:val="en-US"/>
-        </w:rPr>
-        <w:t>\\</w:t>
-      </w:r>
-    </w:p>
-    <w:p>
-      <w:pPr>
-        <w:spacing w:line="360" w:lineRule="auto"/>
-        <w:ind w:firstLine="720"/>
-        <w:jc w:val="both"/>
-      </w:pPr>
-      <w:r>
-        <w:t xml:space="preserve">I also evaluated whether there was indeed a tendency for hard discount stores, such as D1, Ara, and Justo </w:t>
-      </w:r>
-      <w:r>
-        <w:t>\</w:t>
-      </w:r>
-      <w:r>
-        <w:t>&amp; Bueno, to locate near OXXO establishments. In Appendix~\ref{sec:controles_cadenas_descuento}, I show some of the results, and in general find that for all years these hard discount stores were significantly more prone to locate in UPZs treated with OXXO than in those without. With this evidence, I will include these chains as regressors mainly due to their probable influence on the dependent variables, as shown by \cite{jaramillo2021low} in their investigation.</w:t>
-      </w:r>
-      <w:r>
-        <w:t xml:space="preserve"> </w:t>
-      </w:r>
-      <w:r>
-        <w:t>However, I considered them in the regression as baseline covariates, meaning that I only took into account their presence in the UPZ in the quarter before the analysis to avoid confounding effects.</w:t>
-      </w:r>
-      <w:r>
-        <w:t>\\</w:t>
-      </w:r>
-    </w:p>
-    <w:p>
-      <w:pPr>
-        <w:spacing w:line="360" w:lineRule="auto"/>
-        <w:ind w:firstLine="720"/>
-        <w:jc w:val="both"/>
-      </w:pPr>
-      <w:r>
-        <w:t>Although I considered hard discount chains as factors that may bias the estimation, other unobserved variables could also affect the results.</w:t>
-      </w:r>
-      <w:r>
-        <w:t xml:space="preserve"> For instance, public works can reduce pedestrian and vehicular traffic for certain periods within the analysis; a new park may attract different </w:t>
-      </w:r>
-      <w:r>
-        <w:lastRenderedPageBreak/>
-        <w:t xml:space="preserve">demographic flows; and the presence of other commercial establishments, such as bars, nightclubs, or grocery stores, may impact the estimation of the causal effect, especially if they open or close during the period of study. Nonetheless, some of these variables may remain constant from 2015 to 2022. Furthermore, other establishments may be controlled for by unit fixed effects, as they tend to be located in areas that maintain their core characteristics; for example, nightclubs often open in </w:t>
-      </w:r>
-      <w:r>
-        <w:t>places</w:t>
-      </w:r>
-      <w:r>
-        <w:t xml:space="preserve"> already recognized as nightlife districts.</w:t>
-      </w:r>
+        </w:rPr>
+      </w:pPr>
     </w:p>
     <w:p>
       <w:pPr>
@@ -3869,6 +3817,7 @@
         <w:rPr>
           <w:b/>
           <w:bCs/>
+          <w:lang w:val="en-US"/>
         </w:rPr>
       </w:pPr>
     </w:p>
@@ -3878,6 +3827,7 @@
         <w:rPr>
           <w:b/>
           <w:bCs/>
+          <w:lang w:val="en-US"/>
         </w:rPr>
       </w:pPr>
     </w:p>
@@ -4167,6 +4117,7 @@
         <w:rPr>
           <w:b/>
           <w:bCs/>
+          <w:lang w:val="en-US"/>
         </w:rPr>
       </w:pPr>
     </w:p>
@@ -4178,737 +4129,1347 @@
           <w:bCs/>
         </w:rPr>
       </w:pPr>
-      <w:r>
+    </w:p>
+    <w:p>
+      <w:pPr>
+        <w:jc w:val="both"/>
         <w:rPr>
           <w:b/>
           <w:bCs/>
         </w:rPr>
-        <w:t>EMPIRICAL STRATEGY</w:t>
-      </w:r>
-    </w:p>
-    <w:p>
-      <w:pPr>
-        <w:jc w:val="both"/>
-      </w:pPr>
-    </w:p>
-    <w:p>
-      <w:pPr>
-        <w:spacing w:line="360" w:lineRule="auto"/>
-        <w:jc w:val="both"/>
-      </w:pPr>
-      <w:r>
-        <w:t xml:space="preserve">This research </w:t>
-      </w:r>
-      <w:r>
-        <w:t xml:space="preserve">explores with two main econometric models </w:t>
-      </w:r>
-      <w:r>
-        <w:t xml:space="preserve">the causal effect of OXXO </w:t>
-      </w:r>
-      <w:r>
-        <w:t xml:space="preserve">openings </w:t>
-      </w:r>
-      <w:r>
-        <w:t xml:space="preserve">on local crime activity </w:t>
-      </w:r>
-      <w:r>
-        <w:t xml:space="preserve">in </w:t>
-      </w:r>
-      <w:r>
-        <w:t>Bogotá</w:t>
-      </w:r>
-      <w:r>
-        <w:t xml:space="preserve">. The first one I used is TWFE. This econometric strategy takes into account that the </w:t>
-      </w:r>
-      <w:r>
-        <w:t xml:space="preserve">the arrival of </w:t>
-      </w:r>
-      <w:r>
-        <w:t>OXXO’s</w:t>
-      </w:r>
-      <w:r>
-        <w:t xml:space="preserve"> occurs in a staggered manner.</w:t>
-      </w:r>
-      <w:r>
-        <w:t xml:space="preserve"> Additionally, it inherently controls for fixed effects for unit (UPZ) and time. The former is useful for capturing time-invariant unobserved characteristics of each UPZ (such as geographic location, historical infrastructure or fixed socieconomic and urban characteristics during the period of analysis), while the latter absorbs common shocks that affect all units simultaneously (such as city-wide security policies or macroeconomic fluctuations). Although TWFE is and adequate method for estimating the average treatement effect (ATT) of OXXO on crime activity, two identification assumptions are needed to prevent bias. This ones will be considered later, but let us first introduce the basic regression form of TWFE:\\</w:t>
-      </w:r>
-    </w:p>
-    <w:p>
-      <w:pPr>
-        <w:spacing w:line="360" w:lineRule="auto"/>
-        <w:jc w:val="both"/>
-      </w:pPr>
-    </w:p>
-    <w:p>
-      <w:pPr>
-        <w:spacing w:line="360" w:lineRule="auto"/>
-        <w:jc w:val="both"/>
-      </w:pPr>
-      <w:r>
-        <w:t>\begin{equation}</w:t>
-      </w:r>
-    </w:p>
-    <w:p>
-      <w:pPr>
-        <w:spacing w:line="360" w:lineRule="auto"/>
-        <w:jc w:val="both"/>
-      </w:pPr>
-      <w:r>
-        <w:t>Y_{i,t}</w:t>
-      </w:r>
-      <w:r>
-        <w:t xml:space="preserve"> </w:t>
-      </w:r>
-      <w:r>
-        <w:t>=</w:t>
-      </w:r>
-      <w:r>
-        <w:t xml:space="preserve"> </w:t>
-      </w:r>
-      <w:r>
-        <w:t>\alpha_i</w:t>
-      </w:r>
-      <w:r>
-        <w:t xml:space="preserve"> </w:t>
-      </w:r>
-      <w:r>
-        <w:t>+</w:t>
-      </w:r>
-      <w:r>
-        <w:t xml:space="preserve"> </w:t>
-      </w:r>
-      <w:r>
-        <w:t>\alpha_t  +\beta^{twfe} D_{i,t}</w:t>
-      </w:r>
-      <w:r>
-        <w:t xml:space="preserve"> </w:t>
-      </w:r>
-      <w:r>
-        <w:t>+</w:t>
-      </w:r>
-      <w:r>
-        <w:t xml:space="preserve"> </w:t>
-      </w:r>
-      <w:r>
-        <w:t>\varepsilon_{i}</w:t>
-      </w:r>
-    </w:p>
-    <w:p>
-      <w:pPr>
-        <w:spacing w:line="360" w:lineRule="auto"/>
-        <w:jc w:val="both"/>
-      </w:pPr>
-      <w:r>
-        <w:t>\label{eq:twfe}</w:t>
-      </w:r>
-    </w:p>
-    <w:p>
-      <w:pPr>
-        <w:spacing w:line="360" w:lineRule="auto"/>
-        <w:jc w:val="both"/>
-      </w:pPr>
-      <w:r>
-        <w:t>\end{equation}\\</w:t>
-      </w:r>
-    </w:p>
-    <w:p>
-      <w:pPr>
-        <w:spacing w:line="360" w:lineRule="auto"/>
-        <w:jc w:val="both"/>
-      </w:pPr>
-    </w:p>
-    <w:p>
-      <w:pPr>
-        <w:spacing w:line="360" w:lineRule="auto"/>
-        <w:jc w:val="both"/>
-      </w:pPr>
-      <w:r>
-        <w:t xml:space="preserve">Where $ </w:t>
-      </w:r>
-      <w:r>
-        <w:t xml:space="preserve">Y_{i,t} </w:t>
-      </w:r>
-      <w:r>
-        <w:t>$ represents the crime rate for UPZ $i$ in </w:t>
-      </w:r>
+      </w:pPr>
       <w:r>
         <w:rPr>
           <w:b/>
           <w:bCs/>
         </w:rPr>
-        <w:t>quarter</w:t>
-      </w:r>
-      <w:r>
-        <w:t xml:space="preserve"> $t$. This rate corresponds to either a specific crime category or the aggregate of all crimes analyzed in this study. </w:t>
-      </w:r>
-      <w:r>
-        <w:t>$D_{</w:t>
-      </w:r>
-      <w:r>
-        <w:t>i,t</w:t>
-      </w:r>
-      <w:r>
-        <w:t xml:space="preserve">}$ </w:t>
-      </w:r>
-      <w:r>
-        <w:t>is a binary indicator that equals one if UPZ $i$  has at least one OXXO store in quarter $t$ , and zero otherwise. Furthermore, as Figure</w:t>
-      </w:r>
-      <w:r>
-        <w:t xml:space="preserve"> \hl{</w:t>
-      </w:r>
-      <w:r>
-        <w:t>XXXX</w:t>
-      </w:r>
-      <w:r>
-        <w:t>}</w:t>
-      </w:r>
-      <w:r>
-        <w:t xml:space="preserve"> suggests that intensity of treatment may be a factor that influences crime. Section \ref{sec:Results} also evaluated </w:t>
-      </w:r>
-      <w:r>
-        <w:t>$D_{</w:t>
-      </w:r>
-      <w:r>
-        <w:t>i,t</w:t>
-      </w:r>
-      <w:r>
-        <w:t>}$</w:t>
-      </w:r>
-      <w:r>
-        <w:t xml:space="preserve"> as the number of OXXO establishments that an UPZ has at a certain quarter. Finally, $</w:t>
+        <w:lastRenderedPageBreak/>
+        <w:t>EMPIRICAL STRATEGY</w:t>
+      </w:r>
+    </w:p>
+    <w:p>
+      <w:pPr>
+        <w:jc w:val="both"/>
+      </w:pPr>
+    </w:p>
+    <w:p>
+      <w:pPr>
+        <w:spacing w:line="360" w:lineRule="auto"/>
+        <w:jc w:val="both"/>
+      </w:pPr>
+      <w:r>
+        <w:t xml:space="preserve">This research </w:t>
+      </w:r>
+      <w:r>
+        <w:t xml:space="preserve">explores with two main econometric models </w:t>
+      </w:r>
+      <w:r>
+        <w:t xml:space="preserve">the causal effect of OXXO </w:t>
+      </w:r>
+      <w:r>
+        <w:t xml:space="preserve">openings </w:t>
+      </w:r>
+      <w:r>
+        <w:t xml:space="preserve">on local crime activity </w:t>
+      </w:r>
+      <w:r>
+        <w:t xml:space="preserve">in </w:t>
+      </w:r>
+      <w:r>
+        <w:t>Bogotá</w:t>
+      </w:r>
+      <w:r>
+        <w:t xml:space="preserve">. The first one I used is TWFE. This econometric strategy takes into account that the </w:t>
+      </w:r>
+      <w:r>
+        <w:t xml:space="preserve">the arrival of </w:t>
+      </w:r>
+      <w:r>
+        <w:t>OXXO’s</w:t>
+      </w:r>
+      <w:r>
+        <w:t xml:space="preserve"> occurs in a staggered manner.</w:t>
+      </w:r>
+      <w:r>
+        <w:t xml:space="preserve"> Additionally, it inherently controls for fixed effects for unit (UPZ) and time. The former is useful for capturing time-invariant unobserved characteristics of each UPZ (such as geographic location, historical infrastructure or fixed socieconomic and urban characteristics during the period of analysis), while the latter absorbs common shocks that affect all units simultaneously (such as city-wide security policies or macroeconomic fluctuations). Although TWFE is and adequate method for estimating the average treatement effect (ATT) of OXXO on crime activity, two identification assumptions are needed to prevent bias. This ones will be considered later, but let us first introduce the basic regression form of TWFE:\\</w:t>
+      </w:r>
+    </w:p>
+    <w:p>
+      <w:pPr>
+        <w:spacing w:line="360" w:lineRule="auto"/>
+        <w:jc w:val="both"/>
+      </w:pPr>
+    </w:p>
+    <w:p>
+      <w:pPr>
+        <w:spacing w:line="360" w:lineRule="auto"/>
+        <w:jc w:val="both"/>
+      </w:pPr>
+      <w:r>
+        <w:t>\begin{equation}</w:t>
+      </w:r>
+    </w:p>
+    <w:p>
+      <w:pPr>
+        <w:spacing w:line="360" w:lineRule="auto"/>
+        <w:jc w:val="both"/>
+      </w:pPr>
+      <w:r>
+        <w:t>Y_{i,t}</w:t>
+      </w:r>
+      <w:r>
+        <w:t xml:space="preserve"> </w:t>
+      </w:r>
+      <w:r>
+        <w:t>=</w:t>
+      </w:r>
+      <w:r>
+        <w:t xml:space="preserve"> </w:t>
       </w:r>
       <w:r>
         <w:t>\alpha_i</w:t>
       </w:r>
       <w:r>
-        <w:t xml:space="preserve">$ and </w:t>
-      </w:r>
-      <w:r>
         <w:t xml:space="preserve"> </w:t>
       </w:r>
       <w:r>
-        <w:t>$</w:t>
-      </w:r>
-      <w:r>
-        <w:t>\alpha_t</w:t>
-      </w:r>
-      <w:r>
-        <w:t xml:space="preserve">$ are the unit and time fixed effects respectively.\\ </w:t>
-      </w:r>
-    </w:p>
-    <w:p>
-      <w:pPr>
-        <w:spacing w:line="360" w:lineRule="auto"/>
-        <w:jc w:val="both"/>
-      </w:pPr>
-    </w:p>
-    <w:p>
-      <w:pPr>
-        <w:spacing w:line="360" w:lineRule="auto"/>
-        <w:jc w:val="both"/>
-      </w:pPr>
-      <w:r>
-        <w:t xml:space="preserve">A critical identification assumption for the TWFE estimator is the homogeneity of treatment effects. This implies that these effects must be constant among treatment cohorts and over time </w:t>
-      </w:r>
-      <w:r>
-        <w:rPr>
-          <w:lang w:val="en-US"/>
-        </w:rPr>
-        <w:t>\</w:t>
-      </w:r>
-      <w:proofErr w:type="spellStart"/>
-      <w:r>
-        <w:rPr>
-          <w:lang w:val="en-US"/>
-        </w:rPr>
-        <w:t>parencite</w:t>
-      </w:r>
-      <w:proofErr w:type="spellEnd"/>
-      <w:r>
-        <w:rPr>
-          <w:lang w:val="en-US"/>
-        </w:rPr>
-        <w:t>{</w:t>
-      </w:r>
-      <w:r>
-        <w:t xml:space="preserve">deChaisemartin2023survey}. This assumption may be violated if treatment effects vary </w:t>
-      </w:r>
-      <w:r>
-        <w:lastRenderedPageBreak/>
-        <w:t>based on UPZs’ characteristics or if the impact of an OXXO opening on crime evolves as the store becomes established in the area. Consequently, to diagnose the potential bias arising from these heterogeneities,</w:t>
+        <w:t>+</w:t>
       </w:r>
       <w:r>
         <w:t xml:space="preserve"> </w:t>
       </w:r>
       <w:r>
-        <w:t>I</w:t>
+        <w:t>\alpha_t  +\beta^{twfe} D_{i,t}</w:t>
       </w:r>
       <w:r>
         <w:t xml:space="preserve"> </w:t>
       </w:r>
       <w:r>
-        <w:t>employ the Goodman-Bacon decomposition</w:t>
+        <w:t>+</w:t>
+      </w:r>
+      <w:r>
+        <w:t xml:space="preserve"> </w:t>
+      </w:r>
+      <w:r>
+        <w:t>\varepsilon_{i}</w:t>
+      </w:r>
+    </w:p>
+    <w:p>
+      <w:pPr>
+        <w:spacing w:line="360" w:lineRule="auto"/>
+        <w:jc w:val="both"/>
+      </w:pPr>
+      <w:r>
+        <w:t>\label{eq:twfe}</w:t>
+      </w:r>
+    </w:p>
+    <w:p>
+      <w:pPr>
+        <w:spacing w:line="360" w:lineRule="auto"/>
+        <w:jc w:val="both"/>
+      </w:pPr>
+      <w:r>
+        <w:t>\end{equation}\\</w:t>
+      </w:r>
+    </w:p>
+    <w:p>
+      <w:pPr>
+        <w:spacing w:line="360" w:lineRule="auto"/>
+        <w:jc w:val="both"/>
+      </w:pPr>
+    </w:p>
+    <w:p>
+      <w:pPr>
+        <w:spacing w:line="360" w:lineRule="auto"/>
+        <w:jc w:val="both"/>
+      </w:pPr>
+      <w:r>
+        <w:t xml:space="preserve">Where $ </w:t>
+      </w:r>
+      <w:r>
+        <w:t xml:space="preserve">Y_{i,t} </w:t>
+      </w:r>
+      <w:r>
+        <w:t>$ represents the crime rate for UPZ $i$ in </w:t>
       </w:r>
       <w:r>
         <w:rPr>
           <w:b/>
           <w:bCs/>
         </w:rPr>
+        <w:t>quarter</w:t>
+      </w:r>
+      <w:r>
+        <w:t xml:space="preserve"> $t$. This rate corresponds to either a specific crime category or the aggregate of all crimes analyzed in this study. </w:t>
+      </w:r>
+      <w:r>
+        <w:t>$D_{</w:t>
+      </w:r>
+      <w:r>
+        <w:t>i,t</w:t>
+      </w:r>
+      <w:r>
+        <w:t xml:space="preserve">}$ </w:t>
+      </w:r>
+      <w:r>
+        <w:t>is a binary indicator that equals one if UPZ $i$  has at least one OXXO store in quarter $t$ , and zero otherwise. Furthermore, as Figure</w:t>
+      </w:r>
+      <w:r>
+        <w:t xml:space="preserve"> \hl{</w:t>
+      </w:r>
+      <w:r>
+        <w:t>XXXX</w:t>
+      </w:r>
+      <w:r>
+        <w:t>}</w:t>
+      </w:r>
+      <w:r>
+        <w:t xml:space="preserve"> suggests that intensity of treatment may be a factor that influences crime. Section \ref{sec:Results} also evaluated </w:t>
+      </w:r>
+      <w:r>
+        <w:t>$D_{</w:t>
+      </w:r>
+      <w:r>
+        <w:t>i,t</w:t>
+      </w:r>
+      <w:r>
+        <w:t>}$</w:t>
+      </w:r>
+      <w:r>
+        <w:t xml:space="preserve"> as the number of OXXO establishments that an UPZ has at a certain quarter. Finally, $</w:t>
+      </w:r>
+      <w:r>
+        <w:t>\alpha_i</w:t>
+      </w:r>
+      <w:r>
+        <w:t xml:space="preserve">$ and </w:t>
+      </w:r>
+      <w:r>
         <w:t xml:space="preserve"> </w:t>
       </w:r>
       <w:r>
-        <w:t>\parencite{GoodmanBacon2021}. </w:t>
-      </w:r>
-      <w:r>
-        <w:t xml:space="preserve"> This theorem decompoeses the $</w:t>
-      </w:r>
-      <w:r>
-        <w:t>\beta^{twfe}</w:t>
-      </w:r>
-      <w:r>
-        <w:t xml:space="preserve">$ as a weighted average </w:t>
-      </w:r>
-      <w:r>
-        <w:t xml:space="preserve">of all possible 2×2 difference-in-differences comparisons </w:t>
-      </w:r>
-      <w:r>
-        <w:t>among cohorts, and t</w:t>
-      </w:r>
-      <w:r>
-        <w:t>he primary concern in this decompositio</w:t>
-      </w:r>
-      <w:r>
-        <w:t xml:space="preserve">n is to </w:t>
-      </w:r>
-      <w:r>
-        <w:t xml:space="preserve">avoid having negative weights as </w:t>
-      </w:r>
-      <w:r>
-        <w:t xml:space="preserve">they indicate that </w:t>
-      </w:r>
-      <w:r>
-        <w:t xml:space="preserve">the estimator </w:t>
-      </w:r>
-      <w:r>
-        <w:t>may be</w:t>
-      </w:r>
-      <w:r>
-        <w:t xml:space="preserve"> bias</w:t>
-      </w:r>
-      <w:r>
-        <w:t xml:space="preserve">ed </w:t>
-      </w:r>
-      <w:r>
-        <w:t>from heterogeneous treatment effects</w:t>
+        <w:t>$</w:t>
+      </w:r>
+      <w:r>
+        <w:t>\alpha_t</w:t>
+      </w:r>
+      <w:r>
+        <w:t xml:space="preserve">$ are the unit and time fixed effects respectively.\\ </w:t>
+      </w:r>
+    </w:p>
+    <w:p>
+      <w:pPr>
+        <w:spacing w:line="360" w:lineRule="auto"/>
+        <w:jc w:val="both"/>
+      </w:pPr>
+    </w:p>
+    <w:p>
+      <w:pPr>
+        <w:spacing w:line="360" w:lineRule="auto"/>
+        <w:jc w:val="both"/>
+      </w:pPr>
+      <w:r>
+        <w:t xml:space="preserve">A critical identification assumption for the TWFE estimator is the homogeneity of treatment effects. This implies that these effects must be constant among treatment cohorts and over time </w:t>
+      </w:r>
+      <w:r>
+        <w:rPr>
+          <w:lang w:val="en-US"/>
+        </w:rPr>
+        <w:t>\</w:t>
+      </w:r>
+      <w:proofErr w:type="spellStart"/>
+      <w:r>
+        <w:rPr>
+          <w:lang w:val="en-US"/>
+        </w:rPr>
+        <w:t>parencite</w:t>
+      </w:r>
+      <w:proofErr w:type="spellEnd"/>
+      <w:r>
+        <w:rPr>
+          <w:lang w:val="en-US"/>
+        </w:rPr>
+        <w:t>{</w:t>
+      </w:r>
+      <w:r>
+        <w:t xml:space="preserve">deChaisemartin2023survey}. This assumption may be violated if treatment effects vary based on UPZs’ characteristics or if the impact of an OXXO opening on crime evolves as the store becomes established in the area. Consequently, to diagnose the potential bias arising from these </w:t>
+      </w:r>
+      <w:r>
+        <w:lastRenderedPageBreak/>
+        <w:t>heterogeneities,</w:t>
       </w:r>
       <w:r>
         <w:t xml:space="preserve"> </w:t>
       </w:r>
       <w:r>
-        <w:t>\parencite{GoodmanBacon2021}.\\</w:t>
-      </w:r>
-    </w:p>
-    <w:p>
-      <w:pPr>
-        <w:spacing w:line="360" w:lineRule="auto"/>
-        <w:jc w:val="both"/>
-      </w:pPr>
-    </w:p>
-    <w:p>
-      <w:pPr>
-        <w:spacing w:line="360" w:lineRule="auto"/>
-        <w:jc w:val="both"/>
-      </w:pPr>
-      <w:r>
-        <w:t>Parallel trends is the other condition to guarantee an unbiased ATT, as it ensures that, in the absence of treatment, the average outcomes of the treated and control groups would have followed the same trajectory over time. To evaluate the validity of this assumption, I implement an Event Study design. </w:t>
-      </w:r>
-      <w:r>
-        <w:t xml:space="preserve">This model requires </w:t>
-      </w:r>
-      <w:r>
-        <w:t xml:space="preserve">no anticipation to treatment, </w:t>
-      </w:r>
-      <w:r>
-        <w:t xml:space="preserve">and in this context </w:t>
-      </w:r>
-      <w:r>
-        <w:t>it is highly unlikely that perpetrators or residents altered their behavior in expectation of an OXXO opening, as these commercial developments are typically not publicized far enough in advance to influence local criminal dynamics beforehand.</w:t>
+        <w:t>I</w:t>
       </w:r>
       <w:r>
         <w:t xml:space="preserve"> </w:t>
       </w:r>
       <w:r>
-        <w:t>The Events Study is estimated by using the following equation</w:t>
-      </w:r>
-      <w:r>
-        <w:t>:\\</w:t>
-      </w:r>
-    </w:p>
-    <w:p>
-      <w:pPr>
-        <w:spacing w:line="360" w:lineRule="auto"/>
-        <w:jc w:val="both"/>
-      </w:pPr>
-    </w:p>
-    <w:p>
-      <w:pPr>
-        <w:spacing w:line="360" w:lineRule="auto"/>
-        <w:jc w:val="both"/>
-      </w:pPr>
-      <w:r>
-        <w:t>\begin{equation}</w:t>
-      </w:r>
-    </w:p>
-    <w:p>
-      <w:pPr>
-        <w:spacing w:line="360" w:lineRule="auto"/>
-        <w:jc w:val="both"/>
-      </w:pPr>
-      <w:r>
-        <w:t xml:space="preserve">Y_{i,t} = \alpha_i + \alpha_t </w:t>
-      </w:r>
-    </w:p>
-    <w:p>
-      <w:pPr>
-        <w:spacing w:line="360" w:lineRule="auto"/>
-        <w:jc w:val="both"/>
-      </w:pPr>
-      <w:r>
-        <w:t xml:space="preserve">+ \sum_{k=-K}^{-2} \gamma^{lead}_k D^k_{i,t} </w:t>
-      </w:r>
-    </w:p>
-    <w:p>
-      <w:pPr>
-        <w:spacing w:line="360" w:lineRule="auto"/>
-        <w:jc w:val="both"/>
-      </w:pPr>
-      <w:r>
-        <w:t xml:space="preserve">+ \sum_{k=0}^{L} \gamma^{lag}_k D^k_{i,t} </w:t>
-      </w:r>
-    </w:p>
-    <w:p>
-      <w:pPr>
-        <w:spacing w:line="360" w:lineRule="auto"/>
-        <w:jc w:val="both"/>
-      </w:pPr>
-      <w:r>
-        <w:t>+ \varepsilon_{i,t}</w:t>
-      </w:r>
-    </w:p>
-    <w:p>
-      <w:pPr>
-        <w:spacing w:line="360" w:lineRule="auto"/>
-        <w:jc w:val="both"/>
-      </w:pPr>
-      <w:r>
-        <w:t>\label{eq:eventstudy}</w:t>
-      </w:r>
-    </w:p>
-    <w:p>
-      <w:pPr>
-        <w:spacing w:line="360" w:lineRule="auto"/>
-        <w:jc w:val="both"/>
-      </w:pPr>
-      <w:r>
-        <w:t>\end{equation}\\</w:t>
-      </w:r>
-    </w:p>
-    <w:p>
-      <w:pPr>
-        <w:spacing w:line="360" w:lineRule="auto"/>
-        <w:jc w:val="both"/>
-      </w:pPr>
-    </w:p>
-    <w:p>
-      <w:pPr>
-        <w:spacing w:line="360" w:lineRule="auto"/>
-        <w:jc w:val="both"/>
-      </w:pPr>
-      <w:r>
-        <w:t>Equation \eqref{eq:eventstudy}allows</w:t>
-      </w:r>
-      <w:r>
-        <w:t xml:space="preserve"> to analyze the significance of the coeficients  $\gamma^{lead}_k$  and suggests the existence of parallel trends before the arrival of OXXO. Additionally, the coefficients $\gamma^{lag}_k$ reflect the </w:t>
-      </w:r>
-      <w:r>
-        <w:t xml:space="preserve">temporal </w:t>
-      </w:r>
-      <w:r>
-        <w:t>dynamics of the impact after the treatment.\\</w:t>
-      </w:r>
-    </w:p>
-    <w:p>
-      <w:pPr>
-        <w:spacing w:line="360" w:lineRule="auto"/>
-        <w:jc w:val="both"/>
-      </w:pPr>
-    </w:p>
-    <w:p>
-      <w:pPr>
-        <w:spacing w:line="360" w:lineRule="auto"/>
-        <w:jc w:val="both"/>
-      </w:pPr>
-      <w:r>
-        <w:lastRenderedPageBreak/>
-        <w:t xml:space="preserve">Finally, for robustness purposes, </w:t>
-      </w:r>
-      <w:r>
-        <w:t xml:space="preserve">I will also estimate </w:t>
-      </w:r>
-      <w:r>
-        <w:t xml:space="preserve">the Callaway \&amp; Sant’Anna (CS) </w:t>
-      </w:r>
-      <w:r>
-        <w:t xml:space="preserve">model. This approach accounts for treatment effect heterogeneity by estimating ATTs by cohort and period, subsequently combining these effects through a weighted average </w:t>
-      </w:r>
-      <w:r>
-        <w:t xml:space="preserve">\parencite{RiosAvila_Callaway_SantAnna_2021_csdid_slides,Callaway_SantAnna_2021}. </w:t>
-      </w:r>
-      <w:r>
-        <w:t>o achieve this, the model utilizes the following doubly robust estimator for the ATT of each cohort </w:t>
-      </w:r>
-      <w:r>
-        <w:t>$</w:t>
-      </w:r>
-      <w:r>
-        <w:t>g</w:t>
-      </w:r>
-      <w:r>
-        <w:t>$</w:t>
-      </w:r>
-      <w:r>
-        <w:t> at time </w:t>
-      </w:r>
-      <w:r>
-        <w:t>$</w:t>
-      </w:r>
-      <w:r>
-        <w:t>t</w:t>
-      </w:r>
-      <w:r>
-        <w:t>$</w:t>
-      </w:r>
-      <w:r>
-        <w:t>:</w:t>
-      </w:r>
-    </w:p>
-    <w:p>
-      <w:pPr>
-        <w:spacing w:line="360" w:lineRule="auto"/>
-        <w:jc w:val="both"/>
-      </w:pPr>
-    </w:p>
-    <w:p>
-      <w:pPr>
-        <w:spacing w:line="360" w:lineRule="auto"/>
-        <w:jc w:val="both"/>
-      </w:pPr>
-      <w:r>
-        <w:t>\begin{equation}</w:t>
-      </w:r>
-    </w:p>
-    <w:p>
-      <w:pPr>
-        <w:spacing w:line="360" w:lineRule="auto"/>
-        <w:jc w:val="both"/>
-      </w:pPr>
-      <w:r>
-        <w:t>ATT(g, t) = \mathbb{E} \left[ \left( \frac{G_g}{\mathbb{E}[G_g]} - \frac{\frac{p_{g,t}(X)(1 - D_t)}{1 - p_{g,t}(X)}}{\mathbb{E} \left[ \frac{p_{g,t}(X)(1 - D_t)}{1 - p_{g,t}(X)} \right]} \right) (Y_t - Y_{g-1}) \right]</w:t>
-      </w:r>
-    </w:p>
-    <w:p>
-      <w:pPr>
-        <w:spacing w:line="360" w:lineRule="auto"/>
-        <w:jc w:val="both"/>
-      </w:pPr>
-      <w:r>
-        <w:t>\end{equation}\\</w:t>
-      </w:r>
-    </w:p>
-    <w:p>
-      <w:pPr>
-        <w:spacing w:line="360" w:lineRule="auto"/>
-        <w:jc w:val="both"/>
-      </w:pPr>
-    </w:p>
-    <w:p>
-      <w:pPr>
-        <w:spacing w:line="360" w:lineRule="auto"/>
-        <w:jc w:val="both"/>
-      </w:pPr>
-      <w:r>
-        <w:t>Where $t$ is a particular time period, $ G_g$ Gis a binary indicator for whether an observation belongs to cohort $g$, $ D_t $ treatment status at time t</w:t>
-      </w:r>
-      <w:r>
-        <w:t xml:space="preserve">, and </w:t>
-      </w:r>
-      <w:r>
-        <w:t> </w:t>
-      </w:r>
-      <w:r>
-        <w:t>$(1 - D_t)$</w:t>
-      </w:r>
-      <w:r>
-        <w:t xml:space="preserve">identifies observations that have not yet been treated, serving as the control group. </w:t>
-      </w:r>
-      <w:r>
-        <w:t xml:space="preserve">Additionally, the approach I chose uses </w:t>
-      </w:r>
-      <w:r>
-        <w:t xml:space="preserve">Inverse Probability Weighting (IPW) to assign greater weight to control observations that more closely resemble the treated cohort $G_g$. </w:t>
-      </w:r>
-    </w:p>
-    <w:p>
-      <w:pPr>
-        <w:spacing w:line="360" w:lineRule="auto"/>
-        <w:jc w:val="both"/>
-      </w:pPr>
-    </w:p>
-    <w:p>
-      <w:pPr>
-        <w:spacing w:line="360" w:lineRule="auto"/>
-        <w:jc w:val="both"/>
-      </w:pPr>
-      <w:r>
-        <w:t>Subsequently, to aggregate all ATT(g,t) estimates into a single summary parameter, the authors propose the following aggregation strategy:</w:t>
-      </w:r>
-    </w:p>
-    <w:p>
-      <w:pPr>
-        <w:spacing w:line="360" w:lineRule="auto"/>
-        <w:jc w:val="both"/>
-      </w:pPr>
-    </w:p>
-    <w:p>
-      <w:pPr>
-        <w:spacing w:line="360" w:lineRule="auto"/>
-        <w:jc w:val="both"/>
-      </w:pPr>
-      <w:r>
-        <w:t xml:space="preserve">\begin{equation} </w:t>
-      </w:r>
-    </w:p>
-    <w:p>
-      <w:pPr>
-        <w:spacing w:line="360" w:lineRule="auto"/>
-        <w:jc w:val="both"/>
-      </w:pPr>
-      <w:r>
-        <w:t>\theta = \sum_{g \in \mathcal{G}} \sum_{t=2}^{\mathcal{T}} w(g, t) \cdot ATT(g, t) \end{equation}</w:t>
-      </w:r>
-      <w:r>
-        <w:t>\\</w:t>
-      </w:r>
-    </w:p>
-    <w:p>
-      <w:pPr>
-        <w:spacing w:line="360" w:lineRule="auto"/>
-        <w:jc w:val="both"/>
-      </w:pPr>
-    </w:p>
-    <w:p>
-      <w:pPr>
-        <w:spacing w:line="360" w:lineRule="auto"/>
-        <w:jc w:val="both"/>
-      </w:pPr>
-      <w:r>
-        <w:t>Where </w:t>
-      </w:r>
-      <w:r>
-        <w:t>$</w:t>
-      </w:r>
-      <w:r>
-        <w:t>w(g,t)</w:t>
-      </w:r>
-      <w:r>
-        <w:t>$</w:t>
-      </w:r>
-      <w:r>
-        <w:t xml:space="preserve"> represents the weights determined by the researcher. In this analysis, I employ a simple averaging scheme </w:t>
-      </w:r>
-      <w:r>
-        <w:t>m</w:t>
-      </w:r>
-      <w:r>
-        <w:t>where w(g,t)</w:t>
-      </w:r>
-      <w:r>
-        <w:t xml:space="preserve"> is the same</w:t>
-      </w:r>
-      <w:r>
-        <w:t xml:space="preserve"> for all treated periods. The objective of this comparison is to determine if the Callaway </w:t>
-      </w:r>
-      <w:r>
-        <w:t>\</w:t>
-      </w:r>
-      <w:r>
-        <w:t xml:space="preserve">&amp; Sant’Anna (CS) estimates </w:t>
-      </w:r>
-      <w:r>
-        <w:t xml:space="preserve">an Events Studies </w:t>
-      </w:r>
-      <w:r>
-        <w:t xml:space="preserve">align with the Two-Way Fixed Effects (TWFE) results. A similar behavior between the two models </w:t>
-      </w:r>
-      <w:r>
-        <w:lastRenderedPageBreak/>
-        <w:t>would reinforce the validity of the TWFE estimates and suggest that</w:t>
-      </w:r>
-      <w:r>
-        <w:t xml:space="preserve"> the possible bias of heterogeneous effects is not a preoccupation</w:t>
-      </w:r>
-    </w:p>
-    <w:p>
-      <w:pPr>
-        <w:spacing w:line="360" w:lineRule="auto"/>
-        <w:jc w:val="both"/>
-      </w:pPr>
-      <w:r>
-        <w:t>\parencite{RiosAvila_Callaway_SantAnna_2021_csdid_slides,Callaway_SantAnna_2021}.</w:t>
-      </w:r>
-    </w:p>
-    <w:p>
-      <w:pPr>
-        <w:jc w:val="both"/>
+        <w:t>employ the Goodman-Bacon decomposition</w:t>
+      </w:r>
+      <w:r>
         <w:rPr>
           <w:b/>
           <w:bCs/>
         </w:rPr>
-      </w:pPr>
-      <w:r>
+        <w:t xml:space="preserve"> </w:t>
+      </w:r>
+      <w:r>
+        <w:t>\parencite{GoodmanBacon2021}. </w:t>
+      </w:r>
+      <w:r>
+        <w:t xml:space="preserve"> This theorem decompoeses the $</w:t>
+      </w:r>
+      <w:r>
+        <w:t>\beta^{twfe}</w:t>
+      </w:r>
+      <w:r>
+        <w:t xml:space="preserve">$ as a weighted average </w:t>
+      </w:r>
+      <w:r>
+        <w:t xml:space="preserve">of all possible 2×2 difference-in-differences comparisons </w:t>
+      </w:r>
+      <w:r>
+        <w:t>among cohorts, and t</w:t>
+      </w:r>
+      <w:r>
+        <w:t>he primary concern in this decompositio</w:t>
+      </w:r>
+      <w:r>
+        <w:t xml:space="preserve">n is to </w:t>
+      </w:r>
+      <w:r>
+        <w:t xml:space="preserve">avoid having negative weights as </w:t>
+      </w:r>
+      <w:r>
+        <w:t xml:space="preserve">they indicate that </w:t>
+      </w:r>
+      <w:r>
+        <w:t xml:space="preserve">the estimator </w:t>
+      </w:r>
+      <w:r>
+        <w:t>may be</w:t>
+      </w:r>
+      <w:r>
+        <w:t xml:space="preserve"> bias</w:t>
+      </w:r>
+      <w:r>
+        <w:t xml:space="preserve">ed </w:t>
+      </w:r>
+      <w:r>
+        <w:t>from heterogeneous treatment effects</w:t>
+      </w:r>
+      <w:r>
+        <w:t xml:space="preserve"> </w:t>
+      </w:r>
+      <w:r>
+        <w:t>\parencite{GoodmanBacon2021}.\\</w:t>
+      </w:r>
+    </w:p>
+    <w:p>
+      <w:pPr>
+        <w:spacing w:line="360" w:lineRule="auto"/>
+        <w:jc w:val="both"/>
+      </w:pPr>
+    </w:p>
+    <w:p>
+      <w:pPr>
+        <w:spacing w:line="360" w:lineRule="auto"/>
+        <w:jc w:val="both"/>
+      </w:pPr>
+      <w:r>
+        <w:t>Parallel trends is the other condition to guarantee an unbiased ATT, as it ensures that, in the absence of treatment, the average outcomes of the treated and control groups would have followed the same trajectory over time. To evaluate the validity of this assumption, I implement an Event Study design. </w:t>
+      </w:r>
+      <w:r>
+        <w:t xml:space="preserve">This model requires </w:t>
+      </w:r>
+      <w:r>
+        <w:t xml:space="preserve">no anticipation to treatment, </w:t>
+      </w:r>
+      <w:r>
+        <w:t xml:space="preserve">and in this context </w:t>
+      </w:r>
+      <w:r>
+        <w:t>it is highly unlikely that perpetrators or residents altered their behavior in expectation of an OXXO opening, as these commercial developments are typically not publicized far enough in advance to influence local criminal dynamics beforehand.</w:t>
+      </w:r>
+      <w:r>
+        <w:t xml:space="preserve"> </w:t>
+      </w:r>
+      <w:r>
+        <w:t>The Events Study is estimated by using the following equation</w:t>
+      </w:r>
+      <w:r>
+        <w:t>:\\</w:t>
+      </w:r>
+    </w:p>
+    <w:p>
+      <w:pPr>
+        <w:spacing w:line="360" w:lineRule="auto"/>
+        <w:jc w:val="both"/>
+      </w:pPr>
+    </w:p>
+    <w:p>
+      <w:pPr>
+        <w:spacing w:line="360" w:lineRule="auto"/>
+        <w:jc w:val="both"/>
+      </w:pPr>
+      <w:r>
+        <w:t>\begin{equation}</w:t>
+      </w:r>
+    </w:p>
+    <w:p>
+      <w:pPr>
+        <w:spacing w:line="360" w:lineRule="auto"/>
+        <w:jc w:val="both"/>
+      </w:pPr>
+      <w:r>
+        <w:t xml:space="preserve">Y_{i,t} = \alpha_i + \alpha_t </w:t>
+      </w:r>
+    </w:p>
+    <w:p>
+      <w:pPr>
+        <w:spacing w:line="360" w:lineRule="auto"/>
+        <w:jc w:val="both"/>
+      </w:pPr>
+      <w:r>
+        <w:t xml:space="preserve">+ \sum_{k=-K}^{-2} \gamma^{lead}_k D^k_{i,t} </w:t>
+      </w:r>
+    </w:p>
+    <w:p>
+      <w:pPr>
+        <w:spacing w:line="360" w:lineRule="auto"/>
+        <w:jc w:val="both"/>
+      </w:pPr>
+      <w:r>
+        <w:t xml:space="preserve">+ \sum_{k=0}^{L} \gamma^{lag}_k D^k_{i,t} </w:t>
+      </w:r>
+    </w:p>
+    <w:p>
+      <w:pPr>
+        <w:spacing w:line="360" w:lineRule="auto"/>
+        <w:jc w:val="both"/>
+      </w:pPr>
+      <w:r>
+        <w:t>+ \varepsilon_{i,t}</w:t>
+      </w:r>
+    </w:p>
+    <w:p>
+      <w:pPr>
+        <w:spacing w:line="360" w:lineRule="auto"/>
+        <w:jc w:val="both"/>
+      </w:pPr>
+      <w:r>
+        <w:t>\label{eq:eventstudy}</w:t>
+      </w:r>
+    </w:p>
+    <w:p>
+      <w:pPr>
+        <w:spacing w:line="360" w:lineRule="auto"/>
+        <w:jc w:val="both"/>
+      </w:pPr>
+      <w:r>
+        <w:t>\end{equation}\\</w:t>
+      </w:r>
+    </w:p>
+    <w:p>
+      <w:pPr>
+        <w:spacing w:line="360" w:lineRule="auto"/>
+        <w:jc w:val="both"/>
+      </w:pPr>
+    </w:p>
+    <w:p>
+      <w:pPr>
+        <w:spacing w:line="360" w:lineRule="auto"/>
+        <w:jc w:val="both"/>
+      </w:pPr>
+      <w:r>
+        <w:t>Equation \eqref{eq:eventstudy}allows</w:t>
+      </w:r>
+      <w:r>
+        <w:t xml:space="preserve"> to analyze the significance of the coeficients  $\gamma^{lead}_k$  and suggests the existence of parallel trends before the arrival of OXXO. Additionally, the coefficients $\gamma^{lag}_k$ reflect the </w:t>
+      </w:r>
+      <w:r>
+        <w:t xml:space="preserve">temporal </w:t>
+      </w:r>
+      <w:r>
+        <w:t>dynamics of the impact after the treatment.\\</w:t>
+      </w:r>
+    </w:p>
+    <w:p>
+      <w:pPr>
+        <w:spacing w:line="360" w:lineRule="auto"/>
+        <w:jc w:val="both"/>
+      </w:pPr>
+    </w:p>
+    <w:p>
+      <w:pPr>
+        <w:spacing w:line="360" w:lineRule="auto"/>
+        <w:jc w:val="both"/>
+      </w:pPr>
+      <w:r>
+        <w:t xml:space="preserve">Finally, for robustness purposes, </w:t>
+      </w:r>
+      <w:r>
+        <w:t xml:space="preserve">I will also estimate </w:t>
+      </w:r>
+      <w:r>
+        <w:t xml:space="preserve">the Callaway \&amp; Sant’Anna (CS) </w:t>
+      </w:r>
+      <w:r>
+        <w:t xml:space="preserve">model. This approach accounts for treatment effect heterogeneity by estimating ATTs by cohort and period, </w:t>
+      </w:r>
+      <w:r>
+        <w:lastRenderedPageBreak/>
+        <w:t xml:space="preserve">subsequently combining these effects through a weighted average </w:t>
+      </w:r>
+      <w:r>
+        <w:t xml:space="preserve">\parencite{RiosAvila_Callaway_SantAnna_2021_csdid_slides,Callaway_SantAnna_2021}. </w:t>
+      </w:r>
+      <w:r>
+        <w:t>o achieve this, the model utilizes the following doubly robust estimator for the ATT of each cohort </w:t>
+      </w:r>
+      <w:r>
+        <w:t>$</w:t>
+      </w:r>
+      <w:r>
+        <w:t>g</w:t>
+      </w:r>
+      <w:r>
+        <w:t>$</w:t>
+      </w:r>
+      <w:r>
+        <w:t> at time </w:t>
+      </w:r>
+      <w:r>
+        <w:t>$</w:t>
+      </w:r>
+      <w:r>
+        <w:t>t</w:t>
+      </w:r>
+      <w:r>
+        <w:t>$</w:t>
+      </w:r>
+      <w:r>
+        <w:t>:</w:t>
+      </w:r>
+    </w:p>
+    <w:p>
+      <w:pPr>
+        <w:spacing w:line="360" w:lineRule="auto"/>
+        <w:jc w:val="both"/>
+      </w:pPr>
+    </w:p>
+    <w:p>
+      <w:pPr>
+        <w:spacing w:line="360" w:lineRule="auto"/>
+        <w:jc w:val="both"/>
+      </w:pPr>
+      <w:r>
+        <w:t>\begin{equation}</w:t>
+      </w:r>
+    </w:p>
+    <w:p>
+      <w:pPr>
+        <w:spacing w:line="360" w:lineRule="auto"/>
+        <w:jc w:val="both"/>
+      </w:pPr>
+      <w:r>
+        <w:t>ATT(g, t) = \mathbb{E} \left[ \left( \frac{G_g}{\mathbb{E}[G_g]} - \frac{\frac{p_{g,t}(X)(1 - D_t)}{1 - p_{g,t}(X)}}{\mathbb{E} \left[ \frac{p_{g,t}(X)(1 - D_t)}{1 - p_{g,t}(X)} \right]} \right) (Y_t - Y_{g-1}) \right]</w:t>
+      </w:r>
+    </w:p>
+    <w:p>
+      <w:pPr>
+        <w:spacing w:line="360" w:lineRule="auto"/>
+        <w:jc w:val="both"/>
+      </w:pPr>
+      <w:r>
+        <w:t>\end{equation}\\</w:t>
+      </w:r>
+    </w:p>
+    <w:p>
+      <w:pPr>
+        <w:spacing w:line="360" w:lineRule="auto"/>
+        <w:jc w:val="both"/>
+      </w:pPr>
+    </w:p>
+    <w:p>
+      <w:pPr>
+        <w:spacing w:line="360" w:lineRule="auto"/>
+        <w:jc w:val="both"/>
+      </w:pPr>
+      <w:r>
+        <w:t>Where $t$ is a particular time period, $ G_g$ Gis a binary indicator for whether an observation belongs to cohort $g$, $ D_t $ treatment status at time t</w:t>
+      </w:r>
+      <w:r>
+        <w:t xml:space="preserve">, and </w:t>
+      </w:r>
+      <w:r>
+        <w:t> </w:t>
+      </w:r>
+      <w:r>
+        <w:t>$(1 - D_t)$</w:t>
+      </w:r>
+      <w:r>
+        <w:t xml:space="preserve">identifies observations that have not yet been treated, serving as the control group. </w:t>
+      </w:r>
+      <w:r>
+        <w:t xml:space="preserve">Additionally, the approach I chose uses </w:t>
+      </w:r>
+      <w:r>
+        <w:t xml:space="preserve">Inverse Probability Weighting (IPW) to assign greater weight to control observations that more closely resemble the treated cohort $G_g$. </w:t>
+      </w:r>
+    </w:p>
+    <w:p>
+      <w:pPr>
+        <w:spacing w:line="360" w:lineRule="auto"/>
+        <w:jc w:val="both"/>
+      </w:pPr>
+    </w:p>
+    <w:p>
+      <w:pPr>
+        <w:spacing w:line="360" w:lineRule="auto"/>
+        <w:jc w:val="both"/>
+      </w:pPr>
+      <w:r>
+        <w:t>Subsequently, to aggregate all ATT(g,t) estimates into a single summary parameter, the authors propose the following aggregation strategy:</w:t>
+      </w:r>
+    </w:p>
+    <w:p>
+      <w:pPr>
+        <w:spacing w:line="360" w:lineRule="auto"/>
+        <w:jc w:val="both"/>
+      </w:pPr>
+    </w:p>
+    <w:p>
+      <w:pPr>
+        <w:spacing w:line="360" w:lineRule="auto"/>
+        <w:jc w:val="both"/>
+      </w:pPr>
+      <w:r>
+        <w:t xml:space="preserve">\begin{equation} </w:t>
+      </w:r>
+    </w:p>
+    <w:p>
+      <w:pPr>
+        <w:spacing w:line="360" w:lineRule="auto"/>
+        <w:jc w:val="both"/>
+      </w:pPr>
+      <w:r>
+        <w:t>\theta = \sum_{g \in \mathcal{G}} \sum_{t=2}^{\mathcal{T}} w(g, t) \cdot ATT(g, t) \end{equation}</w:t>
+      </w:r>
+      <w:r>
+        <w:t>\\</w:t>
+      </w:r>
+    </w:p>
+    <w:p>
+      <w:pPr>
+        <w:spacing w:line="360" w:lineRule="auto"/>
+        <w:jc w:val="both"/>
+      </w:pPr>
+    </w:p>
+    <w:p>
+      <w:pPr>
+        <w:spacing w:line="360" w:lineRule="auto"/>
+        <w:jc w:val="both"/>
+      </w:pPr>
+      <w:r>
+        <w:t>Where </w:t>
+      </w:r>
+      <w:r>
+        <w:t>$</w:t>
+      </w:r>
+      <w:r>
+        <w:t>w(g,t)</w:t>
+      </w:r>
+      <w:r>
+        <w:t>$</w:t>
+      </w:r>
+      <w:r>
+        <w:t xml:space="preserve"> represents the weights determined by the researcher. In this analysis, I employ a simple averaging scheme </w:t>
+      </w:r>
+      <w:r>
+        <w:t>m</w:t>
+      </w:r>
+      <w:r>
+        <w:t>where w(g,t)</w:t>
+      </w:r>
+      <w:r>
+        <w:t xml:space="preserve"> is the same</w:t>
+      </w:r>
+      <w:r>
+        <w:t xml:space="preserve"> for all treated periods. The objective of this comparison is to determine if the Callaway </w:t>
+      </w:r>
+      <w:r>
+        <w:t>\</w:t>
+      </w:r>
+      <w:r>
+        <w:t xml:space="preserve">&amp; Sant’Anna (CS) estimates </w:t>
+      </w:r>
+      <w:r>
+        <w:t xml:space="preserve">an Events Studies </w:t>
+      </w:r>
+      <w:r>
+        <w:t>align with the Two-Way Fixed Effects (TWFE) results. A similar behavior between the two models would reinforce the validity of the TWFE estimates and suggest that</w:t>
+      </w:r>
+      <w:r>
+        <w:t xml:space="preserve"> the possible bias of heterogeneous effects is not a preoccupation</w:t>
+      </w:r>
+    </w:p>
+    <w:p>
+      <w:pPr>
+        <w:spacing w:line="360" w:lineRule="auto"/>
+        <w:jc w:val="both"/>
+      </w:pPr>
+      <w:r>
+        <w:t>\parencite{RiosAvila_Callaway_SantAnna_2021_csdid_slides,Callaway_SantAnna_2021}.</w:t>
+      </w:r>
+    </w:p>
+    <w:p>
+      <w:pPr>
+        <w:jc w:val="both"/>
         <w:rPr>
           <w:b/>
           <w:bCs/>
         </w:rPr>
-        <w:t>RESULTS</w:t>
-      </w:r>
-    </w:p>
-    <w:p>
-      <w:pPr>
-        <w:spacing w:line="360" w:lineRule="auto"/>
-        <w:jc w:val="both"/>
-      </w:pPr>
-    </w:p>
-    <w:p>
-      <w:pPr>
-        <w:spacing w:line="360" w:lineRule="auto"/>
-        <w:jc w:val="both"/>
-      </w:pPr>
-    </w:p>
-    <w:p>
-      <w:pPr>
-        <w:jc w:val="both"/>
+      </w:pPr>
+      <w:r>
         <w:rPr>
           <w:b/>
           <w:bCs/>
         </w:rPr>
-      </w:pPr>
-      <w:r>
+        <w:lastRenderedPageBreak/>
+        <w:t>RESULTS</w:t>
+      </w:r>
+    </w:p>
+    <w:p>
+      <w:pPr>
+        <w:jc w:val="both"/>
         <w:rPr>
           <w:b/>
           <w:bCs/>
         </w:rPr>
-        <w:t>DISCUSSION</w:t>
+      </w:pPr>
+    </w:p>
+    <w:p>
+      <w:pPr>
+        <w:spacing w:line="360" w:lineRule="auto"/>
+        <w:jc w:val="both"/>
+      </w:pPr>
+      <w:r>
+        <w:t>Table</w:t>
+      </w:r>
+      <w:r>
+        <w:t>~\ref{</w:t>
+      </w:r>
+      <w:r>
+        <w:t>tab:resultados_regresion</w:t>
+      </w:r>
+      <w:r>
+        <w:t>}</w:t>
+      </w:r>
+      <w:r>
+        <w:t xml:space="preserve"> </w:t>
+      </w:r>
+      <w:r>
+        <w:t>presents</w:t>
+      </w:r>
+      <w:r>
+        <w:t xml:space="preserve"> </w:t>
+      </w:r>
+      <w:r>
+        <w:t xml:space="preserve">the estimates for the equation </w:t>
+      </w:r>
+      <w:r>
+        <w:t>~\ref{</w:t>
+      </w:r>
+      <w:r>
+        <w:t>eq:twfe</w:t>
+      </w:r>
+      <w:r>
+        <w:t>}</w:t>
+      </w:r>
+      <w:r>
+        <w:t xml:space="preserve"> for each type of crime. </w:t>
+      </w:r>
+      <w:r>
+        <w:t>All estimates, except the one of Homicide, show that OXXO presence in an UPZ reduces crime activity. Nonetheless, these results, including sexual offences, thefts to motorbike and vehicle crimes, are statistically insignificant, suggesting that OXXO presence does not affect crime activity at the UPZ level.\\</w:t>
+      </w:r>
+    </w:p>
+    <w:p>
+      <w:pPr>
+        <w:spacing w:line="360" w:lineRule="auto"/>
+        <w:jc w:val="both"/>
+      </w:pPr>
+    </w:p>
+    <w:p>
+      <w:pPr>
+        <w:spacing w:line="360" w:lineRule="auto"/>
+        <w:jc w:val="both"/>
+      </w:pPr>
+      <w:r>
+        <w:t>Homicide is the only crime category for which the estimated effect is statistically significant. The results suggest that the arrival of an OXXO store in a UPZ increases the homicide rate by 0.0699 homicides per 10,000 inhabitants relative to a UPZ without an OXXO store.</w:t>
+      </w:r>
+      <w:r>
+        <w:t xml:space="preserve"> </w:t>
+      </w:r>
+      <w:r>
+        <w:t>Comparing with the mean of the never treated group, this represents a relative increment of</w:t>
+      </w:r>
+      <w:r>
+        <w:t xml:space="preserve"> </w:t>
+      </w:r>
+      <w:r>
+        <w:t xml:space="preserve"> 9,68\%. </w:t>
+      </w:r>
+      <w:r>
+        <w:t xml:space="preserve">The effect for this crime runs counter to </w:t>
+      </w:r>
+      <w:r>
+        <w:t xml:space="preserve">my </w:t>
+      </w:r>
+      <w:r>
+        <w:t xml:space="preserve">expectations, as </w:t>
+      </w:r>
+      <w:r>
+        <w:t xml:space="preserve">I </w:t>
+      </w:r>
+      <w:r>
+        <w:t xml:space="preserve">expected </w:t>
+      </w:r>
+      <w:r>
+        <w:t xml:space="preserve"> t</w:t>
+      </w:r>
+      <w:r>
+        <w:t>heft</w:t>
+      </w:r>
+      <w:r>
+        <w:t xml:space="preserve"> to people</w:t>
+      </w:r>
+      <w:r>
+        <w:t xml:space="preserve"> crime</w:t>
+      </w:r>
+      <w:r>
+        <w:t xml:space="preserve"> </w:t>
+      </w:r>
+      <w:r>
+        <w:t xml:space="preserve">to exhibit </w:t>
+      </w:r>
+      <w:r>
+        <w:t xml:space="preserve">a </w:t>
+      </w:r>
+      <w:r>
+        <w:t>statistically significant coefficient</w:t>
+      </w:r>
+      <w:r>
+        <w:t xml:space="preserve"> </w:t>
+      </w:r>
+      <w:r>
+        <w:t xml:space="preserve">and, if homicide </w:t>
+      </w:r>
+      <w:r>
+        <w:t>was</w:t>
+      </w:r>
+      <w:r>
+        <w:t xml:space="preserve"> also significant, </w:t>
+      </w:r>
+      <w:r>
+        <w:t xml:space="preserve">I expected both </w:t>
+      </w:r>
+      <w:r>
+        <w:t>effects to move in the same direction.</w:t>
+      </w:r>
+      <w:r>
+        <w:t>\\</w:t>
+      </w:r>
+    </w:p>
+    <w:p>
+      <w:pPr>
+        <w:spacing w:line="360" w:lineRule="auto"/>
+        <w:jc w:val="both"/>
+      </w:pPr>
+    </w:p>
+    <w:p>
+      <w:pPr>
+        <w:spacing w:line="360" w:lineRule="auto"/>
+        <w:jc w:val="both"/>
+      </w:pPr>
+      <w:r>
+        <w:t>Figure</w:t>
+      </w:r>
+      <w:r>
+        <w:t>~\ref{</w:t>
+      </w:r>
+      <w:r>
+        <w:t>fig:fourpanelESFE</w:t>
+      </w:r>
+      <w:r>
+        <w:t>}</w:t>
+      </w:r>
+      <w:r>
+        <w:t xml:space="preserve"> shows the events stud</w:t>
+      </w:r>
+      <w:r>
+        <w:t xml:space="preserve">y </w:t>
+      </w:r>
+      <w:r>
+        <w:t>(ES) of each crime type for the TWFE approach. In terms of parallel trends assumption, it can be observed that both theft to people and sexual offences violate the condition near period -1, meaning that their estimates are not correctly identified with this empirical strategy. Other, crimes do not show this problem, and after the first OXXO arrival they maintain statatistically insignificant dynamic effects, which allign with the coefficients’</w:t>
+      </w:r>
+      <w:r>
+        <w:t xml:space="preserve"> </w:t>
+      </w:r>
+      <w:r>
+        <w:t>of Table</w:t>
+      </w:r>
+      <w:r>
+        <w:t>~\ref{</w:t>
+      </w:r>
+      <w:r>
+        <w:t>tab:resultados_regresion</w:t>
+      </w:r>
+      <w:r>
+        <w:t>}</w:t>
+      </w:r>
+      <w:r>
+        <w:t>.\\</w:t>
+      </w:r>
+    </w:p>
+    <w:p>
+      <w:pPr>
+        <w:spacing w:line="360" w:lineRule="auto"/>
+        <w:jc w:val="both"/>
+      </w:pPr>
+    </w:p>
+    <w:p>
+      <w:pPr>
+        <w:spacing w:line="360" w:lineRule="auto"/>
+        <w:jc w:val="both"/>
+      </w:pPr>
+      <w:r>
+        <w:t xml:space="preserve">Theft to people exhibits a counterintuitive pattern in terms of dynamic effects. </w:t>
+      </w:r>
+      <w:r>
+        <w:t>It</w:t>
+      </w:r>
+      <w:r>
+        <w:t xml:space="preserve"> suggests that, following the opening of the first OXXO store, theft tends to increase over time. This tendency contrasts with the coefficient previously reported in Table ~\ref{tab:resultados_regresion}, where the overall effect is negative and statistically insignificant. While this pattern could suggest that OXXO increases theft activity in the medium and long term, such an interpretation would only hold if the parallel trends were satisfied</w:t>
+      </w:r>
+      <w:r>
+        <w:t xml:space="preserve"> and if the estimator </w:t>
+      </w:r>
+      <w:r>
+        <w:t>of Table</w:t>
+      </w:r>
+      <w:r>
+        <w:t>~\ref{</w:t>
+      </w:r>
+      <w:r>
+        <w:t>tab:resultados_regresion</w:t>
+      </w:r>
+      <w:r>
+        <w:t>}</w:t>
+      </w:r>
+      <w:r>
+        <w:t xml:space="preserve"> </w:t>
+      </w:r>
+      <w:r>
+        <w:t xml:space="preserve">had the </w:t>
+      </w:r>
+      <w:r>
+        <w:t>same sign</w:t>
+      </w:r>
+      <w:r>
+        <w:t xml:space="preserve"> as the </w:t>
+      </w:r>
+      <w:r>
+        <w:t xml:space="preserve">ES </w:t>
+      </w:r>
+      <w:r>
+        <w:t>tendency</w:t>
+      </w:r>
+      <w:r>
+        <w:t>. Since th</w:t>
+      </w:r>
+      <w:r>
+        <w:t>ese conditions are</w:t>
+      </w:r>
+      <w:r>
+        <w:t xml:space="preserve"> </w:t>
+      </w:r>
+      <w:r>
+        <w:t>not met</w:t>
+      </w:r>
+      <w:r>
+        <w:t>, it is more likely that the TWFE coefficient is biased and incorrectly identified.</w:t>
+      </w:r>
+      <w:r>
+        <w:t>\\</w:t>
+      </w:r>
+    </w:p>
+    <w:p>
+      <w:pPr>
+        <w:spacing w:line="360" w:lineRule="auto"/>
+        <w:jc w:val="both"/>
+      </w:pPr>
+    </w:p>
+    <w:p>
+      <w:pPr>
+        <w:spacing w:line="360" w:lineRule="auto"/>
+        <w:jc w:val="both"/>
+      </w:pPr>
+      <w:r>
+        <w:lastRenderedPageBreak/>
+        <w:t>T</w:t>
+      </w:r>
+      <w:r>
+        <w:t xml:space="preserve">he CS </w:t>
+      </w:r>
+      <w:r>
+        <w:t>approach</w:t>
+      </w:r>
+      <w:r>
+        <w:t xml:space="preserve"> </w:t>
+      </w:r>
+      <w:r>
+        <w:t xml:space="preserve">will be useful </w:t>
+      </w:r>
+      <w:r>
+        <w:t>to examine this hypothesis and assess the possibility of heterogeneous</w:t>
+      </w:r>
+      <w:r>
+        <w:t xml:space="preserve"> </w:t>
+      </w:r>
+      <w:r>
+        <w:t xml:space="preserve">effects in the TWFE results. Although I applied the Goodman-Bacon decomposition to each regression and obtained positive weights, the CS estimator serves as an additional robustness check to verify the absence of bias if both approaches </w:t>
+      </w:r>
+      <w:r>
+        <w:t xml:space="preserve">(TWFE and </w:t>
+      </w:r>
+      <w:r>
+        <w:t>CS</w:t>
+      </w:r>
+      <w:r>
+        <w:t xml:space="preserve">) </w:t>
+      </w:r>
+      <w:r>
+        <w:t>display similar patterns.</w:t>
+      </w:r>
+      <w:r>
+        <w:t xml:space="preserve"> Table</w:t>
+      </w:r>
+      <w:r>
+        <w:t>~\ref{tab:resultados_ES}</w:t>
+      </w:r>
+      <w:r>
+        <w:t xml:space="preserve"> shows the ATT comparison </w:t>
+      </w:r>
+      <w:r>
+        <w:t xml:space="preserve"> between TWFE and CS</w:t>
+      </w:r>
+      <w:r>
+        <w:t>. Despite coefficients are not exactly the same, most of them present the same direction and a similar magnitude, and most maintain statistically insignificant, suggesting absense of bias.</w:t>
+      </w:r>
+      <w:r>
+        <w:t>\\</w:t>
+      </w:r>
+      <w:r>
+        <w:t xml:space="preserve"> </w:t>
+      </w:r>
+    </w:p>
+    <w:p>
+      <w:pPr>
+        <w:spacing w:line="360" w:lineRule="auto"/>
+        <w:jc w:val="both"/>
+      </w:pPr>
+    </w:p>
+    <w:p>
+      <w:pPr>
+        <w:spacing w:line="360" w:lineRule="auto"/>
+        <w:jc w:val="both"/>
+        <w:rPr>
+          <w:lang w:val="en-US"/>
+        </w:rPr>
+      </w:pPr>
+      <w:commentRangeStart w:id="1"/>
+      <w:r>
+        <w:t>Homicide requires further examination, as both estimators produce coefficients of similar magnitude and direction, yet the estimate becomes statistically insignificant under the CS specification. Given the consistency of the estimated effects across approaches, the difference appears to stem primarily from a loss of statistical precision rather than from a substantive change in the estimated impact. Therefore, I place greater emphasis on the TWFE estimate when interpreting the effect of OXXO presence on homicide rates.</w:t>
+      </w:r>
+      <w:r>
+        <w:rPr>
+          <w:lang w:val="en-US"/>
+        </w:rPr>
+        <w:t>\\</w:t>
+      </w:r>
+      <w:commentRangeEnd w:id="1"/>
+      <w:r>
+        <w:rPr>
+          <w:rStyle w:val="CommentReference"/>
+        </w:rPr>
+        <w:commentReference w:id="1"/>
+      </w:r>
+    </w:p>
+    <w:p>
+      <w:pPr>
+        <w:spacing w:line="360" w:lineRule="auto"/>
+        <w:jc w:val="both"/>
+      </w:pPr>
+    </w:p>
+    <w:p>
+      <w:pPr>
+        <w:spacing w:line="360" w:lineRule="auto"/>
+        <w:jc w:val="both"/>
+      </w:pPr>
+      <w:r>
+        <w:t>Apart from contrasting the ATTs, Figure</w:t>
+      </w:r>
+      <w:r>
+        <w:t>~\ref{</w:t>
+      </w:r>
+      <w:r>
+        <w:t>f</w:t>
+      </w:r>
+      <w:r>
+        <w:t>ig:fourpanelESCompared</w:t>
+      </w:r>
+      <w:r>
+        <w:t xml:space="preserve">} compares how the CS and TWFE ES behave in each crime type. These graphs reveal that both have a similar evolution in most crimes, which again indicate that there is no bias in the TWFE specification. Additionally, </w:t>
+      </w:r>
+      <w:r>
+        <w:t>CS</w:t>
+      </w:r>
+      <w:r>
+        <w:t xml:space="preserve"> ES present more robust results as all crimes satisfy the parallel trends assumption, this indicates that Sexual Offenses and Theft to People CS estimates are more reliable.</w:t>
+      </w:r>
+      <w:r>
+        <w:t>\\</w:t>
+      </w:r>
+    </w:p>
+    <w:p>
+      <w:pPr>
+        <w:spacing w:line="360" w:lineRule="auto"/>
+        <w:jc w:val="both"/>
+      </w:pPr>
+    </w:p>
+    <w:p>
+      <w:pPr>
+        <w:spacing w:line="360" w:lineRule="auto"/>
+        <w:jc w:val="both"/>
+      </w:pPr>
+      <w:r>
+        <w:t>Theft to people is the only crime category that exhibits a clear temporal trend in both the TWFE and CS event studies after the opening of the first OXXO store; however, the estimated trends differ in direction across the two specifications. These differences can be explained by the nature of each event</w:t>
+      </w:r>
+      <w:r>
+        <w:t xml:space="preserve"> </w:t>
+      </w:r>
+      <w:r>
+        <w:t>study approach.</w:t>
+      </w:r>
+      <w:r>
+        <w:t xml:space="preserve"> </w:t>
+      </w:r>
+      <w:r>
+        <w:t xml:space="preserve">The TWFE specification only considers treated units and includes always-treated observations. </w:t>
+      </w:r>
+      <w:r>
+        <w:t>I</w:t>
+      </w:r>
+      <w:r>
+        <w:t>n fact, during this perio</w:t>
+      </w:r>
+      <w:r>
+        <w:t>d</w:t>
+      </w:r>
+      <w:r>
+        <w:t xml:space="preserve"> </w:t>
+      </w:r>
+      <w:r>
+        <w:t>(</w:t>
+      </w:r>
+      <w:r>
+        <w:t xml:space="preserve">from </w:t>
+      </w:r>
+      <w:r>
+        <w:t>2015 to 2018</w:t>
+      </w:r>
+      <w:r>
+        <w:t>)</w:t>
+      </w:r>
+      <w:r>
+        <w:t>, 65</w:t>
+      </w:r>
+      <w:r>
+        <w:t>\</w:t>
+      </w:r>
+      <w:r>
+        <w:t>% of the 2</w:t>
+      </w:r>
+      <w:r>
+        <w:t>6</w:t>
+      </w:r>
+      <w:r>
+        <w:t xml:space="preserve"> treated UPZs were already treated at the beginning of the sample, leaving only nine UPZs that received treatment after 2015-Q1. In contrast, the CS excludes always-treated units and compares only these nine newly treated UPZs with not-yet-treated </w:t>
+      </w:r>
+      <w:r>
+        <w:t>ones</w:t>
+      </w:r>
+      <w:r>
+        <w:t>.</w:t>
+      </w:r>
+      <w:r>
+        <w:t xml:space="preserve"> </w:t>
+      </w:r>
+      <w:r>
+        <w:t xml:space="preserve">This indicates that the positive trend observed in the TWFE specification is largely driven by the always-treated UPZs, whereas the control units </w:t>
+      </w:r>
+      <w:r>
+        <w:lastRenderedPageBreak/>
+        <w:t xml:space="preserve">in the CS one </w:t>
+      </w:r>
+      <w:r>
+        <w:t>offset these differences by providing a more appropriate counterfactual.</w:t>
+      </w:r>
+      <w:r>
+        <w:t xml:space="preserve"> </w:t>
+      </w:r>
+      <w:r>
+        <w:t>Overall, this evidence reinforces the interpretation that the TWFE coefficient for theft to people is biased and does not accurately identify the causal effect of OXXO entry.</w:t>
+      </w:r>
+      <w:r>
+        <w:t>\\</w:t>
+      </w:r>
+    </w:p>
+    <w:p>
+      <w:pPr>
+        <w:spacing w:line="360" w:lineRule="auto"/>
+        <w:jc w:val="both"/>
+      </w:pPr>
+    </w:p>
+    <w:p>
+      <w:pPr>
+        <w:spacing w:line="360" w:lineRule="auto"/>
+        <w:jc w:val="both"/>
+      </w:pPr>
+      <w:r>
+        <w:t>Finally, Table~\ref{tab:resultados_regresion_intensity} presents the TWFE estimates using treatment intensity. The results differ substantially from those reported in Table~\ref{tab:resultados_regresion}. In particular, theft to people becomes positive and statistically significant, a finding that is consistent with the hypothesis that OXXO stores may act as crime attractors.</w:t>
+      </w:r>
+      <w:r>
+        <w:rPr>
+          <w:color w:val="000000"/>
+        </w:rPr>
+        <w:t xml:space="preserve"> </w:t>
+      </w:r>
+      <w:r>
+        <w:t>However, the estimated magnitude is considerably large and raises concerns about the robustness of the result, particularly given the substantial variation in the estimated effect for theft to people across specifications. Theft to motorbike also becomes statistically significant while retaining a negative coefficient.</w:t>
+      </w:r>
+    </w:p>
+    <w:p>
+      <w:pPr>
+        <w:spacing w:line="360" w:lineRule="auto"/>
+        <w:jc w:val="both"/>
+      </w:pPr>
+    </w:p>
+    <w:p>
+      <w:pPr>
+        <w:spacing w:line="360" w:lineRule="auto"/>
+        <w:jc w:val="both"/>
+        <w:rPr>
+          <w:lang w:val="en-US"/>
+        </w:rPr>
+      </w:pPr>
+      <w:r>
+        <w:t xml:space="preserve">Incorporating treatment intensity constitutes a relevant extension of the baseline analysis, given the heterogeneous evolution in the number of OXXO stores across treatment cohorts illustrated in Figure~\ref{fig:Treatment_intensity}. The intensity specification may better capture differences in exposure to OXXO presence that are not reflected by a binary treatment indicator. Since the Callaway and Sant’Anna estimator is not defined for continuous treatment intensity, these estimates cannot be directly validated using </w:t>
+      </w:r>
+      <w:r>
+        <w:t>this approach</w:t>
+      </w:r>
+      <w:r>
+        <w:t>.</w:t>
+      </w:r>
+      <w:r>
+        <w:rPr>
+          <w:lang w:val="en-US"/>
+        </w:rPr>
+        <w:t>\\</w:t>
+      </w:r>
+    </w:p>
+    <w:p>
+      <w:pPr>
+        <w:spacing w:line="360" w:lineRule="auto"/>
+        <w:jc w:val="both"/>
+        <w:rPr>
+          <w:lang w:val="en-US"/>
+        </w:rPr>
+      </w:pPr>
+    </w:p>
+    <w:p>
+      <w:pPr>
+        <w:spacing w:line="360" w:lineRule="auto"/>
+        <w:jc w:val="both"/>
+      </w:pPr>
+      <w:r>
+        <w:t xml:space="preserve">As an additional robustness check, I included the presence of other convenience store chains, namely Justo </w:t>
+      </w:r>
+      <w:r>
+        <w:t>\</w:t>
+      </w:r>
+      <w:r>
+        <w:t>&amp; Bueno, D1, and Ara, as controls in all specifications. The inclusion of these variables did not substantially alter the main results. In general, the estimated effects became statistically insignificant across all crime categories and, in some cases, the violation of the parallel trends assumption became more pronounced. For the treatment-intensity specification, the coefficient for theft to people decreased in magnitude, although the overall pattern of results remained unchanged. The complete set of estimates is reported in Appendix~\ref{sec:otherresultstable}</w:t>
+      </w:r>
+      <w:r>
+        <w:t>.</w:t>
+      </w:r>
+    </w:p>
+    <w:p>
+      <w:pPr>
+        <w:spacing w:line="360" w:lineRule="auto"/>
+        <w:jc w:val="both"/>
+      </w:pPr>
+    </w:p>
+    <w:p>
+      <w:pPr>
+        <w:jc w:val="both"/>
+        <w:rPr>
+          <w:lang w:val="en-US"/>
+        </w:rPr>
+      </w:pPr>
+      <w:commentRangeStart w:id="2"/>
+      <w:r>
+        <w:rPr>
+          <w:highlight w:val="magenta"/>
+          <w:lang w:val="en-US"/>
+        </w:rPr>
+        <w:t xml:space="preserve">The number of UPZs used for the analysis was reduced compared to the number used in the </w:t>
+      </w:r>
+      <w:proofErr w:type="spellStart"/>
+      <w:r>
+        <w:rPr>
+          <w:highlight w:val="magenta"/>
+          <w:lang w:val="en-US"/>
+        </w:rPr>
+        <w:t>Stadistical</w:t>
+      </w:r>
+      <w:proofErr w:type="spellEnd"/>
+      <w:r>
+        <w:rPr>
+          <w:highlight w:val="magenta"/>
+          <w:lang w:val="en-US"/>
+        </w:rPr>
+        <w:t xml:space="preserve"> analysis section because there are some UPZs in which the number of OXXO establishments decreased over the years.</w:t>
+      </w:r>
+      <w:r>
+        <w:rPr>
+          <w:lang w:val="en-US"/>
+        </w:rPr>
+        <w:t xml:space="preserve"> </w:t>
+      </w:r>
+      <w:commentRangeEnd w:id="2"/>
+      <w:r>
+        <w:rPr>
+          <w:rStyle w:val="CommentReference"/>
+        </w:rPr>
+        <w:commentReference w:id="2"/>
       </w:r>
     </w:p>
     <w:p>
@@ -4919,81 +5480,28 @@
           <w:bCs/>
         </w:rPr>
       </w:pPr>
-    </w:p>
-    <w:p>
-      <w:pPr>
-        <w:spacing w:line="360" w:lineRule="auto"/>
-        <w:ind w:firstLine="720"/>
-        <w:jc w:val="both"/>
-      </w:pPr>
-      <w:r>
-        <w:rPr>
-          <w:highlight w:val="yellow"/>
-        </w:rPr>
-        <w:t>Their concentration in high foot-traffic areas increases the availability of potential targets for crimes such as robbery or assault</w:t>
-      </w:r>
-      <w:r>
-        <w:rPr>
-          <w:highlight w:val="yellow"/>
-        </w:rPr>
-        <w:t xml:space="preserve"> </w:t>
-      </w:r>
-      <w:r>
-        <w:t>\parencite{Dugato2026, shin2024dollar}</w:t>
-      </w:r>
-      <w:r>
-        <w:rPr>
-          <w:highlight w:val="yellow"/>
-        </w:rPr>
-        <w:t>.</w:t>
-      </w:r>
-      <w:r>
-        <w:t xml:space="preserve"> </w:t>
-      </w:r>
-      <w:r>
-        <w:t>Moreover</w:t>
-      </w:r>
-      <w:r>
-        <w:t xml:space="preserve">, due to their 24-hour format and alcohol sales during the night, OXXO locations </w:t>
-      </w:r>
-      <w:r>
-        <w:t xml:space="preserve">may </w:t>
-      </w:r>
-      <w:r>
-        <w:t xml:space="preserve">serve </w:t>
-      </w:r>
-      <w:r>
-        <w:t>as informal gathering point</w:t>
-      </w:r>
-      <w:r>
-        <w:t xml:space="preserve">s </w:t>
-      </w:r>
-      <w:r>
-        <w:t>which can, under certain conditions,</w:t>
-      </w:r>
-      <w:r>
-        <w:t xml:space="preserve"> </w:t>
-      </w:r>
-      <w:r>
-        <w:t>escalate into conflicts or provide opportunities for illicit activities</w:t>
-      </w:r>
-      <w:r>
-        <w:t xml:space="preserve"> \parencite</w:t>
-      </w:r>
-      <w:r>
-        <w:t>{Dugato2026}</w:t>
-      </w:r>
-      <w:r>
-        <w:t>.</w:t>
-      </w:r>
-    </w:p>
-    <w:p>
-      <w:pPr>
-        <w:jc w:val="both"/>
+      <w:r>
         <w:rPr>
           <w:b/>
           <w:bCs/>
         </w:rPr>
+        <w:lastRenderedPageBreak/>
+        <w:t>ROBUSTNESS CHECKS</w:t>
+      </w:r>
+    </w:p>
+    <w:p>
+      <w:pPr>
+        <w:spacing w:line="360" w:lineRule="auto"/>
+        <w:jc w:val="both"/>
+        <w:rPr>
+          <w:lang w:val="en-US"/>
+        </w:rPr>
+      </w:pPr>
+    </w:p>
+    <w:p>
+      <w:pPr>
+        <w:spacing w:line="360" w:lineRule="auto"/>
+        <w:jc w:val="both"/>
       </w:pPr>
     </w:p>
     <w:p>
@@ -5004,34 +5512,174 @@
           <w:bCs/>
         </w:rPr>
       </w:pPr>
-    </w:p>
-    <w:p>
-      <w:pPr>
-        <w:jc w:val="both"/>
+      <w:r>
         <w:rPr>
           <w:b/>
           <w:bCs/>
         </w:rPr>
-      </w:pPr>
-      <w:r>
+        <w:t>DISCUSSION</w:t>
+      </w:r>
+    </w:p>
+    <w:p>
+      <w:pPr>
+        <w:jc w:val="both"/>
         <w:rPr>
           <w:b/>
           <w:bCs/>
         </w:rPr>
-        <w:t>ROBUSTNESS CHECKS</w:t>
-      </w:r>
-    </w:p>
-    <w:p>
-      <w:pPr>
+      </w:pPr>
+    </w:p>
+    <w:p>
+      <w:pPr>
+        <w:spacing w:line="360" w:lineRule="auto"/>
+        <w:ind w:firstLine="720"/>
+        <w:jc w:val="both"/>
+      </w:pPr>
+      <w:r>
+        <w:rPr>
+          <w:highlight w:val="yellow"/>
+        </w:rPr>
+        <w:t>Their concentration in high foot-traffic areas increases the availability of potential targets for crimes such as robbery or assault</w:t>
+      </w:r>
+      <w:r>
+        <w:rPr>
+          <w:highlight w:val="yellow"/>
+        </w:rPr>
+        <w:t xml:space="preserve"> </w:t>
+      </w:r>
+      <w:r>
+        <w:t>\parencite{Dugato2026, shin2024dollar}</w:t>
+      </w:r>
+      <w:r>
+        <w:rPr>
+          <w:highlight w:val="yellow"/>
+        </w:rPr>
+        <w:t>.</w:t>
+      </w:r>
+      <w:r>
+        <w:t xml:space="preserve"> </w:t>
+      </w:r>
+      <w:r>
+        <w:t>Moreover</w:t>
+      </w:r>
+      <w:r>
+        <w:t xml:space="preserve">, due to their 24-hour format and alcohol sales during the night, OXXO locations </w:t>
+      </w:r>
+      <w:r>
+        <w:t xml:space="preserve">may </w:t>
+      </w:r>
+      <w:r>
+        <w:t xml:space="preserve">serve </w:t>
+      </w:r>
+      <w:r>
+        <w:t>as informal gathering point</w:t>
+      </w:r>
+      <w:r>
+        <w:t xml:space="preserve">s </w:t>
+      </w:r>
+      <w:r>
+        <w:t>which can, under certain conditions,</w:t>
+      </w:r>
+      <w:r>
+        <w:t xml:space="preserve"> </w:t>
+      </w:r>
+      <w:r>
+        <w:t>escalate into conflicts or provide opportunities for illicit activities</w:t>
+      </w:r>
+      <w:r>
+        <w:t xml:space="preserve"> \parencite</w:t>
+      </w:r>
+      <w:r>
+        <w:t>{Dugato2026}</w:t>
+      </w:r>
+      <w:r>
+        <w:t>.</w:t>
+      </w:r>
+    </w:p>
+    <w:p>
+      <w:pPr>
+        <w:jc w:val="both"/>
+      </w:pPr>
+      <w:r>
+        <w:t>First, property crimes like theft are highly sensitive to situational deterrence mechanisms. The typical business model of OXXO stores includes 24/7 bright exterior lighting, high-definition security cameras, and a continuous influx of pedestrian traffic. According to the Routine Activity Theory and Jane Jacobs' concept of "eyes on the street," this increased natural surveillance drastically reduces the window of opportunity for street-level robbers, who generally seek dark, isolated areas. This operational nature explains the negative direction of the theft coefficients.</w:t>
+      </w:r>
+    </w:p>
+    <w:p>
+      <w:pPr>
+        <w:jc w:val="both"/>
+      </w:pPr>
+      <w:r>
+        <w:t>Second, the contrast in statistical significance may be heavily driven by severe underreporting (</w:t>
+      </w:r>
+      <w:r>
+        <w:rPr>
+          <w:i/>
+          <w:iCs/>
+        </w:rPr>
+        <w:t>cifra negra</w:t>
+      </w:r>
+      <w:r>
+        <w:t>) in official administrative data. In Bogotá, the transaction costs and lack of institutional trust often discourage citizens from formally reporting street thefts, generating substantial measurement error and inflating standard errors (as observed in the large standard error of 7.804 in Column 1). Conversely, homicides suffer from zero underreporting; every lethal event is strictly recorded by forensic and judicial authorities. Therefore, the statistical precision found exclusively in Column (3) might reflect data reliability rather than a true absence of shifting patterns in other crimes.</w:t>
+      </w:r>
+    </w:p>
+    <w:p>
+      <w:pPr>
+        <w:jc w:val="both"/>
+        <w:rPr>
+          <w:lang w:val="en-US"/>
+        </w:rPr>
+      </w:pPr>
+    </w:p>
+    <w:p>
+      <w:pPr>
+        <w:jc w:val="both"/>
+      </w:pPr>
+      <w:r>
+        <w:t>Finally, from a public order perspective, late-night convenience stores can inadvertently become focal points for nocturnal gatherings, alcohol consumption in adjacent public spaces, and minor disputes. In urban settings characterized by high baseline social friction, these dynamics can rapidly escalate into lethal altercations or gang-related territorial disputes. This phenomenon is widely documented in the "alcohol outlet density" literature, which links prolonged commercial hours with localized spikes in violent, rather than economic, crimes. Furthermore, since these estimates rely on a traditional Two-Way Fixed Effects (TWFE) framework under a staggered treatment design, part of this counterintuitive asymmetry could be exacerbated by negative weighting biases. If treatment effects vary dynamically over time, the traditional estimator might distort the true trajectory of property crime, a methodological limitation that highlights the necessity of the heterogeneous treatment robust estimators presented in the subsequent sections.</w:t>
+      </w:r>
+    </w:p>
+    <w:p>
+      <w:pPr>
+        <w:jc w:val="both"/>
+      </w:pPr>
+    </w:p>
+    <w:p>
+      <w:pPr>
+        <w:pStyle w:val="ListParagraph"/>
+        <w:numPr>
+          <w:ilvl w:val="0"/>
+          <w:numId w:val="26"/>
+        </w:numPr>
+        <w:jc w:val="both"/>
+      </w:pPr>
+      <w:r>
+        <w:t>Change the unit of analysis</w:t>
+      </w:r>
+    </w:p>
+    <w:p>
+      <w:pPr>
+        <w:pStyle w:val="ListParagraph"/>
+        <w:numPr>
+          <w:ilvl w:val="0"/>
+          <w:numId w:val="26"/>
+        </w:numPr>
         <w:jc w:val="both"/>
         <w:rPr>
           <w:b/>
           <w:bCs/>
         </w:rPr>
       </w:pPr>
-    </w:p>
-    <w:p>
-      <w:pPr>
+      <w:r>
+        <w:t>Treatment intensity plays a major role</w:t>
+      </w:r>
+    </w:p>
+    <w:p>
+      <w:pPr>
+        <w:pStyle w:val="ListParagraph"/>
+        <w:numPr>
+          <w:ilvl w:val="0"/>
+          <w:numId w:val="26"/>
+        </w:numPr>
         <w:jc w:val="both"/>
         <w:rPr>
           <w:b/>
@@ -5077,23 +5725,43 @@
       <w:pPr>
         <w:spacing w:line="360" w:lineRule="auto"/>
         <w:jc w:val="both"/>
-      </w:pPr>
-    </w:p>
-    <w:p>
-      <w:pPr>
-        <w:spacing w:line="360" w:lineRule="auto"/>
-        <w:jc w:val="both"/>
-      </w:pPr>
-    </w:p>
-    <w:p>
-      <w:pPr>
-        <w:spacing w:line="360" w:lineRule="auto"/>
-        <w:jc w:val="both"/>
-      </w:pPr>
-    </w:p>
-    <w:p>
-      <w:pPr>
-        <w:jc w:val="both"/>
+        <w:rPr>
+          <w:lang w:val="es-ES_tradnl"/>
+        </w:rPr>
+      </w:pPr>
+    </w:p>
+    <w:p>
+      <w:pPr>
+        <w:spacing w:line="360" w:lineRule="auto"/>
+        <w:jc w:val="both"/>
+        <w:rPr>
+          <w:lang w:val="es-ES_tradnl"/>
+        </w:rPr>
+      </w:pPr>
+    </w:p>
+    <w:p>
+      <w:pPr>
+        <w:spacing w:line="360" w:lineRule="auto"/>
+        <w:jc w:val="both"/>
+        <w:rPr>
+          <w:b/>
+          <w:bCs/>
+        </w:rPr>
+      </w:pPr>
+      <w:r>
+        <w:rPr>
+          <w:b/>
+          <w:bCs/>
+        </w:rPr>
+        <w:t>ACKNOWLEDGEMENTS</w:t>
+      </w:r>
+    </w:p>
+    <w:p>
+      <w:pPr>
+        <w:jc w:val="both"/>
+        <w:rPr>
+          <w:lang w:val="es-ES_tradnl"/>
+        </w:rPr>
       </w:pPr>
     </w:p>
     <w:sectPr>
@@ -5126,24 +5794,69 @@
       </w:r>
     </w:p>
   </w:comment>
+  <w:comment w:id="1" w:author="Sophia Aristizabal Florez" w:date="2026-05-31T16:58:00Z" w:initials="SA">
+    <w:p>
+      <w:r>
+        <w:rPr>
+          <w:rStyle w:val="CommentReference"/>
+        </w:rPr>
+        <w:annotationRef/>
+      </w:r>
+      <w:r>
+        <w:rPr>
+          <w:strike/>
+          <w:color w:val="000000"/>
+          <w:sz w:val="20"/>
+          <w:szCs w:val="20"/>
+        </w:rPr>
+        <w:t>Columns (3) and (4) show that sexual offenses constitute the second category and the only crime type for which the estimates differ substantially across specifications. The CS ATT is positive, a result that completely changes the interpretation of the effect. However, since both estimates are statistically insignificant, there is insufficient evidence to conclude that OXXO presence has any meaningful effect on this type of crime.\\</w:t>
+      </w:r>
+    </w:p>
+    <w:p/>
+  </w:comment>
+  <w:comment w:id="2" w:author="Sophia Aristizabal Florez" w:date="2026-05-28T00:00:00Z" w:initials="SA">
+    <w:p>
+      <w:r>
+        <w:rPr>
+          <w:rStyle w:val="CommentReference"/>
+        </w:rPr>
+        <w:annotationRef/>
+      </w:r>
+      <w:r>
+        <w:rPr>
+          <w:color w:val="000000"/>
+          <w:sz w:val="20"/>
+          <w:szCs w:val="20"/>
+        </w:rPr>
+        <w:t>FOOTNOTE</w:t>
+      </w:r>
+    </w:p>
+    <w:p/>
+  </w:comment>
 </w:comments>
 </file>
 
 <file path=word/commentsExtended.xml><?xml version="1.0" encoding="utf-8"?>
 <w15:commentsEx xmlns:wpc="http://schemas.microsoft.com/office/word/2010/wordprocessingCanvas" xmlns:cx="http://schemas.microsoft.com/office/drawing/2014/chartex" xmlns:cx1="http://schemas.microsoft.com/office/drawing/2015/9/8/chartex" xmlns:cx2="http://schemas.microsoft.com/office/drawing/2015/10/21/chartex" xmlns:cx3="http://schemas.microsoft.com/office/drawing/2016/5/9/chartex" xmlns:cx4="http://schemas.microsoft.com/office/drawing/2016/5/10/chartex" xmlns:cx5="http://schemas.microsoft.com/office/drawing/2016/5/11/chartex" xmlns:cx6="http://schemas.microsoft.com/office/drawing/2016/5/12/chartex" xmlns:cx7="http://schemas.microsoft.com/office/drawing/2016/5/13/chartex" xmlns:cx8="http://schemas.microsoft.com/office/drawing/2016/5/14/chartex" xmlns:mc="http://schemas.openxmlformats.org/markup-compatibility/2006" xmlns:aink="http://schemas.microsoft.com/office/drawing/2016/ink" xmlns:am3d="http://schemas.microsoft.com/office/drawing/2017/model3d" xmlns:o="urn:schemas-microsoft-com:office:office" xmlns:oel="http://schemas.microsoft.com/office/2019/extlst" xmlns:r="http://schemas.openxmlformats.org/officeDocument/2006/relationships" xmlns:m="http://schemas.openxmlformats.org/officeDocument/2006/math" xmlns:v="urn:schemas-microsoft-com:vml" xmlns:wp14="http://schemas.microsoft.com/office/word/2010/wordprocessingDrawing" xmlns:wp="http://schemas.openxmlformats.org/drawingml/2006/wordprocessingDrawing" xmlns:w10="urn:schemas-microsoft-com:office:word" xmlns:w="http://schemas.openxmlformats.org/wordprocessingml/2006/main" xmlns:w14="http://schemas.microsoft.com/office/word/2010/wordml" xmlns:w15="http://schemas.microsoft.com/office/word/2012/wordml" xmlns:w16cex="http://schemas.microsoft.com/office/word/2018/wordml/cex" xmlns:w16cid="http://schemas.microsoft.com/office/word/2016/wordml/cid" xmlns:w16="http://schemas.microsoft.com/office/word/2018/wordml" xmlns:w16du="http://schemas.microsoft.com/office/word/2023/wordml/word16du" xmlns:w16sdtdh="http://schemas.microsoft.com/office/word/2020/wordml/sdtdatahash" xmlns:w16sdtfl="http://schemas.microsoft.com/office/word/2024/wordml/sdtformatlock" xmlns:w16se="http://schemas.microsoft.com/office/word/2015/wordml/symex" xmlns:wpg="http://schemas.microsoft.com/office/word/2010/wordprocessingGroup" xmlns:wpi="http://schemas.microsoft.com/office/word/2010/wordprocessingInk" xmlns:wne="http://schemas.microsoft.com/office/word/2006/wordml" xmlns:wps="http://schemas.microsoft.com/office/word/2010/wordprocessingShape" mc:Ignorable="w14 w15 w16se w16cid w16 w16cex w16sdtdh w16sdtfl w16du wp14">
   <w15:commentEx w15:paraId="3BA4EB61" w15:done="0"/>
+  <w15:commentEx w15:paraId="557C8981" w15:done="0"/>
+  <w15:commentEx w15:paraId="6354BE00" w15:done="0"/>
 </w15:commentsEx>
 </file>
 
 <file path=word/commentsExtensible.xml><?xml version="1.0" encoding="utf-8"?>
 <w16cex:commentsExtensible xmlns:wpc="http://schemas.microsoft.com/office/word/2010/wordprocessingCanvas" xmlns:cx="http://schemas.microsoft.com/office/drawing/2014/chartex" xmlns:cx1="http://schemas.microsoft.com/office/drawing/2015/9/8/chartex" xmlns:cx2="http://schemas.microsoft.com/office/drawing/2015/10/21/chartex" xmlns:cx3="http://schemas.microsoft.com/office/drawing/2016/5/9/chartex" xmlns:cx4="http://schemas.microsoft.com/office/drawing/2016/5/10/chartex" xmlns:cx5="http://schemas.microsoft.com/office/drawing/2016/5/11/chartex" xmlns:cx6="http://schemas.microsoft.com/office/drawing/2016/5/12/chartex" xmlns:cx7="http://schemas.microsoft.com/office/drawing/2016/5/13/chartex" xmlns:cx8="http://schemas.microsoft.com/office/drawing/2016/5/14/chartex" xmlns:cr="http://schemas.microsoft.com/office/comments/2020/reactions" xmlns:mc="http://schemas.openxmlformats.org/markup-compatibility/2006" xmlns:aink="http://schemas.microsoft.com/office/drawing/2016/ink" xmlns:am3d="http://schemas.microsoft.com/office/drawing/2017/model3d" xmlns:o="urn:schemas-microsoft-com:office:office" xmlns:oel="http://schemas.microsoft.com/office/2019/extlst" xmlns:r="http://schemas.openxmlformats.org/officeDocument/2006/relationships" xmlns:m="http://schemas.openxmlformats.org/officeDocument/2006/math" xmlns:v="urn:schemas-microsoft-com:vml" xmlns:wp14="http://schemas.microsoft.com/office/word/2010/wordprocessingDrawing" xmlns:wp="http://schemas.openxmlformats.org/drawingml/2006/wordprocessingDrawing" xmlns:w10="urn:schemas-microsoft-com:office:word" xmlns:w="http://schemas.openxmlformats.org/wordprocessingml/2006/main" xmlns:w14="http://schemas.microsoft.com/office/word/2010/wordml" xmlns:w15="http://schemas.microsoft.com/office/word/2012/wordml" xmlns:w16cex="http://schemas.microsoft.com/office/word/2018/wordml/cex" xmlns:w16cid="http://schemas.microsoft.com/office/word/2016/wordml/cid" xmlns:w16="http://schemas.microsoft.com/office/word/2018/wordml" xmlns:w16du="http://schemas.microsoft.com/office/word/2023/wordml/word16du" xmlns:w16sdtdh="http://schemas.microsoft.com/office/word/2020/wordml/sdtdatahash" xmlns:w16sdtfl="http://schemas.microsoft.com/office/word/2024/wordml/sdtformatlock" xmlns:w16se="http://schemas.microsoft.com/office/word/2015/wordml/symex" xmlns:wpg="http://schemas.microsoft.com/office/word/2010/wordprocessingGroup" xmlns:wpi="http://schemas.microsoft.com/office/word/2010/wordprocessingInk" xmlns:wne="http://schemas.microsoft.com/office/word/2006/wordml" xmlns:wps="http://schemas.microsoft.com/office/word/2010/wordprocessingShape" mc:Ignorable="w14 w15 w16se w16cid w16 w16cex w16sdtdh w16sdtfl cr w16du wp14">
   <w16cex:commentExtensible w16cex:durableId="575F1562" w16cex:dateUtc="2026-04-19T07:18:00Z"/>
+  <w16cex:commentExtensible w16cex:durableId="743A4DFE" w16cex:dateUtc="2026-05-31T21:58:00Z"/>
+  <w16cex:commentExtensible w16cex:durableId="709562DF" w16cex:dateUtc="2026-05-28T05:00:00Z"/>
 </w16cex:commentsExtensible>
 </file>
 
 <file path=word/commentsIds.xml><?xml version="1.0" encoding="utf-8"?>
 <w16cid:commentsIds xmlns:wpc="http://schemas.microsoft.com/office/word/2010/wordprocessingCanvas" xmlns:cx="http://schemas.microsoft.com/office/drawing/2014/chartex" xmlns:cx1="http://schemas.microsoft.com/office/drawing/2015/9/8/chartex" xmlns:cx2="http://schemas.microsoft.com/office/drawing/2015/10/21/chartex" xmlns:cx3="http://schemas.microsoft.com/office/drawing/2016/5/9/chartex" xmlns:cx4="http://schemas.microsoft.com/office/drawing/2016/5/10/chartex" xmlns:cx5="http://schemas.microsoft.com/office/drawing/2016/5/11/chartex" xmlns:cx6="http://schemas.microsoft.com/office/drawing/2016/5/12/chartex" xmlns:cx7="http://schemas.microsoft.com/office/drawing/2016/5/13/chartex" xmlns:cx8="http://schemas.microsoft.com/office/drawing/2016/5/14/chartex" xmlns:mc="http://schemas.openxmlformats.org/markup-compatibility/2006" xmlns:aink="http://schemas.microsoft.com/office/drawing/2016/ink" xmlns:am3d="http://schemas.microsoft.com/office/drawing/2017/model3d" xmlns:o="urn:schemas-microsoft-com:office:office" xmlns:oel="http://schemas.microsoft.com/office/2019/extlst" xmlns:r="http://schemas.openxmlformats.org/officeDocument/2006/relationships" xmlns:m="http://schemas.openxmlformats.org/officeDocument/2006/math" xmlns:v="urn:schemas-microsoft-com:vml" xmlns:wp14="http://schemas.microsoft.com/office/word/2010/wordprocessingDrawing" xmlns:wp="http://schemas.openxmlformats.org/drawingml/2006/wordprocessingDrawing" xmlns:w10="urn:schemas-microsoft-com:office:word" xmlns:w="http://schemas.openxmlformats.org/wordprocessingml/2006/main" xmlns:w14="http://schemas.microsoft.com/office/word/2010/wordml" xmlns:w15="http://schemas.microsoft.com/office/word/2012/wordml" xmlns:w16cex="http://schemas.microsoft.com/office/word/2018/wordml/cex" xmlns:w16cid="http://schemas.microsoft.com/office/word/2016/wordml/cid" xmlns:w16="http://schemas.microsoft.com/office/word/2018/wordml" xmlns:w16du="http://schemas.microsoft.com/office/word/2023/wordml/word16du" xmlns:w16sdtdh="http://schemas.microsoft.com/office/word/2020/wordml/sdtdatahash" xmlns:w16sdtfl="http://schemas.microsoft.com/office/word/2024/wordml/sdtformatlock" xmlns:w16se="http://schemas.microsoft.com/office/word/2015/wordml/symex" xmlns:wpg="http://schemas.microsoft.com/office/word/2010/wordprocessingGroup" xmlns:wpi="http://schemas.microsoft.com/office/word/2010/wordprocessingInk" xmlns:wne="http://schemas.microsoft.com/office/word/2006/wordml" xmlns:wps="http://schemas.microsoft.com/office/word/2010/wordprocessingShape" mc:Ignorable="w14 w15 w16se w16cid w16 w16cex w16sdtdh w16sdtfl w16du wp14">
   <w16cid:commentId w16cid:paraId="3BA4EB61" w16cid:durableId="575F1562"/>
+  <w16cid:commentId w16cid:paraId="557C8981" w16cid:durableId="743A4DFE"/>
+  <w16cid:commentId w16cid:paraId="6354BE00" w16cid:durableId="709562DF"/>
 </w16cid:commentsIds>
 </file>
 
@@ -6249,6 +6962,95 @@
     </w:lvl>
   </w:abstractNum>
   <w:abstractNum w:abstractNumId="11" w15:restartNumberingAfterBreak="0">
+    <w:nsid w:val="36F75DB0"/>
+    <w:multiLevelType w:val="hybridMultilevel"/>
+    <w:tmpl w:val="1814397E"/>
+    <w:lvl w:ilvl="0" w:tplc="0409000F">
+      <w:start w:val="1"/>
+      <w:numFmt w:val="decimal"/>
+      <w:lvlText w:val="%1."/>
+      <w:lvlJc w:val="left"/>
+      <w:pPr>
+        <w:ind w:left="720" w:hanging="360"/>
+      </w:pPr>
+      <w:rPr>
+        <w:rFonts w:hint="default"/>
+      </w:rPr>
+    </w:lvl>
+    <w:lvl w:ilvl="1" w:tplc="04090019" w:tentative="1">
+      <w:start w:val="1"/>
+      <w:numFmt w:val="lowerLetter"/>
+      <w:lvlText w:val="%2."/>
+      <w:lvlJc w:val="left"/>
+      <w:pPr>
+        <w:ind w:left="1440" w:hanging="360"/>
+      </w:pPr>
+    </w:lvl>
+    <w:lvl w:ilvl="2" w:tplc="0409001B" w:tentative="1">
+      <w:start w:val="1"/>
+      <w:numFmt w:val="lowerRoman"/>
+      <w:lvlText w:val="%3."/>
+      <w:lvlJc w:val="right"/>
+      <w:pPr>
+        <w:ind w:left="2160" w:hanging="180"/>
+      </w:pPr>
+    </w:lvl>
+    <w:lvl w:ilvl="3" w:tplc="0409000F" w:tentative="1">
+      <w:start w:val="1"/>
+      <w:numFmt w:val="decimal"/>
+      <w:lvlText w:val="%4."/>
+      <w:lvlJc w:val="left"/>
+      <w:pPr>
+        <w:ind w:left="2880" w:hanging="360"/>
+      </w:pPr>
+    </w:lvl>
+    <w:lvl w:ilvl="4" w:tplc="04090019" w:tentative="1">
+      <w:start w:val="1"/>
+      <w:numFmt w:val="lowerLetter"/>
+      <w:lvlText w:val="%5."/>
+      <w:lvlJc w:val="left"/>
+      <w:pPr>
+        <w:ind w:left="3600" w:hanging="360"/>
+      </w:pPr>
+    </w:lvl>
+    <w:lvl w:ilvl="5" w:tplc="0409001B" w:tentative="1">
+      <w:start w:val="1"/>
+      <w:numFmt w:val="lowerRoman"/>
+      <w:lvlText w:val="%6."/>
+      <w:lvlJc w:val="right"/>
+      <w:pPr>
+        <w:ind w:left="4320" w:hanging="180"/>
+      </w:pPr>
+    </w:lvl>
+    <w:lvl w:ilvl="6" w:tplc="0409000F" w:tentative="1">
+      <w:start w:val="1"/>
+      <w:numFmt w:val="decimal"/>
+      <w:lvlText w:val="%7."/>
+      <w:lvlJc w:val="left"/>
+      <w:pPr>
+        <w:ind w:left="5040" w:hanging="360"/>
+      </w:pPr>
+    </w:lvl>
+    <w:lvl w:ilvl="7" w:tplc="04090019" w:tentative="1">
+      <w:start w:val="1"/>
+      <w:numFmt w:val="lowerLetter"/>
+      <w:lvlText w:val="%8."/>
+      <w:lvlJc w:val="left"/>
+      <w:pPr>
+        <w:ind w:left="5760" w:hanging="360"/>
+      </w:pPr>
+    </w:lvl>
+    <w:lvl w:ilvl="8" w:tplc="0409001B" w:tentative="1">
+      <w:start w:val="1"/>
+      <w:numFmt w:val="lowerRoman"/>
+      <w:lvlText w:val="%9."/>
+      <w:lvlJc w:val="right"/>
+      <w:pPr>
+        <w:ind w:left="6480" w:hanging="180"/>
+      </w:pPr>
+    </w:lvl>
+  </w:abstractNum>
+  <w:abstractNum w:abstractNumId="12" w15:restartNumberingAfterBreak="0">
     <w:nsid w:val="3E754C67"/>
     <w:multiLevelType w:val="multilevel"/>
     <w:tmpl w:val="A0A0A69A"/>
@@ -6361,7 +7163,96 @@
       </w:pPr>
     </w:lvl>
   </w:abstractNum>
-  <w:abstractNum w:abstractNumId="12" w15:restartNumberingAfterBreak="0">
+  <w:abstractNum w:abstractNumId="13" w15:restartNumberingAfterBreak="0">
+    <w:nsid w:val="469335E5"/>
+    <w:multiLevelType w:val="hybridMultilevel"/>
+    <w:tmpl w:val="557E5BE2"/>
+    <w:lvl w:ilvl="0" w:tplc="0409000F">
+      <w:start w:val="1"/>
+      <w:numFmt w:val="decimal"/>
+      <w:lvlText w:val="%1."/>
+      <w:lvlJc w:val="left"/>
+      <w:pPr>
+        <w:ind w:left="720" w:hanging="360"/>
+      </w:pPr>
+      <w:rPr>
+        <w:rFonts w:hint="default"/>
+      </w:rPr>
+    </w:lvl>
+    <w:lvl w:ilvl="1" w:tplc="04090019" w:tentative="1">
+      <w:start w:val="1"/>
+      <w:numFmt w:val="lowerLetter"/>
+      <w:lvlText w:val="%2."/>
+      <w:lvlJc w:val="left"/>
+      <w:pPr>
+        <w:ind w:left="1440" w:hanging="360"/>
+      </w:pPr>
+    </w:lvl>
+    <w:lvl w:ilvl="2" w:tplc="0409001B" w:tentative="1">
+      <w:start w:val="1"/>
+      <w:numFmt w:val="lowerRoman"/>
+      <w:lvlText w:val="%3."/>
+      <w:lvlJc w:val="right"/>
+      <w:pPr>
+        <w:ind w:left="2160" w:hanging="180"/>
+      </w:pPr>
+    </w:lvl>
+    <w:lvl w:ilvl="3" w:tplc="0409000F" w:tentative="1">
+      <w:start w:val="1"/>
+      <w:numFmt w:val="decimal"/>
+      <w:lvlText w:val="%4."/>
+      <w:lvlJc w:val="left"/>
+      <w:pPr>
+        <w:ind w:left="2880" w:hanging="360"/>
+      </w:pPr>
+    </w:lvl>
+    <w:lvl w:ilvl="4" w:tplc="04090019" w:tentative="1">
+      <w:start w:val="1"/>
+      <w:numFmt w:val="lowerLetter"/>
+      <w:lvlText w:val="%5."/>
+      <w:lvlJc w:val="left"/>
+      <w:pPr>
+        <w:ind w:left="3600" w:hanging="360"/>
+      </w:pPr>
+    </w:lvl>
+    <w:lvl w:ilvl="5" w:tplc="0409001B" w:tentative="1">
+      <w:start w:val="1"/>
+      <w:numFmt w:val="lowerRoman"/>
+      <w:lvlText w:val="%6."/>
+      <w:lvlJc w:val="right"/>
+      <w:pPr>
+        <w:ind w:left="4320" w:hanging="180"/>
+      </w:pPr>
+    </w:lvl>
+    <w:lvl w:ilvl="6" w:tplc="0409000F" w:tentative="1">
+      <w:start w:val="1"/>
+      <w:numFmt w:val="decimal"/>
+      <w:lvlText w:val="%7."/>
+      <w:lvlJc w:val="left"/>
+      <w:pPr>
+        <w:ind w:left="5040" w:hanging="360"/>
+      </w:pPr>
+    </w:lvl>
+    <w:lvl w:ilvl="7" w:tplc="04090019" w:tentative="1">
+      <w:start w:val="1"/>
+      <w:numFmt w:val="lowerLetter"/>
+      <w:lvlText w:val="%8."/>
+      <w:lvlJc w:val="left"/>
+      <w:pPr>
+        <w:ind w:left="5760" w:hanging="360"/>
+      </w:pPr>
+    </w:lvl>
+    <w:lvl w:ilvl="8" w:tplc="0409001B" w:tentative="1">
+      <w:start w:val="1"/>
+      <w:numFmt w:val="lowerRoman"/>
+      <w:lvlText w:val="%9."/>
+      <w:lvlJc w:val="right"/>
+      <w:pPr>
+        <w:ind w:left="6480" w:hanging="180"/>
+      </w:pPr>
+    </w:lvl>
+  </w:abstractNum>
+  <w:abstractNum w:abstractNumId="14" w15:restartNumberingAfterBreak="0">
     <w:nsid w:val="4D642C5E"/>
     <w:multiLevelType w:val="multilevel"/>
     <w:tmpl w:val="864C9D8A"/>
@@ -6510,7 +7401,7 @@
       </w:rPr>
     </w:lvl>
   </w:abstractNum>
-  <w:abstractNum w:abstractNumId="13" w15:restartNumberingAfterBreak="0">
+  <w:abstractNum w:abstractNumId="15" w15:restartNumberingAfterBreak="0">
     <w:nsid w:val="4D822BCD"/>
     <w:multiLevelType w:val="hybridMultilevel"/>
     <w:tmpl w:val="0F023D32"/>
@@ -6599,7 +7490,7 @@
       </w:pPr>
     </w:lvl>
   </w:abstractNum>
-  <w:abstractNum w:abstractNumId="14" w15:restartNumberingAfterBreak="0">
+  <w:abstractNum w:abstractNumId="16" w15:restartNumberingAfterBreak="0">
     <w:nsid w:val="54CD7B9F"/>
     <w:multiLevelType w:val="multilevel"/>
     <w:tmpl w:val="98740802"/>
@@ -6748,7 +7639,7 @@
       </w:rPr>
     </w:lvl>
   </w:abstractNum>
-  <w:abstractNum w:abstractNumId="15" w15:restartNumberingAfterBreak="0">
+  <w:abstractNum w:abstractNumId="17" w15:restartNumberingAfterBreak="0">
     <w:nsid w:val="55D81096"/>
     <w:multiLevelType w:val="multilevel"/>
     <w:tmpl w:val="F7866E44"/>
@@ -6897,7 +7788,7 @@
       </w:rPr>
     </w:lvl>
   </w:abstractNum>
-  <w:abstractNum w:abstractNumId="16" w15:restartNumberingAfterBreak="0">
+  <w:abstractNum w:abstractNumId="18" w15:restartNumberingAfterBreak="0">
     <w:nsid w:val="57DC4CA4"/>
     <w:multiLevelType w:val="multilevel"/>
     <w:tmpl w:val="DAB258C6"/>
@@ -7046,7 +7937,7 @@
       </w:rPr>
     </w:lvl>
   </w:abstractNum>
-  <w:abstractNum w:abstractNumId="17" w15:restartNumberingAfterBreak="0">
+  <w:abstractNum w:abstractNumId="19" w15:restartNumberingAfterBreak="0">
     <w:nsid w:val="673C33B8"/>
     <w:multiLevelType w:val="multilevel"/>
     <w:tmpl w:val="D310CCC4"/>
@@ -7195,7 +8086,7 @@
       </w:rPr>
     </w:lvl>
   </w:abstractNum>
-  <w:abstractNum w:abstractNumId="18" w15:restartNumberingAfterBreak="0">
+  <w:abstractNum w:abstractNumId="20" w15:restartNumberingAfterBreak="0">
     <w:nsid w:val="6B0E3C05"/>
     <w:multiLevelType w:val="hybridMultilevel"/>
     <w:tmpl w:val="5C581B7A"/>
@@ -7284,7 +8175,7 @@
       </w:pPr>
     </w:lvl>
   </w:abstractNum>
-  <w:abstractNum w:abstractNumId="19" w15:restartNumberingAfterBreak="0">
+  <w:abstractNum w:abstractNumId="21" w15:restartNumberingAfterBreak="0">
     <w:nsid w:val="6DD8453A"/>
     <w:multiLevelType w:val="hybridMultilevel"/>
     <w:tmpl w:val="2E501D14"/>
@@ -7373,7 +8264,7 @@
       </w:pPr>
     </w:lvl>
   </w:abstractNum>
-  <w:abstractNum w:abstractNumId="20" w15:restartNumberingAfterBreak="0">
+  <w:abstractNum w:abstractNumId="22" w15:restartNumberingAfterBreak="0">
     <w:nsid w:val="6FE61B8B"/>
     <w:multiLevelType w:val="multilevel"/>
     <w:tmpl w:val="9F0AED5E"/>
@@ -7486,7 +8377,7 @@
       </w:pPr>
     </w:lvl>
   </w:abstractNum>
-  <w:abstractNum w:abstractNumId="21" w15:restartNumberingAfterBreak="0">
+  <w:abstractNum w:abstractNumId="23" w15:restartNumberingAfterBreak="0">
     <w:nsid w:val="7102306A"/>
     <w:multiLevelType w:val="hybridMultilevel"/>
     <w:tmpl w:val="E66A1684"/>
@@ -7575,7 +8466,7 @@
       </w:pPr>
     </w:lvl>
   </w:abstractNum>
-  <w:abstractNum w:abstractNumId="22" w15:restartNumberingAfterBreak="0">
+  <w:abstractNum w:abstractNumId="24" w15:restartNumberingAfterBreak="0">
     <w:nsid w:val="73F26173"/>
     <w:multiLevelType w:val="multilevel"/>
     <w:tmpl w:val="A0F4244E"/>
@@ -7724,7 +8615,7 @@
       </w:rPr>
     </w:lvl>
   </w:abstractNum>
-  <w:abstractNum w:abstractNumId="23" w15:restartNumberingAfterBreak="0">
+  <w:abstractNum w:abstractNumId="25" w15:restartNumberingAfterBreak="0">
     <w:nsid w:val="7A571EB9"/>
     <w:multiLevelType w:val="hybridMultilevel"/>
     <w:tmpl w:val="E66A1684"/>
@@ -7813,7 +8704,7 @@
       </w:pPr>
     </w:lvl>
   </w:abstractNum>
-  <w:abstractNum w:abstractNumId="24" w15:restartNumberingAfterBreak="0">
+  <w:abstractNum w:abstractNumId="26" w15:restartNumberingAfterBreak="0">
     <w:nsid w:val="7C7B44F7"/>
     <w:multiLevelType w:val="multilevel"/>
     <w:tmpl w:val="EADA4D84"/>
@@ -7969,10 +8860,10 @@
     <w:abstractNumId w:val="1"/>
   </w:num>
   <w:num w:numId="3" w16cid:durableId="212349110">
-    <w:abstractNumId w:val="19"/>
+    <w:abstractNumId w:val="21"/>
   </w:num>
   <w:num w:numId="4" w16cid:durableId="2048605629">
-    <w:abstractNumId w:val="18"/>
+    <w:abstractNumId w:val="20"/>
   </w:num>
   <w:num w:numId="5" w16cid:durableId="1593197863">
     <w:abstractNumId w:val="2"/>
@@ -7984,10 +8875,10 @@
     <w:abstractNumId w:val="3"/>
   </w:num>
   <w:num w:numId="8" w16cid:durableId="50153963">
-    <w:abstractNumId w:val="11"/>
+    <w:abstractNumId w:val="12"/>
   </w:num>
   <w:num w:numId="9" w16cid:durableId="1839999092">
-    <w:abstractNumId w:val="20"/>
+    <w:abstractNumId w:val="22"/>
   </w:num>
   <w:num w:numId="10" w16cid:durableId="578178246">
     <w:abstractNumId w:val="5"/>
@@ -7999,16 +8890,16 @@
     <w:abstractNumId w:val="8"/>
   </w:num>
   <w:num w:numId="13" w16cid:durableId="608006391">
-    <w:abstractNumId w:val="12"/>
+    <w:abstractNumId w:val="14"/>
   </w:num>
   <w:num w:numId="14" w16cid:durableId="485437180">
-    <w:abstractNumId w:val="24"/>
+    <w:abstractNumId w:val="26"/>
   </w:num>
   <w:num w:numId="15" w16cid:durableId="1562254479">
     <w:abstractNumId w:val="10"/>
   </w:num>
   <w:num w:numId="16" w16cid:durableId="115758307">
-    <w:abstractNumId w:val="13"/>
+    <w:abstractNumId w:val="15"/>
   </w:num>
   <w:num w:numId="17" w16cid:durableId="2082289489">
     <w:abstractNumId w:val="4"/>
@@ -8017,25 +8908,31 @@
     <w:abstractNumId w:val="7"/>
   </w:num>
   <w:num w:numId="19" w16cid:durableId="455103429">
+    <w:abstractNumId w:val="25"/>
+  </w:num>
+  <w:num w:numId="20" w16cid:durableId="75129681">
     <w:abstractNumId w:val="23"/>
   </w:num>
-  <w:num w:numId="20" w16cid:durableId="75129681">
-    <w:abstractNumId w:val="21"/>
+  <w:num w:numId="21" w16cid:durableId="445084733">
+    <w:abstractNumId w:val="18"/>
   </w:num>
-  <w:num w:numId="21" w16cid:durableId="445084733">
+  <w:num w:numId="22" w16cid:durableId="1110004299">
     <w:abstractNumId w:val="16"/>
   </w:num>
-  <w:num w:numId="22" w16cid:durableId="1110004299">
-    <w:abstractNumId w:val="14"/>
-  </w:num>
   <w:num w:numId="23" w16cid:durableId="1213539767">
-    <w:abstractNumId w:val="15"/>
+    <w:abstractNumId w:val="17"/>
   </w:num>
   <w:num w:numId="24" w16cid:durableId="548415093">
-    <w:abstractNumId w:val="22"/>
+    <w:abstractNumId w:val="24"/>
   </w:num>
   <w:num w:numId="25" w16cid:durableId="289014505">
-    <w:abstractNumId w:val="17"/>
+    <w:abstractNumId w:val="19"/>
+  </w:num>
+  <w:num w:numId="26" w16cid:durableId="576062608">
+    <w:abstractNumId w:val="13"/>
+  </w:num>
+  <w:num w:numId="27" w16cid:durableId="803695219">
+    <w:abstractNumId w:val="11"/>
   </w:num>
 </w:numbering>
 </file>
@@ -8448,7 +9345,7 @@
   <w:style w:type="paragraph" w:default="1" w:styleId="Normal">
     <w:name w:val="Normal"/>
     <w:qFormat/>
-    <w:rsid w:val="002B1A32"/>
+    <w:rsid w:val="00797C44"/>
     <w:pPr>
       <w:spacing w:after="0" w:line="240" w:lineRule="auto"/>
     </w:pPr>

</xml_diff>

<commit_message>
many changes for evaluating results
</commit_message>
<xml_diff>
--- a/doc/written_part.docx
+++ b/doc/written_part.docx
@@ -785,15 +785,6 @@
         <w:spacing w:line="360" w:lineRule="auto"/>
         <w:jc w:val="both"/>
         <w:rPr>
-          <w:lang w:val="en-US"/>
-        </w:rPr>
-      </w:pPr>
-    </w:p>
-    <w:p>
-      <w:pPr>
-        <w:spacing w:line="360" w:lineRule="auto"/>
-        <w:jc w:val="both"/>
-        <w:rPr>
           <w:b/>
           <w:bCs/>
           <w:lang w:val="en-US"/>
@@ -805,6 +796,7 @@
           <w:bCs/>
           <w:lang w:val="en-US"/>
         </w:rPr>
+        <w:lastRenderedPageBreak/>
         <w:t xml:space="preserve">BACKGROUND: </w:t>
       </w:r>
     </w:p>
@@ -1123,11 +1115,11 @@
         <w:t>behavior</w:t>
       </w:r>
       <w:r>
-        <w:t xml:space="preserve"> by mapping the city’s arterial roads, main avenues, and Transmilenio stations (Bogotá's Bus Rapid Transit system); it </w:t>
+        <w:t xml:space="preserve"> by mapping the city’s arterial roads, main avenues, and Transmilenio stations (Bogotá's Bus Rapid Transit system); it demonstrates that by 2025, OXXO locations tended to cluster along these major transport </w:t>
       </w:r>
       <w:r>
         <w:lastRenderedPageBreak/>
-        <w:t xml:space="preserve">demonstrates that by 2025, OXXO locations tended to cluster along these major transport corridors. Furthermore, Section~\ref{sec:Statistics} provides a statistical analysis confirming the positive correlation between these variables and store locations. </w:t>
+        <w:t xml:space="preserve">corridors. Furthermore, Section~\ref{sec:Statistics} provides a statistical analysis confirming the positive correlation between these variables and store locations. </w:t>
       </w:r>
       <w:r>
         <w:t>\\</w:t>
@@ -1180,6 +1172,12 @@
       <w:r>
         <w:t>The concern about endogenous OXXO placement, however, may be mitigated through the use of TWFE estimators, because many determinants of store location are either time-invariant or evolve only gradually over the sample period, allowing UPZ fixed effects to absorb a substantial portion of the selection process. Nonetheless, some bias may persist if OXXO entry responds to time-varying local trends correlated with the outcome. For example, FEMSA may prioritize expansion into UPZs experiencing increases in commercial activity, population density, household income, pedestrian flows, or improvements in public security, all of which could independently influence the dependent variable. In such cases, TWFE estimates could partly capture these underlying trends rather than the causal effect of OXXO entry alone.</w:t>
       </w:r>
+    </w:p>
+    <w:p>
+      <w:pPr>
+        <w:spacing w:line="360" w:lineRule="auto"/>
+        <w:jc w:val="both"/>
+      </w:pPr>
     </w:p>
     <w:p>
       <w:pPr>
@@ -1789,18 +1787,6 @@
       <w:pPr>
         <w:spacing w:line="360" w:lineRule="auto"/>
         <w:jc w:val="both"/>
-      </w:pPr>
-    </w:p>
-    <w:p>
-      <w:pPr>
-        <w:spacing w:line="360" w:lineRule="auto"/>
-        <w:jc w:val="both"/>
-      </w:pPr>
-    </w:p>
-    <w:p>
-      <w:pPr>
-        <w:spacing w:line="360" w:lineRule="auto"/>
-        <w:jc w:val="both"/>
         <w:rPr>
           <w:b/>
           <w:bCs/>
@@ -1813,6 +1799,7 @@
           <w:bCs/>
           <w:lang w:val="en-US"/>
         </w:rPr>
+        <w:lastRenderedPageBreak/>
         <w:t xml:space="preserve">LITERATURE REVIEW: </w:t>
       </w:r>
     </w:p>
@@ -2155,20 +2142,20 @@
         <w:t xml:space="preserve">. </w:t>
       </w:r>
       <w:r>
-        <w:t xml:space="preserve">While some of these studies do not focus exclusively </w:t>
+        <w:t>While some of these studies do not focus exclusively on convenience stores, they utilize other retail outlets with similar operational profiles which can serve as proxies for what this thesis aims to investigate.</w:t>
+      </w:r>
+      <w:r>
+        <w:rPr>
+          <w:rFonts w:eastAsiaTheme="majorEastAsia"/>
+        </w:rPr>
+        <w:t> </w:t>
+      </w:r>
+      <w:r>
+        <w:t xml:space="preserve">\textcite{askey2018fast} is and example </w:t>
       </w:r>
       <w:r>
         <w:lastRenderedPageBreak/>
-        <w:t>on convenience stores, they utilize other retail outlets with similar operational profiles which can serve as proxies for what this thesis aims to investigate.</w:t>
-      </w:r>
-      <w:r>
-        <w:rPr>
-          <w:rFonts w:eastAsiaTheme="majorEastAsia"/>
-        </w:rPr>
-        <w:t> </w:t>
-      </w:r>
-      <w:r>
-        <w:t>\textcite{askey2018fast} is and example as the authors</w:t>
+        <w:t>as the authors</w:t>
       </w:r>
       <w:r>
         <w:rPr>
@@ -2473,11 +2460,90 @@
         <w:t> </w:t>
       </w:r>
       <w:r>
-        <w:t xml:space="preserve">labor market indicators \parencite{delgado2024, marcos2022}. However, despite this growing interest in labor dynamics, </w:t>
+        <w:t>labor market indicators \parencite{delgado2024, marcos2022}. However, despite this growing interest in labor dynamics, the</w:t>
+      </w:r>
+      <w:r>
+        <w:rPr>
+          <w:rFonts w:eastAsiaTheme="majorEastAsia"/>
+        </w:rPr>
+        <w:t> </w:t>
+      </w:r>
+      <w:r>
+        <w:t>spatial relationship</w:t>
+      </w:r>
+      <w:r>
+        <w:rPr>
+          <w:rFonts w:eastAsiaTheme="majorEastAsia"/>
+        </w:rPr>
+        <w:t> </w:t>
+      </w:r>
+      <w:r>
+        <w:t xml:space="preserve">between these establishments and urban security in the region has been largely overlooked. Specifically in </w:t>
+      </w:r>
+      <w:r>
+        <w:rPr>
+          <w:lang w:val="en-US"/>
+        </w:rPr>
+        <w:t>Bogotá</w:t>
+      </w:r>
+      <w:r>
+        <w:t xml:space="preserve"> crime literature has primarily focused on public </w:t>
       </w:r>
       <w:r>
         <w:lastRenderedPageBreak/>
-        <w:t>the</w:t>
+        <w:t xml:space="preserve">transport, general socioeconomic urban caracteristics, and policy intervention impact on crime \parencite{moreno2005impacto, bacares2013impact}.\\ </w:t>
+      </w:r>
+    </w:p>
+    <w:p>
+      <w:pPr>
+        <w:spacing w:line="360" w:lineRule="auto"/>
+        <w:ind w:firstLine="720"/>
+        <w:jc w:val="both"/>
+      </w:pPr>
+      <w:r>
+        <w:t>The investigations that have actually explored this topic are counted. For example,  \cite{jaramillo2021low} used the same method as \parencite{</w:t>
+      </w:r>
+      <w:r>
+        <w:t>shin2024dollar</w:t>
+      </w:r>
+      <w:r>
+        <w:t xml:space="preserve">} to study the effect of D1 hard discount stores </w:t>
+      </w:r>
+      <w:r>
+        <w:t xml:space="preserve">on the crime around the </w:t>
+      </w:r>
+      <w:r>
+        <w:t>areas</w:t>
+      </w:r>
+      <w:r>
+        <w:t xml:space="preserve"> where </w:t>
+      </w:r>
+      <w:r>
+        <w:t>they</w:t>
+      </w:r>
+      <w:r>
+        <w:t xml:space="preserve"> ope</w:t>
+      </w:r>
+      <w:r>
+        <w:t xml:space="preserve">n in </w:t>
+      </w:r>
+      <w:r>
+        <w:t>Bogotá.</w:t>
+      </w:r>
+      <w:r>
+        <w:t xml:space="preserve"> Although D1s are not convenience stores per se, they attract a similar type of costumers and and often share similar spatial locations with OXXO outlets. By analyzing the period of 2016 to 2019 and employing the same information utilized in this thesis (</w:t>
+      </w:r>
+      <w:r>
+        <w:t xml:space="preserve">within </w:t>
+      </w:r>
+      <w:r>
+        <w:t>SIEDCO</w:t>
+      </w:r>
+      <w:r>
+        <w:t xml:space="preserve"> infromation system</w:t>
+      </w:r>
+      <w:r>
+        <w:t>), the authors found that D1 openings caused a</w:t>
       </w:r>
       <w:r>
         <w:rPr>
@@ -2486,7 +2552,7 @@
         <w:t> </w:t>
       </w:r>
       <w:r>
-        <w:t>spatial relationship</w:t>
+        <w:t>33.4\% average reduction</w:t>
       </w:r>
       <w:r>
         <w:rPr>
@@ -2495,16 +2561,34 @@
         <w:t> </w:t>
       </w:r>
       <w:r>
-        <w:t xml:space="preserve">between these establishments and urban security in the region has been largely overlooked. Specifically in </w:t>
-      </w:r>
-      <w:r>
-        <w:rPr>
-          <w:lang w:val="en-US"/>
-        </w:rPr>
-        <w:t>Bogotá</w:t>
-      </w:r>
-      <w:r>
-        <w:t xml:space="preserve"> crime literature has primarily focused on public transport, general socioeconomic urban caracteristics, and policy intervention impact on crime \parencite{moreno2005impacto, bacares2013impact}.\\ </w:t>
+        <w:t>in crime density per block. They attributed this impact to the</w:t>
+      </w:r>
+      <w:r>
+        <w:rPr>
+          <w:rFonts w:eastAsiaTheme="majorEastAsia"/>
+        </w:rPr>
+        <w:t> </w:t>
+      </w:r>
+      <w:r>
+        <w:t>'eyes on the street' phenomenon, suggesting that the increased pedestrian flow acts as a form of</w:t>
+      </w:r>
+      <w:r>
+        <w:rPr>
+          <w:rFonts w:eastAsiaTheme="majorEastAsia"/>
+        </w:rPr>
+        <w:t> </w:t>
+      </w:r>
+      <w:r>
+        <w:t>informal guardianship</w:t>
+      </w:r>
+      <w:r>
+        <w:rPr>
+          <w:rFonts w:eastAsiaTheme="majorEastAsia"/>
+        </w:rPr>
+        <w:t> </w:t>
+      </w:r>
+      <w:r>
+        <w:t xml:space="preserve">that deters criminal activity \parencite{jacobs1961death, jaramillo2021low}.\\ </w:t>
       </w:r>
     </w:p>
     <w:p>
@@ -2514,94 +2598,28 @@
         <w:jc w:val="both"/>
       </w:pPr>
       <w:r>
-        <w:t>The investigations that have actually explored this topic are counted. For example,  \cite{jaramillo2021low} used the same method as \parencite{</w:t>
-      </w:r>
-      <w:r>
-        <w:t>shin2024dollar</w:t>
-      </w:r>
-      <w:r>
-        <w:t xml:space="preserve">} to study the effect of D1 hard discount stores </w:t>
-      </w:r>
-      <w:r>
-        <w:t xml:space="preserve">on the crime around the </w:t>
-      </w:r>
-      <w:r>
-        <w:t>areas</w:t>
-      </w:r>
-      <w:r>
-        <w:t xml:space="preserve"> where </w:t>
-      </w:r>
-      <w:r>
-        <w:t>they</w:t>
-      </w:r>
-      <w:r>
-        <w:t xml:space="preserve"> ope</w:t>
-      </w:r>
-      <w:r>
-        <w:t xml:space="preserve">n in </w:t>
-      </w:r>
-      <w:r>
-        <w:t>Bogotá.</w:t>
-      </w:r>
-      <w:r>
-        <w:t xml:space="preserve"> Although D1s are not convenience stores per se, they attract a similar type of costumers and and often share similar spatial locations with OXXO outlets. By analyzing the period of 2016 to 2019 and employing the same information utilized in this thesis (</w:t>
-      </w:r>
-      <w:r>
-        <w:t xml:space="preserve">within </w:t>
-      </w:r>
-      <w:r>
-        <w:t>SIEDCO</w:t>
-      </w:r>
-      <w:r>
-        <w:t xml:space="preserve"> infromation system</w:t>
-      </w:r>
-      <w:r>
-        <w:t>), the authors found that D1 openings caused a</w:t>
-      </w:r>
-      <w:r>
-        <w:rPr>
-          <w:rFonts w:eastAsiaTheme="majorEastAsia"/>
-        </w:rPr>
-        <w:t> </w:t>
-      </w:r>
-      <w:r>
-        <w:t>33.4\% average reduction</w:t>
-      </w:r>
-      <w:r>
-        <w:rPr>
-          <w:rFonts w:eastAsiaTheme="majorEastAsia"/>
-        </w:rPr>
-        <w:t> </w:t>
-      </w:r>
-      <w:r>
-        <w:t>in crime density per block. They attributed this impact to the</w:t>
-      </w:r>
-      <w:r>
-        <w:rPr>
-          <w:rFonts w:eastAsiaTheme="majorEastAsia"/>
-        </w:rPr>
-        <w:t> </w:t>
-      </w:r>
-      <w:r>
-        <w:t>'eyes on the street' phenomenon, suggesting that the increased pedestrian flow acts as a form of</w:t>
-      </w:r>
-      <w:r>
-        <w:rPr>
-          <w:rFonts w:eastAsiaTheme="majorEastAsia"/>
-        </w:rPr>
-        <w:t> </w:t>
-      </w:r>
-      <w:r>
-        <w:t>informal guardianship</w:t>
-      </w:r>
-      <w:r>
-        <w:rPr>
-          <w:rFonts w:eastAsiaTheme="majorEastAsia"/>
-        </w:rPr>
-        <w:t> </w:t>
-      </w:r>
-      <w:r>
-        <w:t xml:space="preserve">that deters criminal activity \parencite{jacobs1961death, jaramillo2021low}.\\ </w:t>
+        <w:t xml:space="preserve">As noted, the body of literature that explores the impact of convenience stores on crime in Latinamerica is reduced, and </w:t>
+      </w:r>
+      <w:r>
+        <w:t>virtually non-existent in the Colombian context.</w:t>
+      </w:r>
+      <w:r>
+        <w:t xml:space="preserve"> In this thesis I aim to fill this gap by evaluating the impact of OXXO store openings on local crime in Bogotá. </w:t>
+      </w:r>
+      <w:r>
+        <w:t>Given their rapid expansion and market dominance, OXXO stores serve as a primary actor and a representative proxy for modern convenience retail</w:t>
+      </w:r>
+      <w:r>
+        <w:t xml:space="preserve"> in the city. Additionally, this analisis is particularly relevant in a context where crime remains a public policy priority and a growing concern for Bogota</w:t>
+      </w:r>
+      <w:r>
+        <w:rPr>
+          <w:lang w:val="en-US"/>
+        </w:rPr>
+        <w:t xml:space="preserve">’s </w:t>
+      </w:r>
+      <w:r>
+        <w:t>inhabitants.</w:t>
       </w:r>
     </w:p>
     <w:p>
@@ -2610,30 +2628,6 @@
         <w:ind w:firstLine="720"/>
         <w:jc w:val="both"/>
       </w:pPr>
-      <w:r>
-        <w:t xml:space="preserve">As noted, the body of literature that explores the impact of convenience stores on crime in Latinamerica is reduced, and </w:t>
-      </w:r>
-      <w:r>
-        <w:t>virtually non-existent in the Colombian context.</w:t>
-      </w:r>
-      <w:r>
-        <w:t xml:space="preserve"> In this thesis I aim to fill this gap by evaluating the impact of OXXO store openings on local crime in Bogotá. </w:t>
-      </w:r>
-      <w:r>
-        <w:t>Given their rapid expansion and market dominance, OXXO stores serve as a primary actor and a representative proxy for modern convenience retail</w:t>
-      </w:r>
-      <w:r>
-        <w:t xml:space="preserve"> in the city. Additionally, this analisis is particularly relevant in a context where crime remains a public policy priority and a growing concern for Bogota</w:t>
-      </w:r>
-      <w:r>
-        <w:rPr>
-          <w:lang w:val="en-US"/>
-        </w:rPr>
-        <w:t xml:space="preserve">’s </w:t>
-      </w:r>
-      <w:r>
-        <w:t>inhabitants.</w:t>
-      </w:r>
     </w:p>
     <w:p>
       <w:pPr>
@@ -2645,8 +2639,19 @@
     <w:p>
       <w:pPr>
         <w:spacing w:line="360" w:lineRule="auto"/>
-        <w:ind w:firstLine="720"/>
-        <w:jc w:val="both"/>
+        <w:jc w:val="both"/>
+        <w:rPr>
+          <w:lang w:val="en-US"/>
+        </w:rPr>
+      </w:pPr>
+    </w:p>
+    <w:p>
+      <w:pPr>
+        <w:spacing w:line="360" w:lineRule="auto"/>
+        <w:jc w:val="both"/>
+        <w:rPr>
+          <w:lang w:val="en-US"/>
+        </w:rPr>
       </w:pPr>
     </w:p>
     <w:p>
@@ -5363,6 +5368,9 @@
       <w:r>
         <w:t>However, the estimated magnitude is considerably large and raises concerns about the robustness of the result, particularly given the substantial variation in the estimated effect for theft to people across specifications. Theft to motorbike also becomes statistically significant while retaining a negative coefficient.</w:t>
       </w:r>
+      <w:r>
+        <w:t>\\</w:t>
+      </w:r>
     </w:p>
     <w:p>
       <w:pPr>
@@ -5494,15 +5502,62 @@
         <w:spacing w:line="360" w:lineRule="auto"/>
         <w:jc w:val="both"/>
         <w:rPr>
-          <w:lang w:val="en-US"/>
-        </w:rPr>
-      </w:pPr>
-    </w:p>
-    <w:p>
-      <w:pPr>
-        <w:spacing w:line="360" w:lineRule="auto"/>
-        <w:jc w:val="both"/>
-      </w:pPr>
+          <w:lang w:val="es-ES_tradnl"/>
+        </w:rPr>
+      </w:pPr>
+    </w:p>
+    <w:p>
+      <w:pPr>
+        <w:spacing w:line="360" w:lineRule="auto"/>
+        <w:jc w:val="both"/>
+      </w:pPr>
+      <w:r>
+        <w:rPr>
+          <w:noProof/>
+          <w14:ligatures w14:val="standardContextual"/>
+        </w:rPr>
+        <w:drawing>
+          <wp:inline distT="0" distB="0" distL="0" distR="0" wp14:anchorId="6969292B" wp14:editId="068B71BE">
+            <wp:extent cx="5943600" cy="3820795"/>
+            <wp:effectExtent l="0" t="0" r="0" b="1905"/>
+            <wp:docPr id="1218471375" name="Picture 4"/>
+            <wp:cNvGraphicFramePr>
+              <a:graphicFrameLocks xmlns:a="http://schemas.openxmlformats.org/drawingml/2006/main" noChangeAspect="1"/>
+            </wp:cNvGraphicFramePr>
+            <a:graphic xmlns:a="http://schemas.openxmlformats.org/drawingml/2006/main">
+              <a:graphicData uri="http://schemas.openxmlformats.org/drawingml/2006/picture">
+                <pic:pic xmlns:pic="http://schemas.openxmlformats.org/drawingml/2006/picture">
+                  <pic:nvPicPr>
+                    <pic:cNvPr id="1218471375" name="Picture 1218471375"/>
+                    <pic:cNvPicPr/>
+                  </pic:nvPicPr>
+                  <pic:blipFill>
+                    <a:blip r:embed="rId10">
+                      <a:extLst>
+                        <a:ext uri="{28A0092B-C50C-407E-A947-70E740481C1C}">
+                          <a14:useLocalDpi xmlns:a14="http://schemas.microsoft.com/office/drawing/2010/main" val="0"/>
+                        </a:ext>
+                      </a:extLst>
+                    </a:blip>
+                    <a:stretch>
+                      <a:fillRect/>
+                    </a:stretch>
+                  </pic:blipFill>
+                  <pic:spPr>
+                    <a:xfrm>
+                      <a:off x="0" y="0"/>
+                      <a:ext cx="5943600" cy="3820795"/>
+                    </a:xfrm>
+                    <a:prstGeom prst="rect">
+                      <a:avLst/>
+                    </a:prstGeom>
+                  </pic:spPr>
+                </pic:pic>
+              </a:graphicData>
+            </a:graphic>
+          </wp:inline>
+        </w:drawing>
+      </w:r>
     </w:p>
     <w:p>
       <w:pPr>
@@ -5512,13 +5567,15 @@
           <w:bCs/>
         </w:rPr>
       </w:pPr>
-      <w:r>
+    </w:p>
+    <w:p>
+      <w:pPr>
+        <w:jc w:val="both"/>
         <w:rPr>
           <w:b/>
           <w:bCs/>
         </w:rPr>
-        <w:t>DISCUSSION</w:t>
-      </w:r>
+      </w:pPr>
     </w:p>
     <w:p>
       <w:pPr>
@@ -5528,6 +5585,151 @@
           <w:bCs/>
         </w:rPr>
       </w:pPr>
+      <w:r>
+        <w:rPr>
+          <w:noProof/>
+          <w14:ligatures w14:val="standardContextual"/>
+        </w:rPr>
+        <w:lastRenderedPageBreak/>
+        <w:drawing>
+          <wp:inline distT="0" distB="0" distL="0" distR="0" wp14:anchorId="73696810" wp14:editId="2D92D1BF">
+            <wp:extent cx="5737253" cy="3800930"/>
+            <wp:effectExtent l="0" t="0" r="3175" b="0"/>
+            <wp:docPr id="803852359" name="Picture 3"/>
+            <wp:cNvGraphicFramePr>
+              <a:graphicFrameLocks xmlns:a="http://schemas.openxmlformats.org/drawingml/2006/main" noChangeAspect="1"/>
+            </wp:cNvGraphicFramePr>
+            <a:graphic xmlns:a="http://schemas.openxmlformats.org/drawingml/2006/main">
+              <a:graphicData uri="http://schemas.openxmlformats.org/drawingml/2006/picture">
+                <pic:pic xmlns:pic="http://schemas.openxmlformats.org/drawingml/2006/picture">
+                  <pic:nvPicPr>
+                    <pic:cNvPr id="803852359" name="Picture 803852359"/>
+                    <pic:cNvPicPr/>
+                  </pic:nvPicPr>
+                  <pic:blipFill>
+                    <a:blip r:embed="rId11">
+                      <a:extLst>
+                        <a:ext uri="{28A0092B-C50C-407E-A947-70E740481C1C}">
+                          <a14:useLocalDpi xmlns:a14="http://schemas.microsoft.com/office/drawing/2010/main" val="0"/>
+                        </a:ext>
+                      </a:extLst>
+                    </a:blip>
+                    <a:stretch>
+                      <a:fillRect/>
+                    </a:stretch>
+                  </pic:blipFill>
+                  <pic:spPr>
+                    <a:xfrm>
+                      <a:off x="0" y="0"/>
+                      <a:ext cx="5744712" cy="3805872"/>
+                    </a:xfrm>
+                    <a:prstGeom prst="rect">
+                      <a:avLst/>
+                    </a:prstGeom>
+                  </pic:spPr>
+                </pic:pic>
+              </a:graphicData>
+            </a:graphic>
+          </wp:inline>
+        </w:drawing>
+      </w:r>
+    </w:p>
+    <w:p>
+      <w:pPr>
+        <w:jc w:val="both"/>
+        <w:rPr>
+          <w:b/>
+          <w:bCs/>
+        </w:rPr>
+      </w:pPr>
+    </w:p>
+    <w:p>
+      <w:pPr>
+        <w:jc w:val="both"/>
+        <w:rPr>
+          <w:b/>
+          <w:bCs/>
+        </w:rPr>
+      </w:pPr>
+    </w:p>
+    <w:p>
+      <w:pPr>
+        <w:jc w:val="both"/>
+        <w:rPr>
+          <w:b/>
+          <w:bCs/>
+        </w:rPr>
+      </w:pPr>
+    </w:p>
+    <w:p>
+      <w:pPr>
+        <w:jc w:val="both"/>
+        <w:rPr>
+          <w:b/>
+          <w:bCs/>
+        </w:rPr>
+      </w:pPr>
+    </w:p>
+    <w:p>
+      <w:pPr>
+        <w:jc w:val="both"/>
+        <w:rPr>
+          <w:b/>
+          <w:bCs/>
+        </w:rPr>
+      </w:pPr>
+    </w:p>
+    <w:p>
+      <w:pPr>
+        <w:jc w:val="both"/>
+        <w:rPr>
+          <w:b/>
+          <w:bCs/>
+        </w:rPr>
+      </w:pPr>
+    </w:p>
+    <w:p>
+      <w:pPr>
+        <w:jc w:val="both"/>
+        <w:rPr>
+          <w:b/>
+          <w:bCs/>
+        </w:rPr>
+      </w:pPr>
+    </w:p>
+    <w:p>
+      <w:pPr>
+        <w:jc w:val="both"/>
+        <w:rPr>
+          <w:b/>
+          <w:bCs/>
+        </w:rPr>
+      </w:pPr>
+    </w:p>
+    <w:p>
+      <w:pPr>
+        <w:jc w:val="both"/>
+        <w:rPr>
+          <w:b/>
+          <w:bCs/>
+        </w:rPr>
+      </w:pPr>
+      <w:r>
+        <w:rPr>
+          <w:b/>
+          <w:bCs/>
+        </w:rPr>
+        <w:t>DISCUSSION</w:t>
+      </w:r>
+    </w:p>
+    <w:p>
+      <w:pPr>
+        <w:jc w:val="both"/>
+        <w:rPr>
+          <w:b/>
+          <w:bCs/>
+        </w:rPr>
+      </w:pPr>
     </w:p>
     <w:p>
       <w:pPr>
@@ -5609,6 +5811,7 @@
         <w:jc w:val="both"/>
       </w:pPr>
       <w:r>
+        <w:lastRenderedPageBreak/>
         <w:t>Second, the contrast in statistical significance may be heavily driven by severe underreporting (</w:t>
       </w:r>
       <w:r>

</xml_diff>